<commit_message>
recent lab changes: 2025-05-27 12:19:45
</commit_message>
<xml_diff>
--- a/Курс 2/Основы Data Science/Лабораторные/04. Описание данных. Статистический вывод/Отчёт4.docx
+++ b/Курс 2/Основы Data Science/Лабораторные/04. Описание данных. Статистический вывод/Отчёт4.docx
@@ -1,6 +1,6 @@
 
 <file path=word/document.xml><?xml version="1.0" encoding="utf-8"?>
-<w:document xmlns:wpc="http://schemas.microsoft.com/office/word/2010/wordprocessingCanvas" xmlns:cx="http://schemas.microsoft.com/office/drawing/2014/chartex" xmlns:cx1="http://schemas.microsoft.com/office/drawing/2015/9/8/chartex" xmlns:cx2="http://schemas.microsoft.com/office/drawing/2015/10/21/chartex" xmlns:cx3="http://schemas.microsoft.com/office/drawing/2016/5/9/chartex" xmlns:cx4="http://schemas.microsoft.com/office/drawing/2016/5/10/chartex" xmlns:cx5="http://schemas.microsoft.com/office/drawing/2016/5/11/chartex" xmlns:cx6="http://schemas.microsoft.com/office/drawing/2016/5/12/chartex" xmlns:cx7="http://schemas.microsoft.com/office/drawing/2016/5/13/chartex" xmlns:cx8="http://schemas.microsoft.com/office/drawing/2016/5/14/chartex" xmlns:mc="http://schemas.openxmlformats.org/markup-compatibility/2006" xmlns:aink="http://schemas.microsoft.com/office/drawing/2016/ink" xmlns:am3d="http://schemas.microsoft.com/office/drawing/2017/model3d" xmlns:o="urn:schemas-microsoft-com:office:office" xmlns:oel="http://schemas.microsoft.com/office/2019/extlst" xmlns:r="http://schemas.openxmlformats.org/officeDocument/2006/relationships" xmlns:m="http://schemas.openxmlformats.org/officeDocument/2006/math" xmlns:v="urn:schemas-microsoft-com:vml" xmlns:wp14="http://schemas.microsoft.com/office/word/2010/wordprocessingDrawing" xmlns:wp="http://schemas.openxmlformats.org/drawingml/2006/wordprocessingDrawing" xmlns:w10="urn:schemas-microsoft-com:office:word" xmlns:w="http://schemas.openxmlformats.org/wordprocessingml/2006/main" xmlns:w14="http://schemas.microsoft.com/office/word/2010/wordml" xmlns:w15="http://schemas.microsoft.com/office/word/2012/wordml" xmlns:w16cex="http://schemas.microsoft.com/office/word/2018/wordml/cex" xmlns:w16cid="http://schemas.microsoft.com/office/word/2016/wordml/cid" xmlns:w16="http://schemas.microsoft.com/office/word/2018/wordml" xmlns:w16du="http://schemas.microsoft.com/office/word/2023/wordml/word16du" xmlns:w16sdtdh="http://schemas.microsoft.com/office/word/2020/wordml/sdtdatahash" xmlns:w16sdtfl="http://schemas.microsoft.com/office/word/2024/wordml/sdtformatlock" xmlns:w16se="http://schemas.microsoft.com/office/word/2015/wordml/symex" xmlns:wpg="http://schemas.microsoft.com/office/word/2010/wordprocessingGroup" xmlns:wpi="http://schemas.microsoft.com/office/word/2010/wordprocessingInk" xmlns:wne="http://schemas.microsoft.com/office/word/2006/wordml" xmlns:wps="http://schemas.microsoft.com/office/word/2010/wordprocessingShape" mc:Ignorable="w14 w15 w16se w16cid w16 w16cex w16sdtdh w16sdtfl w16du wp14">
+<w:document xmlns:wpc="http://schemas.microsoft.com/office/word/2010/wordprocessingCanvas" xmlns:cx="http://schemas.microsoft.com/office/drawing/2014/chartex" xmlns:cx1="http://schemas.microsoft.com/office/drawing/2015/9/8/chartex" xmlns:cx2="http://schemas.microsoft.com/office/drawing/2015/10/21/chartex" xmlns:cx3="http://schemas.microsoft.com/office/drawing/2016/5/9/chartex" xmlns:cx4="http://schemas.microsoft.com/office/drawing/2016/5/10/chartex" xmlns:cx5="http://schemas.microsoft.com/office/drawing/2016/5/11/chartex" xmlns:cx6="http://schemas.microsoft.com/office/drawing/2016/5/12/chartex" xmlns:cx7="http://schemas.microsoft.com/office/drawing/2016/5/13/chartex" xmlns:cx8="http://schemas.microsoft.com/office/drawing/2016/5/14/chartex" xmlns:mc="http://schemas.openxmlformats.org/markup-compatibility/2006" xmlns:aink="http://schemas.microsoft.com/office/drawing/2016/ink" xmlns:am3d="http://schemas.microsoft.com/office/drawing/2017/model3d" xmlns:o="urn:schemas-microsoft-com:office:office" xmlns:oel="http://schemas.microsoft.com/office/2019/extlst" xmlns:r="http://schemas.openxmlformats.org/officeDocument/2006/relationships" xmlns:m="http://schemas.openxmlformats.org/officeDocument/2006/math" xmlns:v="urn:schemas-microsoft-com:vml" xmlns:wp14="http://schemas.microsoft.com/office/word/2010/wordprocessingDrawing" xmlns:wp="http://schemas.openxmlformats.org/drawingml/2006/wordprocessingDrawing" xmlns:w10="urn:schemas-microsoft-com:office:word" xmlns:w="http://schemas.openxmlformats.org/wordprocessingml/2006/main" xmlns:w14="http://schemas.microsoft.com/office/word/2010/wordml" xmlns:w15="http://schemas.microsoft.com/office/word/2012/wordml" xmlns:w16cex="http://schemas.microsoft.com/office/word/2018/wordml/cex" xmlns:w16cid="http://schemas.microsoft.com/office/word/2016/wordml/cid" xmlns:w16="http://schemas.microsoft.com/office/word/2018/wordml" xmlns:w16sdtdh="http://schemas.microsoft.com/office/word/2020/wordml/sdtdatahash" xmlns:w16se="http://schemas.microsoft.com/office/word/2015/wordml/symex" xmlns:wpg="http://schemas.microsoft.com/office/word/2010/wordprocessingGroup" xmlns:wpi="http://schemas.microsoft.com/office/word/2010/wordprocessingInk" xmlns:wne="http://schemas.microsoft.com/office/word/2006/wordml" xmlns:wps="http://schemas.microsoft.com/office/word/2010/wordprocessingShape" mc:Ignorable="w14 w15 w16se w16cid w16 w16cex w16sdtdh wp14">
   <w:body>
     <w:p>
       <w:pPr>
@@ -173,7 +173,7 @@
           <w:color w:val="000000"/>
           <w:kern w:val="0"/>
           <w:szCs w:val="28"/>
-          <w:lang w:val="en-US" w:eastAsia="ru-RU"/>
+          <w:lang w:eastAsia="ru-RU"/>
           <w14:ligatures w14:val="none"/>
         </w:rPr>
         <w:t>Data</w:t>
@@ -195,7 +195,7 @@
           <w:color w:val="000000"/>
           <w:kern w:val="0"/>
           <w:szCs w:val="28"/>
-          <w:lang w:val="en-US" w:eastAsia="ru-RU"/>
+          <w:lang w:eastAsia="ru-RU"/>
           <w14:ligatures w14:val="none"/>
         </w:rPr>
         <w:t>Science</w:t>
@@ -429,6 +429,7 @@
       <w:r>
         <w:rPr>
           <w:szCs w:val="28"/>
+          <w:lang w:val="ru-RU"/>
         </w:rPr>
         <w:t>Описание данных. Статистический вывод</w:t>
       </w:r>
@@ -699,6 +700,7 @@
         <w:rPr>
           <w:color w:val="000000"/>
           <w:szCs w:val="28"/>
+          <w:lang w:val="ru-RU"/>
         </w:rPr>
         <w:t>Юдина Ольга Вадимовна</w:t>
       </w:r>
@@ -916,33 +918,57 @@
       <w:pPr>
         <w:ind w:firstLine="0"/>
         <w:rPr>
-          <w:lang w:eastAsia="ru-RU"/>
+          <w:lang w:val="ru-RU" w:eastAsia="ru-RU"/>
         </w:rPr>
       </w:pPr>
       <w:r>
         <w:rPr>
           <w:b/>
           <w:bCs/>
+          <w:lang w:val="ru-RU" w:eastAsia="ru-RU"/>
+        </w:rPr>
+        <w:t>Цель:</w:t>
+      </w:r>
+      <w:r>
+        <w:rPr>
+          <w:lang w:val="ru-RU" w:eastAsia="ru-RU"/>
+        </w:rPr>
+        <w:t xml:space="preserve"> Знакомство с этапом понимание данных стандарта </w:t>
+      </w:r>
+      <w:r>
+        <w:rPr>
           <w:lang w:eastAsia="ru-RU"/>
         </w:rPr>
-        <w:t>Цель:</w:t>
+        <w:t>CRISP</w:t>
+      </w:r>
+      <w:r>
+        <w:rPr>
+          <w:lang w:val="ru-RU" w:eastAsia="ru-RU"/>
+        </w:rPr>
+        <w:t>-</w:t>
       </w:r>
       <w:r>
         <w:rPr>
           <w:lang w:eastAsia="ru-RU"/>
         </w:rPr>
-        <w:t xml:space="preserve"> Знакомство с этапом понимание данных стандарта CRISP-DM.</w:t>
-      </w:r>
-    </w:p>
-    <w:p>
-      <w:pPr>
-        <w:rPr>
-          <w:lang w:eastAsia="ru-RU"/>
-        </w:rPr>
-      </w:pPr>
-      <w:r>
-        <w:rPr>
-          <w:lang w:eastAsia="ru-RU"/>
+        <w:t>DM</w:t>
+      </w:r>
+      <w:r>
+        <w:rPr>
+          <w:lang w:val="ru-RU" w:eastAsia="ru-RU"/>
+        </w:rPr>
+        <w:t>.</w:t>
+      </w:r>
+    </w:p>
+    <w:p>
+      <w:pPr>
+        <w:rPr>
+          <w:lang w:val="ru-RU" w:eastAsia="ru-RU"/>
+        </w:rPr>
+      </w:pPr>
+      <w:r>
+        <w:rPr>
+          <w:lang w:val="ru-RU" w:eastAsia="ru-RU"/>
         </w:rPr>
         <w:t>Задача этапа – найти, описать основные закономерности, которые</w:t>
       </w:r>
@@ -954,7 +980,7 @@
       </w:r>
       <w:r>
         <w:rPr>
-          <w:lang w:eastAsia="ru-RU"/>
+          <w:lang w:val="ru-RU" w:eastAsia="ru-RU"/>
         </w:rPr>
         <w:t>содержатся в данных и статистически их подтвердить, попытаться выявить</w:t>
       </w:r>
@@ -966,7 +992,7 @@
       </w:r>
       <w:r>
         <w:rPr>
-          <w:lang w:eastAsia="ru-RU"/>
+          <w:lang w:val="ru-RU" w:eastAsia="ru-RU"/>
         </w:rPr>
         <w:t>связи между этими данными, фактами.</w:t>
       </w:r>
@@ -975,29 +1001,114 @@
       <w:pPr>
         <w:ind w:firstLine="0"/>
         <w:rPr>
-          <w:lang w:eastAsia="ru-RU"/>
+          <w:lang w:val="ru-RU" w:eastAsia="ru-RU"/>
         </w:rPr>
       </w:pPr>
       <w:r>
         <w:rPr>
           <w:b/>
           <w:bCs/>
+          <w:lang w:val="ru-RU" w:eastAsia="ru-RU"/>
+        </w:rPr>
+        <w:t>Задание</w:t>
+      </w:r>
+    </w:p>
+    <w:p>
+      <w:pPr>
+        <w:rPr>
+          <w:lang w:val="ru-RU" w:eastAsia="ru-RU"/>
+        </w:rPr>
+      </w:pPr>
+      <w:r>
+        <w:rPr>
+          <w:lang w:val="ru-RU" w:eastAsia="ru-RU"/>
+        </w:rPr>
+        <w:t>Получив первоначальное представление о данных, рассмотрите</w:t>
+      </w:r>
+      <w:r>
+        <w:rPr>
+          <w:lang w:val="ru-RU" w:eastAsia="ru-RU"/>
+        </w:rPr>
+        <w:t xml:space="preserve"> </w:t>
+      </w:r>
+      <w:r>
+        <w:rPr>
+          <w:lang w:val="ru-RU" w:eastAsia="ru-RU"/>
+        </w:rPr>
+        <w:t>закономерности, присущие данным. В этой лабораторной работе -</w:t>
+      </w:r>
+      <w:r>
+        <w:rPr>
+          <w:lang w:val="ru-RU" w:eastAsia="ru-RU"/>
+        </w:rPr>
+        <w:t xml:space="preserve"> </w:t>
+      </w:r>
+      <w:r>
+        <w:rPr>
+          <w:lang w:val="ru-RU" w:eastAsia="ru-RU"/>
+        </w:rPr>
+        <w:t>категориальным.</w:t>
+      </w:r>
+    </w:p>
+    <w:p>
+      <w:pPr>
+        <w:rPr>
+          <w:lang w:val="ru-RU" w:eastAsia="ru-RU"/>
+        </w:rPr>
+      </w:pPr>
+      <w:r>
+        <w:rPr>
+          <w:lang w:val="ru-RU" w:eastAsia="ru-RU"/>
+        </w:rPr>
+        <w:t>Сформулируйте гипотезы о связи категориальных переменных, которые</w:t>
+      </w:r>
+      <w:r>
+        <w:rPr>
+          <w:lang w:val="ru-RU" w:eastAsia="ru-RU"/>
+        </w:rPr>
+        <w:t xml:space="preserve"> </w:t>
+      </w:r>
+      <w:r>
+        <w:rPr>
+          <w:lang w:val="ru-RU" w:eastAsia="ru-RU"/>
+        </w:rPr>
+        <w:t>помогут в решении выбранной вами в предыдущей работе задачи. Проследите</w:t>
+      </w:r>
+      <w:r>
+        <w:rPr>
+          <w:lang w:val="ru-RU" w:eastAsia="ru-RU"/>
+        </w:rPr>
+        <w:t xml:space="preserve"> </w:t>
+      </w:r>
+      <w:r>
+        <w:rPr>
+          <w:lang w:val="ru-RU" w:eastAsia="ru-RU"/>
+        </w:rPr>
+        <w:t xml:space="preserve">правильность формулировок гипотез </w:t>
+      </w:r>
+      <w:r>
+        <w:rPr>
           <w:lang w:eastAsia="ru-RU"/>
         </w:rPr>
-        <w:t>Задание</w:t>
-      </w:r>
-    </w:p>
-    <w:p>
-      <w:pPr>
+        <w:t>H</w:t>
+      </w:r>
+      <w:r>
+        <w:rPr>
+          <w:lang w:val="ru-RU" w:eastAsia="ru-RU"/>
+        </w:rPr>
+        <w:t xml:space="preserve">0 и </w:t>
+      </w:r>
+      <w:r>
         <w:rPr>
           <w:lang w:eastAsia="ru-RU"/>
         </w:rPr>
-      </w:pPr>
-      <w:r>
-        <w:rPr>
-          <w:lang w:eastAsia="ru-RU"/>
-        </w:rPr>
-        <w:t>Получив первоначальное представление о данных, рассмотрите</w:t>
+        <w:t>H</w:t>
+      </w:r>
+      <w:r>
+        <w:rPr>
+          <w:lang w:val="ru-RU" w:eastAsia="ru-RU"/>
+        </w:rPr>
+        <w:t>1 . Проведите испытание на</w:t>
       </w:r>
       <w:r>
         <w:rPr>
@@ -1007,68 +1118,7 @@
       </w:r>
       <w:r>
         <w:rPr>
-          <w:lang w:eastAsia="ru-RU"/>
-        </w:rPr>
-        <w:t>закономерности, присущие данным. В этой лабораторной работе -</w:t>
-      </w:r>
-      <w:r>
-        <w:rPr>
-          <w:lang w:val="ru-RU" w:eastAsia="ru-RU"/>
-        </w:rPr>
-        <w:t xml:space="preserve"> </w:t>
-      </w:r>
-      <w:r>
-        <w:rPr>
-          <w:lang w:eastAsia="ru-RU"/>
-        </w:rPr>
-        <w:t>категориальным.</w:t>
-      </w:r>
-    </w:p>
-    <w:p>
-      <w:pPr>
-        <w:rPr>
-          <w:lang w:eastAsia="ru-RU"/>
-        </w:rPr>
-      </w:pPr>
-      <w:r>
-        <w:rPr>
-          <w:lang w:eastAsia="ru-RU"/>
-        </w:rPr>
-        <w:t>Сформулируйте гипотезы о связи категориальных переменных, которые</w:t>
-      </w:r>
-      <w:r>
-        <w:rPr>
-          <w:lang w:val="ru-RU" w:eastAsia="ru-RU"/>
-        </w:rPr>
-        <w:t xml:space="preserve"> </w:t>
-      </w:r>
-      <w:r>
-        <w:rPr>
-          <w:lang w:eastAsia="ru-RU"/>
-        </w:rPr>
-        <w:t>помогут в решении выбранной вами в предыдущей работе задачи. Проследите</w:t>
-      </w:r>
-      <w:r>
-        <w:rPr>
-          <w:lang w:val="ru-RU" w:eastAsia="ru-RU"/>
-        </w:rPr>
-        <w:t xml:space="preserve"> </w:t>
-      </w:r>
-      <w:r>
-        <w:rPr>
-          <w:lang w:eastAsia="ru-RU"/>
-        </w:rPr>
-        <w:t>правильность формулировок гипотез H0 и H1 . Проведите испытание на</w:t>
-      </w:r>
-      <w:r>
-        <w:rPr>
-          <w:lang w:val="ru-RU" w:eastAsia="ru-RU"/>
-        </w:rPr>
-        <w:t xml:space="preserve"> </w:t>
-      </w:r>
-      <w:r>
-        <w:rPr>
-          <w:lang w:eastAsia="ru-RU"/>
+          <w:lang w:val="ru-RU" w:eastAsia="ru-RU"/>
         </w:rPr>
         <w:t>независимость.</w:t>
       </w:r>
@@ -1077,56 +1127,56 @@
       <w:pPr>
         <w:ind w:firstLine="0"/>
         <w:rPr>
-          <w:lang w:eastAsia="ru-RU"/>
+          <w:lang w:val="ru-RU" w:eastAsia="ru-RU"/>
         </w:rPr>
       </w:pPr>
       <w:r>
         <w:rPr>
           <w:b/>
           <w:bCs/>
+          <w:lang w:val="ru-RU" w:eastAsia="ru-RU"/>
+        </w:rPr>
+        <w:t>Зависимости категориальных переменных</w:t>
+      </w:r>
+      <w:r>
+        <w:rPr>
+          <w:lang w:val="ru-RU" w:eastAsia="ru-RU"/>
+        </w:rPr>
+        <w:t>. Для проверки</w:t>
+      </w:r>
+      <w:r>
+        <w:rPr>
+          <w:lang w:val="ru-RU" w:eastAsia="ru-RU"/>
+        </w:rPr>
+        <w:t xml:space="preserve"> </w:t>
+      </w:r>
+      <w:r>
+        <w:rPr>
+          <w:lang w:val="ru-RU" w:eastAsia="ru-RU"/>
+        </w:rPr>
+        <w:t>статистической связи между двумя категориальными переменными</w:t>
+      </w:r>
+      <w:r>
+        <w:rPr>
+          <w:lang w:val="ru-RU" w:eastAsia="ru-RU"/>
+        </w:rPr>
+        <w:t xml:space="preserve"> </w:t>
+      </w:r>
+      <w:r>
+        <w:rPr>
+          <w:lang w:val="ru-RU" w:eastAsia="ru-RU"/>
+        </w:rPr>
+        <w:t>проводится испытание хи-квадрат (</w:t>
+      </w:r>
+      <w:r>
+        <w:rPr>
           <w:lang w:eastAsia="ru-RU"/>
         </w:rPr>
-        <w:t>Зависимости категориальных переменных</w:t>
-      </w:r>
-      <w:r>
-        <w:rPr>
-          <w:lang w:eastAsia="ru-RU"/>
-        </w:rPr>
-        <w:t>. Для проверки</w:t>
-      </w:r>
-      <w:r>
-        <w:rPr>
-          <w:lang w:val="ru-RU" w:eastAsia="ru-RU"/>
-        </w:rPr>
-        <w:t xml:space="preserve"> </w:t>
-      </w:r>
-      <w:r>
-        <w:rPr>
-          <w:lang w:eastAsia="ru-RU"/>
-        </w:rPr>
-        <w:t>статистической связи между двумя категориальными переменными</w:t>
-      </w:r>
-      <w:r>
-        <w:rPr>
-          <w:lang w:val="ru-RU" w:eastAsia="ru-RU"/>
-        </w:rPr>
-        <w:t xml:space="preserve"> </w:t>
-      </w:r>
-      <w:r>
-        <w:rPr>
-          <w:lang w:eastAsia="ru-RU"/>
-        </w:rPr>
-        <w:t>проводится испытание хи-квадрат (</w:t>
-      </w:r>
-      <w:r>
-        <w:rPr>
-          <w:lang w:eastAsia="ru-RU"/>
-        </w:rPr>
         <w:sym w:font="Symbol" w:char="F063"/>
       </w:r>
       <w:r>
         <w:rPr>
-          <w:lang w:eastAsia="ru-RU"/>
+          <w:lang w:val="ru-RU" w:eastAsia="ru-RU"/>
         </w:rPr>
         <w:t>2) или используются ранговые тесты.</w:t>
       </w:r>
@@ -1134,7 +1184,7 @@
     <w:p>
       <w:pPr>
         <w:rPr>
-          <w:lang w:eastAsia="ru-RU"/>
+          <w:lang w:val="ru-RU" w:eastAsia="ru-RU"/>
         </w:rPr>
       </w:pPr>
       <w:r>
@@ -1143,7 +1193,7 @@
           <w:color w:val="000000"/>
           <w:kern w:val="0"/>
           <w:szCs w:val="28"/>
-          <w:lang w:eastAsia="ru-RU"/>
+          <w:lang w:val="ru-RU" w:eastAsia="ru-RU"/>
           <w14:ligatures w14:val="none"/>
         </w:rPr>
         <w:br w:type="page"/>
@@ -1268,13 +1318,312 @@
       <w:pPr>
         <w:ind w:firstLine="0"/>
         <w:rPr>
-          <w:lang w:val="ru-RU"/>
-        </w:rPr>
-      </w:pPr>
-      <w:r>
-        <w:rPr>
-          <w:lang w:val="ru-RU"/>
-        </w:rPr>
+          <w:rFonts w:eastAsiaTheme="minorEastAsia"/>
+          <w:lang w:val="ru-RU"/>
+        </w:rPr>
+      </w:pPr>
+      <w:r>
+        <w:rPr>
+          <w:lang w:val="ru-RU"/>
+        </w:rPr>
+        <w:t xml:space="preserve">Гипотезы решено проверять функцией </w:t>
+      </w:r>
+      <w:r>
+        <w:t>Excel</w:t>
+      </w:r>
+      <w:r>
+        <w:rPr>
+          <w:lang w:val="ru-RU"/>
+        </w:rPr>
+        <w:t xml:space="preserve"> </w:t>
+      </w:r>
+      <w:r>
+        <w:rPr>
+          <w:lang w:val="ru-RU"/>
+        </w:rPr>
+        <w:t xml:space="preserve">ХИ2ТЕСТ(), которая вычисляет значение уровня зависимости </w:t>
+      </w:r>
+      <m:oMath>
+        <m:r>
+          <w:rPr>
+            <w:rFonts w:ascii="Cambria Math" w:hAnsi="Cambria Math"/>
+          </w:rPr>
+          <m:t>a</m:t>
+        </m:r>
+      </m:oMath>
+      <w:r>
+        <w:rPr>
+          <w:rFonts w:eastAsiaTheme="minorEastAsia"/>
+          <w:lang w:val="ru-RU"/>
+        </w:rPr>
+        <w:t xml:space="preserve">. Для её использования построена сводная таблица по двум категориальным переменным. Для тех столбцов, в которых </w:t>
+      </w:r>
+      <w:r>
+        <w:rPr>
+          <w:rFonts w:eastAsiaTheme="minorEastAsia"/>
+          <w:lang w:val="ru-RU"/>
+        </w:rPr>
+        <w:t>5</w:t>
+      </w:r>
+      <w:r>
+        <w:rPr>
+          <w:rFonts w:eastAsiaTheme="minorEastAsia"/>
+          <w:lang w:val="ru-RU"/>
+        </w:rPr>
+        <w:t xml:space="preserve"> количество измерений было выполнено их объединение. По итогу получена следующая таблица (пример для гипотезы 1):</w:t>
+      </w:r>
+    </w:p>
+    <w:p>
+      <w:pPr>
+        <w:ind w:firstLine="0"/>
+        <w:jc w:val="center"/>
+        <w:rPr>
+          <w:rFonts w:eastAsiaTheme="minorEastAsia"/>
+          <w:lang w:val="ru-RU"/>
+        </w:rPr>
+      </w:pPr>
+      <w:r>
+        <w:rPr>
+          <w:noProof/>
+        </w:rPr>
+        <w:drawing>
+          <wp:inline distT="0" distB="0" distL="0" distR="0" wp14:anchorId="4BA2E137" wp14:editId="01D2F9AC">
+            <wp:extent cx="5786755" cy="1983756"/>
+            <wp:effectExtent l="0" t="0" r="4445" b="0"/>
+            <wp:docPr id="1" name="Рисунок 1"/>
+            <wp:cNvGraphicFramePr>
+              <a:graphicFrameLocks xmlns:a="http://schemas.openxmlformats.org/drawingml/2006/main" noChangeAspect="1"/>
+            </wp:cNvGraphicFramePr>
+            <a:graphic xmlns:a="http://schemas.openxmlformats.org/drawingml/2006/main">
+              <a:graphicData uri="http://schemas.openxmlformats.org/drawingml/2006/picture">
+                <pic:pic xmlns:pic="http://schemas.openxmlformats.org/drawingml/2006/picture">
+                  <pic:nvPicPr>
+                    <pic:cNvPr id="0" name="Picture 1"/>
+                    <pic:cNvPicPr>
+                      <a:picLocks noChangeAspect="1" noChangeArrowheads="1"/>
+                    </pic:cNvPicPr>
+                  </pic:nvPicPr>
+                  <pic:blipFill>
+                    <a:blip r:embed="rId8">
+                      <a:extLst>
+                        <a:ext uri="{28A0092B-C50C-407E-A947-70E740481C1C}">
+                          <a14:useLocalDpi xmlns:a14="http://schemas.microsoft.com/office/drawing/2010/main" val="0"/>
+                        </a:ext>
+                      </a:extLst>
+                    </a:blip>
+                    <a:srcRect/>
+                    <a:stretch>
+                      <a:fillRect/>
+                    </a:stretch>
+                  </pic:blipFill>
+                  <pic:spPr bwMode="auto">
+                    <a:xfrm>
+                      <a:off x="0" y="0"/>
+                      <a:ext cx="5790576" cy="1985066"/>
+                    </a:xfrm>
+                    <a:prstGeom prst="rect">
+                      <a:avLst/>
+                    </a:prstGeom>
+                    <a:noFill/>
+                    <a:ln>
+                      <a:noFill/>
+                    </a:ln>
+                  </pic:spPr>
+                </pic:pic>
+              </a:graphicData>
+            </a:graphic>
+          </wp:inline>
+        </w:drawing>
+      </w:r>
+    </w:p>
+    <w:p>
+      <w:pPr>
+        <w:ind w:firstLine="0"/>
+        <w:rPr>
+          <w:lang w:val="ru-RU"/>
+        </w:rPr>
+      </w:pPr>
+      <w:r>
+        <w:rPr>
+          <w:lang w:val="ru-RU"/>
+        </w:rPr>
+        <w:t>Затем построена таблица ожидаемых значений:</w:t>
+      </w:r>
+    </w:p>
+    <w:p>
+      <w:pPr>
+        <w:ind w:firstLine="0"/>
+        <w:jc w:val="center"/>
+        <w:rPr>
+          <w:lang w:val="ru-RU"/>
+        </w:rPr>
+      </w:pPr>
+      <w:r>
+        <w:rPr>
+          <w:noProof/>
+        </w:rPr>
+        <w:drawing>
+          <wp:inline distT="0" distB="0" distL="0" distR="0" wp14:anchorId="5738A709" wp14:editId="6A2DAAB4">
+            <wp:extent cx="5718500" cy="2122930"/>
+            <wp:effectExtent l="0" t="0" r="0" b="0"/>
+            <wp:docPr id="2" name="Рисунок 2"/>
+            <wp:cNvGraphicFramePr>
+              <a:graphicFrameLocks xmlns:a="http://schemas.openxmlformats.org/drawingml/2006/main" noChangeAspect="1"/>
+            </wp:cNvGraphicFramePr>
+            <a:graphic xmlns:a="http://schemas.openxmlformats.org/drawingml/2006/main">
+              <a:graphicData uri="http://schemas.openxmlformats.org/drawingml/2006/picture">
+                <pic:pic xmlns:pic="http://schemas.openxmlformats.org/drawingml/2006/picture">
+                  <pic:nvPicPr>
+                    <pic:cNvPr id="0" name="Picture 2"/>
+                    <pic:cNvPicPr>
+                      <a:picLocks noChangeAspect="1" noChangeArrowheads="1"/>
+                    </pic:cNvPicPr>
+                  </pic:nvPicPr>
+                  <pic:blipFill>
+                    <a:blip r:embed="rId9">
+                      <a:extLst>
+                        <a:ext uri="{28A0092B-C50C-407E-A947-70E740481C1C}">
+                          <a14:useLocalDpi xmlns:a14="http://schemas.microsoft.com/office/drawing/2010/main" val="0"/>
+                        </a:ext>
+                      </a:extLst>
+                    </a:blip>
+                    <a:srcRect/>
+                    <a:stretch>
+                      <a:fillRect/>
+                    </a:stretch>
+                  </pic:blipFill>
+                  <pic:spPr bwMode="auto">
+                    <a:xfrm>
+                      <a:off x="0" y="0"/>
+                      <a:ext cx="5736352" cy="2129557"/>
+                    </a:xfrm>
+                    <a:prstGeom prst="rect">
+                      <a:avLst/>
+                    </a:prstGeom>
+                    <a:noFill/>
+                    <a:ln>
+                      <a:noFill/>
+                    </a:ln>
+                  </pic:spPr>
+                </pic:pic>
+              </a:graphicData>
+            </a:graphic>
+          </wp:inline>
+        </w:drawing>
+      </w:r>
+    </w:p>
+    <w:p>
+      <w:pPr>
+        <w:ind w:firstLine="0"/>
+        <w:rPr>
+          <w:lang w:val="ru-RU"/>
+        </w:rPr>
+      </w:pPr>
+      <w:r>
+        <w:rPr>
+          <w:lang w:val="ru-RU"/>
+        </w:rPr>
+        <w:t xml:space="preserve">Значения ячеек получены по следующей формуле: </w:t>
+      </w:r>
+      <m:oMath>
+        <m:f>
+          <m:fPr>
+            <m:ctrlPr>
+              <w:rPr>
+                <w:rFonts w:ascii="Cambria Math" w:hAnsi="Cambria Math"/>
+                <w:i/>
+                <w:lang w:val="ru-RU"/>
+              </w:rPr>
+            </m:ctrlPr>
+          </m:fPr>
+          <m:num>
+            <m:r>
+              <w:rPr>
+                <w:rFonts w:ascii="Cambria Math" w:hAnsi="Cambria Math"/>
+                <w:lang w:val="ru-RU"/>
+              </w:rPr>
+              <m:t>строка "</m:t>
+            </m:r>
+            <m:r>
+              <m:rPr>
+                <m:nor/>
+              </m:rPr>
+              <w:rPr>
+                <w:rFonts w:ascii="Cambria Math" w:hAnsi="Cambria Math"/>
+                <w:lang w:val="ru-RU"/>
+              </w:rPr>
+              <m:t>всего"</m:t>
+            </m:r>
+            <m:r>
+              <w:rPr>
+                <w:rFonts w:ascii="Cambria Math" w:hAnsi="Cambria Math"/>
+                <w:lang w:val="ru-RU"/>
+              </w:rPr>
+              <m:t>*колонка "всего"</m:t>
+            </m:r>
+          </m:num>
+          <m:den>
+            <m:r>
+              <w:rPr>
+                <w:rFonts w:ascii="Cambria Math" w:hAnsi="Cambria Math"/>
+                <w:lang w:val="ru-RU"/>
+              </w:rPr>
+              <m:t>итоговое "всего"</m:t>
+            </m:r>
+          </m:den>
+        </m:f>
+      </m:oMath>
+    </w:p>
+    <w:p>
+      <w:pPr>
+        <w:ind w:firstLine="0"/>
+        <w:rPr>
+          <w:lang w:val="ru-RU"/>
+        </w:rPr>
+      </w:pPr>
+      <w:r>
+        <w:rPr>
+          <w:lang w:val="ru-RU"/>
+        </w:rPr>
+        <w:t xml:space="preserve">Наконец по содержимому таблиц применена функция </w:t>
+      </w:r>
+      <m:oMath>
+        <m:r>
+          <w:rPr>
+            <w:rFonts w:ascii="Cambria Math" w:hAnsi="Cambria Math"/>
+            <w:lang w:val="ru-RU"/>
+          </w:rPr>
+          <m:t>=</m:t>
+        </m:r>
+        <m:r>
+          <w:rPr>
+            <w:rFonts w:ascii="Cambria Math" w:hAnsi="Cambria Math"/>
+            <w:lang w:val="ru-RU"/>
+          </w:rPr>
+          <m:t>ХИ2ТЕСТ()</m:t>
+        </m:r>
+      </m:oMath>
+    </w:p>
+    <w:p>
+      <w:pPr>
+        <w:ind w:firstLine="0"/>
+        <w:rPr>
+          <w:lang w:val="ru-RU"/>
+        </w:rPr>
+      </w:pPr>
+    </w:p>
+    <w:p>
+      <w:pPr>
+        <w:ind w:firstLine="0"/>
+        <w:rPr>
+          <w:lang w:val="ru-RU"/>
+        </w:rPr>
+      </w:pPr>
+      <w:r>
+        <w:rPr>
+          <w:lang w:val="ru-RU"/>
+        </w:rPr>
+        <w:lastRenderedPageBreak/>
         <w:t>Проверка гипотез</w:t>
       </w:r>
     </w:p>
@@ -1309,7 +1658,6 @@
         <w:rPr>
           <w:i/>
           <w:iCs/>
-          <w:lang w:val="en-US"/>
         </w:rPr>
         <w:t>H</w:t>
       </w:r>
@@ -1318,10 +1666,14 @@
           <w:i/>
           <w:iCs/>
           <w:vertAlign w:val="subscript"/>
+          <w:lang w:val="ru-RU"/>
         </w:rPr>
         <w:t>0</w:t>
       </w:r>
       <w:r>
+        <w:rPr>
+          <w:lang w:val="ru-RU"/>
+        </w:rPr>
         <w:t xml:space="preserve"> – </w:t>
       </w:r>
       <w:r>
@@ -1344,7 +1696,6 @@
         <w:rPr>
           <w:i/>
           <w:iCs/>
-          <w:lang w:val="en-US"/>
         </w:rPr>
         <w:t>H</w:t>
       </w:r>
@@ -1353,10 +1704,14 @@
           <w:i/>
           <w:iCs/>
           <w:vertAlign w:val="subscript"/>
+          <w:lang w:val="ru-RU"/>
         </w:rPr>
         <w:t>1</w:t>
       </w:r>
       <w:r>
+        <w:rPr>
+          <w:lang w:val="ru-RU"/>
+        </w:rPr>
         <w:t xml:space="preserve"> – </w:t>
       </w:r>
       <w:r>
@@ -1386,11 +1741,212 @@
     </w:p>
     <w:p>
       <w:pPr>
-        <w:pStyle w:val="a7"/>
-        <w:ind w:left="720" w:firstLine="0"/>
-        <w:rPr>
+        <w:spacing w:line="240" w:lineRule="auto"/>
+        <w:ind w:firstLine="360"/>
+        <w:rPr>
+          <w:rFonts w:ascii="Calibri" w:eastAsia="Times New Roman" w:hAnsi="Calibri" w:cs="Calibri"/>
+          <w:color w:val="000000"/>
+          <w:kern w:val="0"/>
+          <w:sz w:val="24"/>
+          <w:lang w:val="ru-RU"/>
+          <w14:ligatures w14:val="none"/>
+        </w:rPr>
+      </w:pPr>
+      <m:oMathPara>
+        <m:oMath>
+          <m:r>
+            <w:rPr>
+              <w:rFonts w:ascii="Cambria Math" w:hAnsi="Cambria Math"/>
+              <w:szCs w:val="28"/>
+              <w:lang w:val="ru-RU"/>
+            </w:rPr>
+            <m:t xml:space="preserve">=ХИ2ТЕСТ() = </m:t>
+          </m:r>
+          <m:r>
+            <w:rPr>
+              <w:rFonts w:ascii="Cambria Math" w:eastAsia="Times New Roman" w:hAnsi="Cambria Math" w:cs="Calibri"/>
+              <w:color w:val="000000"/>
+              <w:kern w:val="0"/>
+              <w:sz w:val="24"/>
+              <w14:ligatures w14:val="none"/>
+            </w:rPr>
+            <m:t>0,000587977</m:t>
+          </m:r>
+        </m:oMath>
+      </m:oMathPara>
+    </w:p>
+    <w:p>
+      <w:pPr>
+        <w:spacing w:line="240" w:lineRule="auto"/>
+        <w:ind w:firstLine="708"/>
+        <w:rPr>
+          <w:rFonts w:ascii="Calibri" w:eastAsia="Times New Roman" w:hAnsi="Calibri" w:cs="Calibri"/>
+          <w:color w:val="000000"/>
+          <w:kern w:val="0"/>
+          <w:sz w:val="24"/>
+          <w:lang w:val="ru-RU"/>
+          <w14:ligatures w14:val="none"/>
+        </w:rPr>
+      </w:pPr>
+      <m:oMath>
+        <m:r>
+          <w:rPr>
+            <w:rFonts w:ascii="Cambria Math" w:eastAsia="Times New Roman" w:hAnsi="Cambria Math" w:cs="Calibri"/>
+            <w:color w:val="000000"/>
+            <w:kern w:val="0"/>
+            <w:sz w:val="24"/>
+            <w14:ligatures w14:val="none"/>
+          </w:rPr>
+          <m:t>|</m:t>
+        </m:r>
+        <m:r>
+          <w:rPr>
+            <w:rFonts w:ascii="Cambria Math" w:eastAsia="Times New Roman" w:hAnsi="Cambria Math" w:cs="Calibri"/>
+            <w:color w:val="000000"/>
+            <w:kern w:val="0"/>
+            <w:sz w:val="24"/>
+            <w:lang w:val="ru-RU"/>
+            <w14:ligatures w14:val="none"/>
+          </w:rPr>
+          <m:t>0,0006</m:t>
+        </m:r>
+        <m:r>
+          <w:rPr>
+            <w:rFonts w:ascii="Cambria Math" w:eastAsia="Times New Roman" w:hAnsi="Cambria Math" w:cs="Calibri"/>
+            <w:color w:val="000000"/>
+            <w:kern w:val="0"/>
+            <w:sz w:val="24"/>
+            <w14:ligatures w14:val="none"/>
+          </w:rPr>
+          <m:t>|</m:t>
+        </m:r>
+        <m:r>
+          <w:rPr>
+            <w:rFonts w:ascii="Cambria Math" w:eastAsia="Times New Roman" w:hAnsi="Cambria Math" w:cs="Calibri"/>
+            <w:color w:val="000000"/>
+            <w:kern w:val="0"/>
+            <w:sz w:val="24"/>
+            <w:lang w:val="ru-RU"/>
+            <w14:ligatures w14:val="none"/>
+          </w:rPr>
+          <m:t xml:space="preserve"> </m:t>
+        </m:r>
+        <m:r>
+          <w:rPr>
+            <w:rFonts w:ascii="Cambria Math" w:eastAsia="Times New Roman" w:hAnsi="Cambria Math" w:cs="Calibri"/>
+            <w:color w:val="000000"/>
+            <w:kern w:val="0"/>
+            <w:sz w:val="24"/>
+            <w14:ligatures w14:val="none"/>
+          </w:rPr>
+          <m:t>&lt; |0</m:t>
+        </m:r>
+        <m:r>
+          <w:rPr>
+            <w:rFonts w:ascii="Cambria Math" w:eastAsia="Times New Roman" w:hAnsi="Cambria Math" w:cs="Calibri"/>
+            <w:color w:val="000000"/>
+            <w:kern w:val="0"/>
+            <w:sz w:val="24"/>
+            <w14:ligatures w14:val="none"/>
+          </w:rPr>
+          <m:t>,</m:t>
+        </m:r>
+        <m:r>
+          <w:rPr>
+            <w:rFonts w:ascii="Cambria Math" w:eastAsia="Times New Roman" w:hAnsi="Cambria Math" w:cs="Calibri"/>
+            <w:color w:val="000000"/>
+            <w:kern w:val="0"/>
+            <w:sz w:val="24"/>
+            <w14:ligatures w14:val="none"/>
+          </w:rPr>
+          <m:t>05|</m:t>
+        </m:r>
+      </m:oMath>
+      <w:r>
+        <w:rPr>
+          <w:rFonts w:ascii="Calibri" w:eastAsia="Times New Roman" w:hAnsi="Calibri" w:cs="Calibri"/>
+          <w:color w:val="000000"/>
+          <w:kern w:val="0"/>
+          <w:sz w:val="24"/>
+          <w14:ligatures w14:val="none"/>
+        </w:rPr>
+        <w:t xml:space="preserve"> </w:t>
+      </w:r>
+      <w:r>
+        <w:rPr>
+          <w:rFonts w:eastAsia="Times New Roman" w:cs="Times New Roman"/>
+          <w:color w:val="000000"/>
+          <w:kern w:val="0"/>
           <w:szCs w:val="28"/>
-          <w:lang w:val="ru-RU"/>
+          <w14:ligatures w14:val="none"/>
+        </w:rPr>
+        <w:t xml:space="preserve">- </w:t>
+      </w:r>
+      <w:r>
+        <w:rPr>
+          <w:rFonts w:eastAsia="Times New Roman" w:cs="Times New Roman"/>
+          <w:color w:val="000000"/>
+          <w:kern w:val="0"/>
+          <w:szCs w:val="28"/>
+          <w:lang w:val="ru-RU"/>
+          <w14:ligatures w14:val="none"/>
+        </w:rPr>
+        <w:t>гипотеза</w:t>
+      </w:r>
+      <w:r>
+        <w:rPr>
+          <w:rFonts w:ascii="Calibri" w:eastAsia="Times New Roman" w:hAnsi="Calibri" w:cs="Calibri"/>
+          <w:color w:val="000000"/>
+          <w:kern w:val="0"/>
+          <w:sz w:val="24"/>
+          <w:lang w:val="ru-RU"/>
+          <w14:ligatures w14:val="none"/>
+        </w:rPr>
+        <w:t xml:space="preserve"> </w:t>
+      </w:r>
+      <w:r>
+        <w:rPr>
+          <w:i/>
+          <w:iCs/>
+        </w:rPr>
+        <w:t>H</w:t>
+      </w:r>
+      <w:r>
+        <w:rPr>
+          <w:i/>
+          <w:iCs/>
+          <w:vertAlign w:val="subscript"/>
+          <w:lang w:val="ru-RU"/>
+        </w:rPr>
+        <w:t>0</w:t>
+      </w:r>
+      <w:r>
+        <w:rPr>
+          <w:i/>
+          <w:iCs/>
+          <w:vertAlign w:val="subscript"/>
+          <w:lang w:val="ru-RU"/>
+        </w:rPr>
+        <w:t xml:space="preserve"> </w:t>
+      </w:r>
+      <w:r>
+        <w:rPr>
+          <w:lang w:val="ru-RU"/>
+        </w:rPr>
+        <w:t>отклоняется</w:t>
+      </w:r>
+    </w:p>
+    <w:p>
+      <w:pPr>
+        <w:spacing w:line="240" w:lineRule="auto"/>
+        <w:ind w:firstLine="0"/>
+        <w:rPr>
+          <w:rFonts w:ascii="Calibri" w:eastAsia="Times New Roman" w:hAnsi="Calibri" w:cs="Calibri"/>
+          <w:color w:val="000000"/>
+          <w:kern w:val="0"/>
+          <w:sz w:val="24"/>
+          <w:lang w:val="ru-RU"/>
+          <w14:ligatures w14:val="none"/>
         </w:rPr>
       </w:pPr>
     </w:p>
@@ -1425,7 +1981,6 @@
         <w:rPr>
           <w:i/>
           <w:iCs/>
-          <w:lang w:val="en-US"/>
         </w:rPr>
         <w:t>H</w:t>
       </w:r>
@@ -1434,10 +1989,14 @@
           <w:i/>
           <w:iCs/>
           <w:vertAlign w:val="subscript"/>
+          <w:lang w:val="ru-RU"/>
         </w:rPr>
         <w:t>0</w:t>
       </w:r>
       <w:r>
+        <w:rPr>
+          <w:lang w:val="ru-RU"/>
+        </w:rPr>
         <w:t xml:space="preserve"> – </w:t>
       </w:r>
       <w:r>
@@ -1460,7 +2019,6 @@
         <w:rPr>
           <w:i/>
           <w:iCs/>
-          <w:lang w:val="en-US"/>
         </w:rPr>
         <w:t>H</w:t>
       </w:r>
@@ -1469,10 +2027,14 @@
           <w:i/>
           <w:iCs/>
           <w:vertAlign w:val="subscript"/>
+          <w:lang w:val="ru-RU"/>
         </w:rPr>
         <w:t>1</w:t>
       </w:r>
       <w:r>
+        <w:rPr>
+          <w:lang w:val="ru-RU"/>
+        </w:rPr>
         <w:t xml:space="preserve"> – </w:t>
       </w:r>
       <w:r>
@@ -1501,12 +2063,218 @@
     </w:p>
     <w:p>
       <w:pPr>
-        <w:pStyle w:val="a7"/>
-        <w:ind w:left="720" w:firstLine="0"/>
-        <w:rPr>
-          <w:lang w:val="ru-RU"/>
-        </w:rPr>
-      </w:pPr>
+        <w:spacing w:line="240" w:lineRule="auto"/>
+        <w:ind w:firstLine="0"/>
+        <w:jc w:val="center"/>
+        <w:rPr>
+          <w:rFonts w:ascii="Calibri" w:eastAsia="Times New Roman" w:hAnsi="Calibri" w:cs="Calibri"/>
+          <w:color w:val="000000"/>
+          <w:kern w:val="0"/>
+          <w:sz w:val="24"/>
+          <w14:ligatures w14:val="none"/>
+        </w:rPr>
+      </w:pPr>
+      <m:oMath>
+        <m:r>
+          <w:rPr>
+            <w:rFonts w:ascii="Cambria Math" w:hAnsi="Cambria Math"/>
+            <w:szCs w:val="28"/>
+            <w:lang w:val="ru-RU"/>
+          </w:rPr>
+          <m:t xml:space="preserve">=ХИ2ТЕСТ() = </m:t>
+        </m:r>
+      </m:oMath>
+      <w:r>
+        <w:rPr>
+          <w:rFonts w:ascii="Calibri" w:eastAsia="Times New Roman" w:hAnsi="Calibri" w:cs="Calibri"/>
+          <w:color w:val="000000"/>
+          <w:kern w:val="0"/>
+          <w:sz w:val="24"/>
+          <w14:ligatures w14:val="none"/>
+        </w:rPr>
+        <w:t>0,013318875</w:t>
+      </w:r>
+    </w:p>
+    <w:p>
+      <w:pPr>
+        <w:spacing w:line="240" w:lineRule="auto"/>
+        <w:ind w:firstLine="708"/>
+        <w:rPr>
+          <w:rFonts w:ascii="Calibri" w:eastAsia="Times New Roman" w:hAnsi="Calibri" w:cs="Calibri"/>
+          <w:color w:val="000000"/>
+          <w:kern w:val="0"/>
+          <w:sz w:val="24"/>
+          <w14:ligatures w14:val="none"/>
+        </w:rPr>
+      </w:pPr>
+      <m:oMath>
+        <m:r>
+          <w:rPr>
+            <w:rFonts w:ascii="Cambria Math" w:eastAsia="Times New Roman" w:hAnsi="Cambria Math" w:cs="Calibri"/>
+            <w:color w:val="000000"/>
+            <w:kern w:val="0"/>
+            <w:sz w:val="24"/>
+            <w14:ligatures w14:val="none"/>
+          </w:rPr>
+          <m:t>|</m:t>
+        </m:r>
+        <m:r>
+          <w:rPr>
+            <w:rFonts w:ascii="Cambria Math" w:eastAsia="Times New Roman" w:hAnsi="Cambria Math" w:cs="Calibri"/>
+            <w:color w:val="000000"/>
+            <w:kern w:val="0"/>
+            <w:sz w:val="24"/>
+            <w:lang w:val="ru-RU"/>
+            <w14:ligatures w14:val="none"/>
+          </w:rPr>
+          <m:t>0,0</m:t>
+        </m:r>
+        <m:r>
+          <w:rPr>
+            <w:rFonts w:ascii="Cambria Math" w:eastAsia="Times New Roman" w:hAnsi="Cambria Math" w:cs="Calibri"/>
+            <w:color w:val="000000"/>
+            <w:kern w:val="0"/>
+            <w:sz w:val="24"/>
+            <w:lang w:val="ru-RU"/>
+            <w14:ligatures w14:val="none"/>
+          </w:rPr>
+          <m:t>1</m:t>
+        </m:r>
+        <m:r>
+          <w:rPr>
+            <w:rFonts w:ascii="Cambria Math" w:eastAsia="Times New Roman" w:hAnsi="Cambria Math" w:cs="Calibri"/>
+            <w:color w:val="000000"/>
+            <w:kern w:val="0"/>
+            <w:sz w:val="24"/>
+            <w14:ligatures w14:val="none"/>
+          </w:rPr>
+          <m:t>3</m:t>
+        </m:r>
+        <m:r>
+          <w:rPr>
+            <w:rFonts w:ascii="Cambria Math" w:eastAsia="Times New Roman" w:hAnsi="Cambria Math" w:cs="Calibri"/>
+            <w:color w:val="000000"/>
+            <w:kern w:val="0"/>
+            <w:sz w:val="24"/>
+            <w14:ligatures w14:val="none"/>
+          </w:rPr>
+          <m:t>|</m:t>
+        </m:r>
+        <m:r>
+          <w:rPr>
+            <w:rFonts w:ascii="Cambria Math" w:eastAsia="Times New Roman" w:hAnsi="Cambria Math" w:cs="Calibri"/>
+            <w:color w:val="000000"/>
+            <w:kern w:val="0"/>
+            <w:sz w:val="24"/>
+            <w:lang w:val="ru-RU"/>
+            <w14:ligatures w14:val="none"/>
+          </w:rPr>
+          <m:t xml:space="preserve"> </m:t>
+        </m:r>
+        <m:r>
+          <w:rPr>
+            <w:rFonts w:ascii="Cambria Math" w:eastAsia="Times New Roman" w:hAnsi="Cambria Math" w:cs="Calibri"/>
+            <w:color w:val="000000"/>
+            <w:kern w:val="0"/>
+            <w:sz w:val="24"/>
+            <w14:ligatures w14:val="none"/>
+          </w:rPr>
+          <m:t>&lt; |0</m:t>
+        </m:r>
+        <m:r>
+          <w:rPr>
+            <w:rFonts w:ascii="Cambria Math" w:eastAsia="Times New Roman" w:hAnsi="Cambria Math" w:cs="Calibri"/>
+            <w:color w:val="000000"/>
+            <w:kern w:val="0"/>
+            <w:sz w:val="24"/>
+            <w14:ligatures w14:val="none"/>
+          </w:rPr>
+          <m:t>,</m:t>
+        </m:r>
+        <m:r>
+          <w:rPr>
+            <w:rFonts w:ascii="Cambria Math" w:eastAsia="Times New Roman" w:hAnsi="Cambria Math" w:cs="Calibri"/>
+            <w:color w:val="000000"/>
+            <w:kern w:val="0"/>
+            <w:sz w:val="24"/>
+            <w14:ligatures w14:val="none"/>
+          </w:rPr>
+          <m:t>05|</m:t>
+        </m:r>
+      </m:oMath>
+      <w:r>
+        <w:rPr>
+          <w:rFonts w:ascii="Calibri" w:eastAsia="Times New Roman" w:hAnsi="Calibri" w:cs="Calibri"/>
+          <w:color w:val="000000"/>
+          <w:kern w:val="0"/>
+          <w:sz w:val="24"/>
+          <w14:ligatures w14:val="none"/>
+        </w:rPr>
+        <w:t xml:space="preserve"> </w:t>
+      </w:r>
+      <w:r>
+        <w:rPr>
+          <w:rFonts w:eastAsia="Times New Roman" w:cs="Times New Roman"/>
+          <w:color w:val="000000"/>
+          <w:kern w:val="0"/>
+          <w:szCs w:val="28"/>
+          <w14:ligatures w14:val="none"/>
+        </w:rPr>
+        <w:t xml:space="preserve">- </w:t>
+      </w:r>
+      <w:r>
+        <w:rPr>
+          <w:rFonts w:eastAsia="Times New Roman" w:cs="Times New Roman"/>
+          <w:color w:val="000000"/>
+          <w:kern w:val="0"/>
+          <w:szCs w:val="28"/>
+          <w:lang w:val="ru-RU"/>
+          <w14:ligatures w14:val="none"/>
+        </w:rPr>
+        <w:t>гипотеза</w:t>
+      </w:r>
+      <w:r>
+        <w:rPr>
+          <w:rFonts w:ascii="Calibri" w:eastAsia="Times New Roman" w:hAnsi="Calibri" w:cs="Calibri"/>
+          <w:color w:val="000000"/>
+          <w:kern w:val="0"/>
+          <w:sz w:val="24"/>
+          <w:lang w:val="ru-RU"/>
+          <w14:ligatures w14:val="none"/>
+        </w:rPr>
+        <w:t xml:space="preserve"> </w:t>
+      </w:r>
+      <w:r>
+        <w:rPr>
+          <w:i/>
+          <w:iCs/>
+        </w:rPr>
+        <w:t>H</w:t>
+      </w:r>
+      <w:r>
+        <w:rPr>
+          <w:i/>
+          <w:iCs/>
+          <w:vertAlign w:val="subscript"/>
+          <w:lang w:val="ru-RU"/>
+        </w:rPr>
+        <w:t>0</w:t>
+      </w:r>
+      <w:r>
+        <w:rPr>
+          <w:i/>
+          <w:iCs/>
+          <w:vertAlign w:val="subscript"/>
+          <w:lang w:val="ru-RU"/>
+        </w:rPr>
+        <w:t xml:space="preserve"> </w:t>
+      </w:r>
+      <w:r>
+        <w:rPr>
+          <w:lang w:val="ru-RU"/>
+        </w:rPr>
+        <w:t>отклоняется</w:t>
+      </w:r>
     </w:p>
     <w:p>
       <w:pPr>
@@ -1539,7 +2307,6 @@
         <w:rPr>
           <w:i/>
           <w:iCs/>
-          <w:lang w:val="en-US"/>
         </w:rPr>
         <w:t>H</w:t>
       </w:r>
@@ -1548,10 +2315,14 @@
           <w:i/>
           <w:iCs/>
           <w:vertAlign w:val="subscript"/>
+          <w:lang w:val="ru-RU"/>
         </w:rPr>
         <w:t>0</w:t>
       </w:r>
       <w:r>
+        <w:rPr>
+          <w:lang w:val="ru-RU"/>
+        </w:rPr>
         <w:t xml:space="preserve"> – </w:t>
       </w:r>
       <w:r>
@@ -1574,7 +2345,6 @@
         <w:rPr>
           <w:i/>
           <w:iCs/>
-          <w:lang w:val="en-US"/>
         </w:rPr>
         <w:t>H</w:t>
       </w:r>
@@ -1583,10 +2353,14 @@
           <w:i/>
           <w:iCs/>
           <w:vertAlign w:val="subscript"/>
+          <w:lang w:val="ru-RU"/>
         </w:rPr>
         <w:t>1</w:t>
       </w:r>
       <w:r>
+        <w:rPr>
+          <w:lang w:val="ru-RU"/>
+        </w:rPr>
         <w:t xml:space="preserve"> – </w:t>
       </w:r>
       <w:r>
@@ -1609,24 +2383,270 @@
         <w:rPr>
           <w:color w:val="000000"/>
           <w:szCs w:val="28"/>
+          <w:lang w:val="ru-RU"/>
         </w:rPr>
         <w:t>Уровень значимости – 5%.</w:t>
       </w:r>
     </w:p>
     <w:p>
       <w:pPr>
+        <w:spacing w:line="240" w:lineRule="auto"/>
+        <w:ind w:firstLine="0"/>
+        <w:jc w:val="center"/>
+        <w:rPr>
+          <w:rFonts w:ascii="Calibri" w:eastAsia="Times New Roman" w:hAnsi="Calibri" w:cs="Calibri"/>
+          <w:color w:val="000000"/>
+          <w:kern w:val="0"/>
+          <w:sz w:val="24"/>
+          <w14:ligatures w14:val="none"/>
+        </w:rPr>
+      </w:pPr>
+      <m:oMath>
+        <m:r>
+          <w:rPr>
+            <w:rFonts w:ascii="Cambria Math" w:hAnsi="Cambria Math"/>
+            <w:szCs w:val="28"/>
+            <w:lang w:val="ru-RU"/>
+          </w:rPr>
+          <m:t xml:space="preserve">=ХИ2ТЕСТ() = </m:t>
+        </m:r>
+      </m:oMath>
+      <w:r>
+        <w:rPr>
+          <w:rFonts w:ascii="Calibri" w:eastAsia="Times New Roman" w:hAnsi="Calibri" w:cs="Calibri"/>
+          <w:color w:val="000000"/>
+          <w:kern w:val="0"/>
+          <w:sz w:val="24"/>
+          <w14:ligatures w14:val="none"/>
+        </w:rPr>
+        <w:t>2,6372E-23</w:t>
+      </w:r>
+    </w:p>
+    <w:p>
+      <w:pPr>
+        <w:spacing w:line="240" w:lineRule="auto"/>
+        <w:ind w:firstLine="708"/>
+        <w:rPr>
+          <w:rFonts w:ascii="Calibri" w:eastAsia="Times New Roman" w:hAnsi="Calibri" w:cs="Calibri"/>
+          <w:color w:val="000000"/>
+          <w:kern w:val="0"/>
+          <w:sz w:val="24"/>
+          <w14:ligatures w14:val="none"/>
+        </w:rPr>
+      </w:pPr>
+      <m:oMath>
+        <m:r>
+          <w:rPr>
+            <w:rFonts w:ascii="Cambria Math" w:eastAsia="Times New Roman" w:hAnsi="Cambria Math" w:cs="Calibri"/>
+            <w:color w:val="000000"/>
+            <w:kern w:val="0"/>
+            <w:sz w:val="24"/>
+            <w:lang w:val="ru-RU"/>
+            <w14:ligatures w14:val="none"/>
+          </w:rPr>
+          <m:t>|</m:t>
+        </m:r>
+      </m:oMath>
+      <w:r>
+        <w:rPr>
+          <w:rFonts w:ascii="Calibri" w:eastAsia="Times New Roman" w:hAnsi="Calibri" w:cs="Calibri"/>
+          <w:color w:val="000000"/>
+          <w:kern w:val="0"/>
+          <w:sz w:val="24"/>
+          <w14:ligatures w14:val="none"/>
+        </w:rPr>
+        <w:t>2,6E-23</w:t>
+      </w:r>
+      <m:oMath>
+        <m:r>
+          <w:rPr>
+            <w:rFonts w:ascii="Cambria Math" w:eastAsia="Times New Roman" w:hAnsi="Cambria Math" w:cs="Calibri"/>
+            <w:color w:val="000000"/>
+            <w:kern w:val="0"/>
+            <w:sz w:val="24"/>
+            <w:lang w:val="ru-RU"/>
+            <w14:ligatures w14:val="none"/>
+          </w:rPr>
+          <m:t>|</m:t>
+        </m:r>
+        <m:r>
+          <w:rPr>
+            <w:rFonts w:ascii="Cambria Math" w:eastAsia="Times New Roman" w:hAnsi="Cambria Math" w:cs="Calibri"/>
+            <w:color w:val="000000"/>
+            <w:kern w:val="0"/>
+            <w:sz w:val="24"/>
+            <w:lang w:val="ru-RU"/>
+            <w14:ligatures w14:val="none"/>
+          </w:rPr>
+          <m:t xml:space="preserve"> </m:t>
+        </m:r>
+        <m:r>
+          <w:rPr>
+            <w:rFonts w:ascii="Cambria Math" w:eastAsia="Times New Roman" w:hAnsi="Cambria Math" w:cs="Calibri"/>
+            <w:color w:val="000000"/>
+            <w:kern w:val="0"/>
+            <w:sz w:val="24"/>
+            <w:lang w:val="ru-RU"/>
+            <w14:ligatures w14:val="none"/>
+          </w:rPr>
+          <m:t>&lt; |0,05|</m:t>
+        </m:r>
+      </m:oMath>
+      <w:r>
+        <w:rPr>
+          <w:rFonts w:ascii="Calibri" w:eastAsia="Times New Roman" w:hAnsi="Calibri" w:cs="Calibri"/>
+          <w:color w:val="000000"/>
+          <w:kern w:val="0"/>
+          <w:sz w:val="24"/>
+          <w:lang w:val="ru-RU"/>
+          <w14:ligatures w14:val="none"/>
+        </w:rPr>
+        <w:t xml:space="preserve"> </w:t>
+      </w:r>
+      <w:r>
+        <w:rPr>
+          <w:rFonts w:eastAsia="Times New Roman" w:cs="Times New Roman"/>
+          <w:color w:val="000000"/>
+          <w:kern w:val="0"/>
+          <w:szCs w:val="28"/>
+          <w:lang w:val="ru-RU"/>
+          <w14:ligatures w14:val="none"/>
+        </w:rPr>
+        <w:t xml:space="preserve">- </w:t>
+      </w:r>
+      <w:r>
+        <w:rPr>
+          <w:rFonts w:eastAsia="Times New Roman" w:cs="Times New Roman"/>
+          <w:color w:val="000000"/>
+          <w:kern w:val="0"/>
+          <w:szCs w:val="28"/>
+          <w:lang w:val="ru-RU"/>
+          <w14:ligatures w14:val="none"/>
+        </w:rPr>
+        <w:t>гипотеза</w:t>
+      </w:r>
+      <w:r>
+        <w:rPr>
+          <w:rFonts w:ascii="Calibri" w:eastAsia="Times New Roman" w:hAnsi="Calibri" w:cs="Calibri"/>
+          <w:color w:val="000000"/>
+          <w:kern w:val="0"/>
+          <w:sz w:val="24"/>
+          <w:lang w:val="ru-RU"/>
+          <w14:ligatures w14:val="none"/>
+        </w:rPr>
+        <w:t xml:space="preserve"> </w:t>
+      </w:r>
+      <w:r>
+        <w:rPr>
+          <w:i/>
+          <w:iCs/>
+        </w:rPr>
+        <w:t>H</w:t>
+      </w:r>
+      <w:r>
+        <w:rPr>
+          <w:i/>
+          <w:iCs/>
+          <w:vertAlign w:val="subscript"/>
+          <w:lang w:val="ru-RU"/>
+        </w:rPr>
+        <w:t>0</w:t>
+      </w:r>
+      <w:r>
+        <w:rPr>
+          <w:i/>
+          <w:iCs/>
+          <w:vertAlign w:val="subscript"/>
+          <w:lang w:val="ru-RU"/>
+        </w:rPr>
+        <w:t xml:space="preserve"> </w:t>
+      </w:r>
+      <w:r>
+        <w:rPr>
+          <w:lang w:val="ru-RU"/>
+        </w:rPr>
+        <w:t>отклоняется</w:t>
+      </w:r>
+    </w:p>
+    <w:p/>
+    <w:p>
+      <w:pPr>
+        <w:rPr>
+          <w:lang w:val="ru-RU"/>
+        </w:rPr>
+      </w:pPr>
+      <w:r>
+        <w:rPr>
+          <w:lang w:val="ru-RU"/>
+        </w:rPr>
+        <w:t>Выводы:</w:t>
+      </w:r>
+    </w:p>
+    <w:p>
+      <w:pPr>
         <w:pStyle w:val="a7"/>
-        <w:ind w:left="720" w:firstLine="0"/>
-        <w:rPr>
-          <w:lang w:val="ru-RU"/>
-        </w:rPr>
-      </w:pPr>
+        <w:numPr>
+          <w:ilvl w:val="0"/>
+          <w:numId w:val="19"/>
+        </w:numPr>
+        <w:rPr>
+          <w:lang w:val="ru-RU"/>
+        </w:rPr>
+      </w:pPr>
+      <w:r>
+        <w:rPr>
+          <w:lang w:val="ru-RU"/>
+        </w:rPr>
+        <w:t xml:space="preserve">Существует взаимосвязь между </w:t>
+      </w:r>
+      <w:r>
+        <w:rPr>
+          <w:lang w:val="ru-RU"/>
+        </w:rPr>
+        <w:t>кодом школы и частотой игры</w:t>
+      </w:r>
+    </w:p>
+    <w:p>
+      <w:pPr>
+        <w:pStyle w:val="a7"/>
+        <w:numPr>
+          <w:ilvl w:val="0"/>
+          <w:numId w:val="19"/>
+        </w:numPr>
+        <w:rPr>
+          <w:lang w:val="ru-RU"/>
+        </w:rPr>
+      </w:pPr>
+      <w:r>
+        <w:rPr>
+          <w:lang w:val="ru-RU"/>
+        </w:rPr>
+        <w:t>Существует взаимосвязь между обеспеченностью семьи и частотой игры</w:t>
+      </w:r>
+    </w:p>
+    <w:p>
+      <w:pPr>
+        <w:pStyle w:val="a7"/>
+        <w:numPr>
+          <w:ilvl w:val="0"/>
+          <w:numId w:val="19"/>
+        </w:numPr>
+        <w:rPr>
+          <w:lang w:val="ru-RU"/>
+        </w:rPr>
+      </w:pPr>
+      <w:r>
+        <w:rPr>
+          <w:lang w:val="ru-RU"/>
+        </w:rPr>
+        <w:t>Существует взаимосвязь между полом и увлечённостью играми</w:t>
+      </w:r>
     </w:p>
     <w:sectPr>
-      <w:headerReference w:type="even" r:id="rId8"/>
-      <w:headerReference w:type="default" r:id="rId9"/>
-      <w:headerReference w:type="first" r:id="rId10"/>
-      <w:footerReference w:type="first" r:id="rId11"/>
+      <w:headerReference w:type="even" r:id="rId10"/>
+      <w:headerReference w:type="default" r:id="rId11"/>
+      <w:headerReference w:type="first" r:id="rId12"/>
+      <w:footerReference w:type="first" r:id="rId13"/>
       <w:pgSz w:w="11906" w:h="16838"/>
       <w:pgMar w:top="1134" w:right="567" w:bottom="1134" w:left="1701" w:header="720" w:footer="720" w:gutter="0"/>
       <w:cols w:space="720"/>
@@ -1638,7 +2658,7 @@
 </file>
 
 <file path=word/endnotes.xml><?xml version="1.0" encoding="utf-8"?>
-<w:endnotes xmlns:wpc="http://schemas.microsoft.com/office/word/2010/wordprocessingCanvas" xmlns:cx="http://schemas.microsoft.com/office/drawing/2014/chartex" xmlns:cx1="http://schemas.microsoft.com/office/drawing/2015/9/8/chartex" xmlns:cx2="http://schemas.microsoft.com/office/drawing/2015/10/21/chartex" xmlns:cx3="http://schemas.microsoft.com/office/drawing/2016/5/9/chartex" xmlns:cx4="http://schemas.microsoft.com/office/drawing/2016/5/10/chartex" xmlns:cx5="http://schemas.microsoft.com/office/drawing/2016/5/11/chartex" xmlns:cx6="http://schemas.microsoft.com/office/drawing/2016/5/12/chartex" xmlns:cx7="http://schemas.microsoft.com/office/drawing/2016/5/13/chartex" xmlns:cx8="http://schemas.microsoft.com/office/drawing/2016/5/14/chartex" xmlns:mc="http://schemas.openxmlformats.org/markup-compatibility/2006" xmlns:aink="http://schemas.microsoft.com/office/drawing/2016/ink" xmlns:am3d="http://schemas.microsoft.com/office/drawing/2017/model3d" xmlns:o="urn:schemas-microsoft-com:office:office" xmlns:oel="http://schemas.microsoft.com/office/2019/extlst" xmlns:r="http://schemas.openxmlformats.org/officeDocument/2006/relationships" xmlns:m="http://schemas.openxmlformats.org/officeDocument/2006/math" xmlns:v="urn:schemas-microsoft-com:vml" xmlns:wp14="http://schemas.microsoft.com/office/word/2010/wordprocessingDrawing" xmlns:wp="http://schemas.openxmlformats.org/drawingml/2006/wordprocessingDrawing" xmlns:w10="urn:schemas-microsoft-com:office:word" xmlns:w="http://schemas.openxmlformats.org/wordprocessingml/2006/main" xmlns:w14="http://schemas.microsoft.com/office/word/2010/wordml" xmlns:w15="http://schemas.microsoft.com/office/word/2012/wordml" xmlns:w16cex="http://schemas.microsoft.com/office/word/2018/wordml/cex" xmlns:w16cid="http://schemas.microsoft.com/office/word/2016/wordml/cid" xmlns:w16="http://schemas.microsoft.com/office/word/2018/wordml" xmlns:w16du="http://schemas.microsoft.com/office/word/2023/wordml/word16du" xmlns:w16sdtdh="http://schemas.microsoft.com/office/word/2020/wordml/sdtdatahash" xmlns:w16sdtfl="http://schemas.microsoft.com/office/word/2024/wordml/sdtformatlock" xmlns:w16se="http://schemas.microsoft.com/office/word/2015/wordml/symex" xmlns:wpg="http://schemas.microsoft.com/office/word/2010/wordprocessingGroup" xmlns:wpi="http://schemas.microsoft.com/office/word/2010/wordprocessingInk" xmlns:wne="http://schemas.microsoft.com/office/word/2006/wordml" xmlns:wps="http://schemas.microsoft.com/office/word/2010/wordprocessingShape" mc:Ignorable="w14 w15 w16se w16cid w16 w16cex w16sdtdh w16sdtfl w16du wp14">
+<w:endnotes xmlns:wpc="http://schemas.microsoft.com/office/word/2010/wordprocessingCanvas" xmlns:cx="http://schemas.microsoft.com/office/drawing/2014/chartex" xmlns:cx1="http://schemas.microsoft.com/office/drawing/2015/9/8/chartex" xmlns:cx2="http://schemas.microsoft.com/office/drawing/2015/10/21/chartex" xmlns:cx3="http://schemas.microsoft.com/office/drawing/2016/5/9/chartex" xmlns:cx4="http://schemas.microsoft.com/office/drawing/2016/5/10/chartex" xmlns:cx5="http://schemas.microsoft.com/office/drawing/2016/5/11/chartex" xmlns:cx6="http://schemas.microsoft.com/office/drawing/2016/5/12/chartex" xmlns:cx7="http://schemas.microsoft.com/office/drawing/2016/5/13/chartex" xmlns:cx8="http://schemas.microsoft.com/office/drawing/2016/5/14/chartex" xmlns:mc="http://schemas.openxmlformats.org/markup-compatibility/2006" xmlns:aink="http://schemas.microsoft.com/office/drawing/2016/ink" xmlns:am3d="http://schemas.microsoft.com/office/drawing/2017/model3d" xmlns:o="urn:schemas-microsoft-com:office:office" xmlns:oel="http://schemas.microsoft.com/office/2019/extlst" xmlns:r="http://schemas.openxmlformats.org/officeDocument/2006/relationships" xmlns:m="http://schemas.openxmlformats.org/officeDocument/2006/math" xmlns:v="urn:schemas-microsoft-com:vml" xmlns:wp14="http://schemas.microsoft.com/office/word/2010/wordprocessingDrawing" xmlns:wp="http://schemas.openxmlformats.org/drawingml/2006/wordprocessingDrawing" xmlns:w10="urn:schemas-microsoft-com:office:word" xmlns:w="http://schemas.openxmlformats.org/wordprocessingml/2006/main" xmlns:w14="http://schemas.microsoft.com/office/word/2010/wordml" xmlns:w15="http://schemas.microsoft.com/office/word/2012/wordml" xmlns:w16cex="http://schemas.microsoft.com/office/word/2018/wordml/cex" xmlns:w16cid="http://schemas.microsoft.com/office/word/2016/wordml/cid" xmlns:w16="http://schemas.microsoft.com/office/word/2018/wordml" xmlns:w16sdtdh="http://schemas.microsoft.com/office/word/2020/wordml/sdtdatahash" xmlns:w16se="http://schemas.microsoft.com/office/word/2015/wordml/symex" xmlns:wpg="http://schemas.microsoft.com/office/word/2010/wordprocessingGroup" xmlns:wpi="http://schemas.microsoft.com/office/word/2010/wordprocessingInk" xmlns:wne="http://schemas.microsoft.com/office/word/2006/wordml" xmlns:wps="http://schemas.microsoft.com/office/word/2010/wordprocessingShape" mc:Ignorable="w14 w15 w16se w16cid w16 w16cex w16sdtdh wp14">
   <w:endnote w:type="separator" w:id="-1">
     <w:p>
       <w:pPr>
@@ -1663,7 +2683,7 @@
 </file>
 
 <file path=word/footer1.xml><?xml version="1.0" encoding="utf-8"?>
-<w:ftr xmlns:wpc="http://schemas.microsoft.com/office/word/2010/wordprocessingCanvas" xmlns:cx="http://schemas.microsoft.com/office/drawing/2014/chartex" xmlns:cx1="http://schemas.microsoft.com/office/drawing/2015/9/8/chartex" xmlns:cx2="http://schemas.microsoft.com/office/drawing/2015/10/21/chartex" xmlns:cx3="http://schemas.microsoft.com/office/drawing/2016/5/9/chartex" xmlns:cx4="http://schemas.microsoft.com/office/drawing/2016/5/10/chartex" xmlns:cx5="http://schemas.microsoft.com/office/drawing/2016/5/11/chartex" xmlns:cx6="http://schemas.microsoft.com/office/drawing/2016/5/12/chartex" xmlns:cx7="http://schemas.microsoft.com/office/drawing/2016/5/13/chartex" xmlns:cx8="http://schemas.microsoft.com/office/drawing/2016/5/14/chartex" xmlns:mc="http://schemas.openxmlformats.org/markup-compatibility/2006" xmlns:aink="http://schemas.microsoft.com/office/drawing/2016/ink" xmlns:am3d="http://schemas.microsoft.com/office/drawing/2017/model3d" xmlns:o="urn:schemas-microsoft-com:office:office" xmlns:oel="http://schemas.microsoft.com/office/2019/extlst" xmlns:r="http://schemas.openxmlformats.org/officeDocument/2006/relationships" xmlns:m="http://schemas.openxmlformats.org/officeDocument/2006/math" xmlns:v="urn:schemas-microsoft-com:vml" xmlns:wp14="http://schemas.microsoft.com/office/word/2010/wordprocessingDrawing" xmlns:wp="http://schemas.openxmlformats.org/drawingml/2006/wordprocessingDrawing" xmlns:w10="urn:schemas-microsoft-com:office:word" xmlns:w="http://schemas.openxmlformats.org/wordprocessingml/2006/main" xmlns:w14="http://schemas.microsoft.com/office/word/2010/wordml" xmlns:w15="http://schemas.microsoft.com/office/word/2012/wordml" xmlns:w16cex="http://schemas.microsoft.com/office/word/2018/wordml/cex" xmlns:w16cid="http://schemas.microsoft.com/office/word/2016/wordml/cid" xmlns:w16="http://schemas.microsoft.com/office/word/2018/wordml" xmlns:w16du="http://schemas.microsoft.com/office/word/2023/wordml/word16du" xmlns:w16sdtdh="http://schemas.microsoft.com/office/word/2020/wordml/sdtdatahash" xmlns:w16sdtfl="http://schemas.microsoft.com/office/word/2024/wordml/sdtformatlock" xmlns:w16se="http://schemas.microsoft.com/office/word/2015/wordml/symex" xmlns:wpg="http://schemas.microsoft.com/office/word/2010/wordprocessingGroup" xmlns:wpi="http://schemas.microsoft.com/office/word/2010/wordprocessingInk" xmlns:wne="http://schemas.microsoft.com/office/word/2006/wordml" xmlns:wps="http://schemas.microsoft.com/office/word/2010/wordprocessingShape" mc:Ignorable="w14 w15 w16se w16cid w16 w16cex w16sdtdh w16sdtfl w16du wp14">
+<w:ftr xmlns:wpc="http://schemas.microsoft.com/office/word/2010/wordprocessingCanvas" xmlns:cx="http://schemas.microsoft.com/office/drawing/2014/chartex" xmlns:cx1="http://schemas.microsoft.com/office/drawing/2015/9/8/chartex" xmlns:cx2="http://schemas.microsoft.com/office/drawing/2015/10/21/chartex" xmlns:cx3="http://schemas.microsoft.com/office/drawing/2016/5/9/chartex" xmlns:cx4="http://schemas.microsoft.com/office/drawing/2016/5/10/chartex" xmlns:cx5="http://schemas.microsoft.com/office/drawing/2016/5/11/chartex" xmlns:cx6="http://schemas.microsoft.com/office/drawing/2016/5/12/chartex" xmlns:cx7="http://schemas.microsoft.com/office/drawing/2016/5/13/chartex" xmlns:cx8="http://schemas.microsoft.com/office/drawing/2016/5/14/chartex" xmlns:mc="http://schemas.openxmlformats.org/markup-compatibility/2006" xmlns:aink="http://schemas.microsoft.com/office/drawing/2016/ink" xmlns:am3d="http://schemas.microsoft.com/office/drawing/2017/model3d" xmlns:o="urn:schemas-microsoft-com:office:office" xmlns:oel="http://schemas.microsoft.com/office/2019/extlst" xmlns:r="http://schemas.openxmlformats.org/officeDocument/2006/relationships" xmlns:m="http://schemas.openxmlformats.org/officeDocument/2006/math" xmlns:v="urn:schemas-microsoft-com:vml" xmlns:wp14="http://schemas.microsoft.com/office/word/2010/wordprocessingDrawing" xmlns:wp="http://schemas.openxmlformats.org/drawingml/2006/wordprocessingDrawing" xmlns:w10="urn:schemas-microsoft-com:office:word" xmlns:w="http://schemas.openxmlformats.org/wordprocessingml/2006/main" xmlns:w14="http://schemas.microsoft.com/office/word/2010/wordml" xmlns:w15="http://schemas.microsoft.com/office/word/2012/wordml" xmlns:w16cex="http://schemas.microsoft.com/office/word/2018/wordml/cex" xmlns:w16cid="http://schemas.microsoft.com/office/word/2016/wordml/cid" xmlns:w16="http://schemas.microsoft.com/office/word/2018/wordml" xmlns:w16sdtdh="http://schemas.microsoft.com/office/word/2020/wordml/sdtdatahash" xmlns:w16se="http://schemas.microsoft.com/office/word/2015/wordml/symex" xmlns:wpg="http://schemas.microsoft.com/office/word/2010/wordprocessingGroup" xmlns:wpi="http://schemas.microsoft.com/office/word/2010/wordprocessingInk" xmlns:wne="http://schemas.microsoft.com/office/word/2006/wordml" xmlns:wps="http://schemas.microsoft.com/office/word/2010/wordprocessingShape" mc:Ignorable="w14 w15 w16se w16cid w16 w16cex w16sdtdh wp14">
   <w:p>
     <w:pPr>
       <w:pStyle w:val="ae"/>
@@ -1684,7 +2704,7 @@
       <w:rPr>
         <w:rFonts w:eastAsia="Times New Roman" w:cs="Times New Roman"/>
         <w:szCs w:val="28"/>
-        <w:lang w:val="en-US" w:eastAsia="ru-RU"/>
+        <w:lang w:eastAsia="ru-RU"/>
       </w:rPr>
       <w:t>5</w:t>
     </w:r>
@@ -1701,7 +2721,7 @@
 </file>
 
 <file path=word/footnotes.xml><?xml version="1.0" encoding="utf-8"?>
-<w:footnotes xmlns:wpc="http://schemas.microsoft.com/office/word/2010/wordprocessingCanvas" xmlns:cx="http://schemas.microsoft.com/office/drawing/2014/chartex" xmlns:cx1="http://schemas.microsoft.com/office/drawing/2015/9/8/chartex" xmlns:cx2="http://schemas.microsoft.com/office/drawing/2015/10/21/chartex" xmlns:cx3="http://schemas.microsoft.com/office/drawing/2016/5/9/chartex" xmlns:cx4="http://schemas.microsoft.com/office/drawing/2016/5/10/chartex" xmlns:cx5="http://schemas.microsoft.com/office/drawing/2016/5/11/chartex" xmlns:cx6="http://schemas.microsoft.com/office/drawing/2016/5/12/chartex" xmlns:cx7="http://schemas.microsoft.com/office/drawing/2016/5/13/chartex" xmlns:cx8="http://schemas.microsoft.com/office/drawing/2016/5/14/chartex" xmlns:mc="http://schemas.openxmlformats.org/markup-compatibility/2006" xmlns:aink="http://schemas.microsoft.com/office/drawing/2016/ink" xmlns:am3d="http://schemas.microsoft.com/office/drawing/2017/model3d" xmlns:o="urn:schemas-microsoft-com:office:office" xmlns:oel="http://schemas.microsoft.com/office/2019/extlst" xmlns:r="http://schemas.openxmlformats.org/officeDocument/2006/relationships" xmlns:m="http://schemas.openxmlformats.org/officeDocument/2006/math" xmlns:v="urn:schemas-microsoft-com:vml" xmlns:wp14="http://schemas.microsoft.com/office/word/2010/wordprocessingDrawing" xmlns:wp="http://schemas.openxmlformats.org/drawingml/2006/wordprocessingDrawing" xmlns:w10="urn:schemas-microsoft-com:office:word" xmlns:w="http://schemas.openxmlformats.org/wordprocessingml/2006/main" xmlns:w14="http://schemas.microsoft.com/office/word/2010/wordml" xmlns:w15="http://schemas.microsoft.com/office/word/2012/wordml" xmlns:w16cex="http://schemas.microsoft.com/office/word/2018/wordml/cex" xmlns:w16cid="http://schemas.microsoft.com/office/word/2016/wordml/cid" xmlns:w16="http://schemas.microsoft.com/office/word/2018/wordml" xmlns:w16du="http://schemas.microsoft.com/office/word/2023/wordml/word16du" xmlns:w16sdtdh="http://schemas.microsoft.com/office/word/2020/wordml/sdtdatahash" xmlns:w16sdtfl="http://schemas.microsoft.com/office/word/2024/wordml/sdtformatlock" xmlns:w16se="http://schemas.microsoft.com/office/word/2015/wordml/symex" xmlns:wpg="http://schemas.microsoft.com/office/word/2010/wordprocessingGroup" xmlns:wpi="http://schemas.microsoft.com/office/word/2010/wordprocessingInk" xmlns:wne="http://schemas.microsoft.com/office/word/2006/wordml" xmlns:wps="http://schemas.microsoft.com/office/word/2010/wordprocessingShape" mc:Ignorable="w14 w15 w16se w16cid w16 w16cex w16sdtdh w16sdtfl w16du wp14">
+<w:footnotes xmlns:wpc="http://schemas.microsoft.com/office/word/2010/wordprocessingCanvas" xmlns:cx="http://schemas.microsoft.com/office/drawing/2014/chartex" xmlns:cx1="http://schemas.microsoft.com/office/drawing/2015/9/8/chartex" xmlns:cx2="http://schemas.microsoft.com/office/drawing/2015/10/21/chartex" xmlns:cx3="http://schemas.microsoft.com/office/drawing/2016/5/9/chartex" xmlns:cx4="http://schemas.microsoft.com/office/drawing/2016/5/10/chartex" xmlns:cx5="http://schemas.microsoft.com/office/drawing/2016/5/11/chartex" xmlns:cx6="http://schemas.microsoft.com/office/drawing/2016/5/12/chartex" xmlns:cx7="http://schemas.microsoft.com/office/drawing/2016/5/13/chartex" xmlns:cx8="http://schemas.microsoft.com/office/drawing/2016/5/14/chartex" xmlns:mc="http://schemas.openxmlformats.org/markup-compatibility/2006" xmlns:aink="http://schemas.microsoft.com/office/drawing/2016/ink" xmlns:am3d="http://schemas.microsoft.com/office/drawing/2017/model3d" xmlns:o="urn:schemas-microsoft-com:office:office" xmlns:oel="http://schemas.microsoft.com/office/2019/extlst" xmlns:r="http://schemas.openxmlformats.org/officeDocument/2006/relationships" xmlns:m="http://schemas.openxmlformats.org/officeDocument/2006/math" xmlns:v="urn:schemas-microsoft-com:vml" xmlns:wp14="http://schemas.microsoft.com/office/word/2010/wordprocessingDrawing" xmlns:wp="http://schemas.openxmlformats.org/drawingml/2006/wordprocessingDrawing" xmlns:w10="urn:schemas-microsoft-com:office:word" xmlns:w="http://schemas.openxmlformats.org/wordprocessingml/2006/main" xmlns:w14="http://schemas.microsoft.com/office/word/2010/wordml" xmlns:w15="http://schemas.microsoft.com/office/word/2012/wordml" xmlns:w16cex="http://schemas.microsoft.com/office/word/2018/wordml/cex" xmlns:w16cid="http://schemas.microsoft.com/office/word/2016/wordml/cid" xmlns:w16="http://schemas.microsoft.com/office/word/2018/wordml" xmlns:w16sdtdh="http://schemas.microsoft.com/office/word/2020/wordml/sdtdatahash" xmlns:w16se="http://schemas.microsoft.com/office/word/2015/wordml/symex" xmlns:wpg="http://schemas.microsoft.com/office/word/2010/wordprocessingGroup" xmlns:wpi="http://schemas.microsoft.com/office/word/2010/wordprocessingInk" xmlns:wne="http://schemas.microsoft.com/office/word/2006/wordml" xmlns:wps="http://schemas.microsoft.com/office/word/2010/wordprocessingShape" mc:Ignorable="w14 w15 w16se w16cid w16 w16cex w16sdtdh wp14">
   <w:footnote w:type="separator" w:id="-1">
     <w:p>
       <w:pPr>
@@ -1726,7 +2746,7 @@
 </file>
 
 <file path=word/header1.xml><?xml version="1.0" encoding="utf-8"?>
-<w:hdr xmlns:wpc="http://schemas.microsoft.com/office/word/2010/wordprocessingCanvas" xmlns:cx="http://schemas.microsoft.com/office/drawing/2014/chartex" xmlns:cx1="http://schemas.microsoft.com/office/drawing/2015/9/8/chartex" xmlns:cx2="http://schemas.microsoft.com/office/drawing/2015/10/21/chartex" xmlns:cx3="http://schemas.microsoft.com/office/drawing/2016/5/9/chartex" xmlns:cx4="http://schemas.microsoft.com/office/drawing/2016/5/10/chartex" xmlns:cx5="http://schemas.microsoft.com/office/drawing/2016/5/11/chartex" xmlns:cx6="http://schemas.microsoft.com/office/drawing/2016/5/12/chartex" xmlns:cx7="http://schemas.microsoft.com/office/drawing/2016/5/13/chartex" xmlns:cx8="http://schemas.microsoft.com/office/drawing/2016/5/14/chartex" xmlns:mc="http://schemas.openxmlformats.org/markup-compatibility/2006" xmlns:aink="http://schemas.microsoft.com/office/drawing/2016/ink" xmlns:am3d="http://schemas.microsoft.com/office/drawing/2017/model3d" xmlns:o="urn:schemas-microsoft-com:office:office" xmlns:oel="http://schemas.microsoft.com/office/2019/extlst" xmlns:r="http://schemas.openxmlformats.org/officeDocument/2006/relationships" xmlns:m="http://schemas.openxmlformats.org/officeDocument/2006/math" xmlns:v="urn:schemas-microsoft-com:vml" xmlns:wp14="http://schemas.microsoft.com/office/word/2010/wordprocessingDrawing" xmlns:wp="http://schemas.openxmlformats.org/drawingml/2006/wordprocessingDrawing" xmlns:w10="urn:schemas-microsoft-com:office:word" xmlns:w="http://schemas.openxmlformats.org/wordprocessingml/2006/main" xmlns:w14="http://schemas.microsoft.com/office/word/2010/wordml" xmlns:w15="http://schemas.microsoft.com/office/word/2012/wordml" xmlns:w16cex="http://schemas.microsoft.com/office/word/2018/wordml/cex" xmlns:w16cid="http://schemas.microsoft.com/office/word/2016/wordml/cid" xmlns:w16="http://schemas.microsoft.com/office/word/2018/wordml" xmlns:w16du="http://schemas.microsoft.com/office/word/2023/wordml/word16du" xmlns:w16sdtdh="http://schemas.microsoft.com/office/word/2020/wordml/sdtdatahash" xmlns:w16sdtfl="http://schemas.microsoft.com/office/word/2024/wordml/sdtformatlock" xmlns:w16se="http://schemas.microsoft.com/office/word/2015/wordml/symex" xmlns:wpg="http://schemas.microsoft.com/office/word/2010/wordprocessingGroup" xmlns:wpi="http://schemas.microsoft.com/office/word/2010/wordprocessingInk" xmlns:wne="http://schemas.microsoft.com/office/word/2006/wordml" xmlns:wps="http://schemas.microsoft.com/office/word/2010/wordprocessingShape" mc:Ignorable="w14 w15 w16se w16cid w16 w16cex w16sdtdh w16sdtfl w16du wp14">
+<w:hdr xmlns:wpc="http://schemas.microsoft.com/office/word/2010/wordprocessingCanvas" xmlns:cx="http://schemas.microsoft.com/office/drawing/2014/chartex" xmlns:cx1="http://schemas.microsoft.com/office/drawing/2015/9/8/chartex" xmlns:cx2="http://schemas.microsoft.com/office/drawing/2015/10/21/chartex" xmlns:cx3="http://schemas.microsoft.com/office/drawing/2016/5/9/chartex" xmlns:cx4="http://schemas.microsoft.com/office/drawing/2016/5/10/chartex" xmlns:cx5="http://schemas.microsoft.com/office/drawing/2016/5/11/chartex" xmlns:cx6="http://schemas.microsoft.com/office/drawing/2016/5/12/chartex" xmlns:cx7="http://schemas.microsoft.com/office/drawing/2016/5/13/chartex" xmlns:cx8="http://schemas.microsoft.com/office/drawing/2016/5/14/chartex" xmlns:mc="http://schemas.openxmlformats.org/markup-compatibility/2006" xmlns:aink="http://schemas.microsoft.com/office/drawing/2016/ink" xmlns:am3d="http://schemas.microsoft.com/office/drawing/2017/model3d" xmlns:o="urn:schemas-microsoft-com:office:office" xmlns:oel="http://schemas.microsoft.com/office/2019/extlst" xmlns:r="http://schemas.openxmlformats.org/officeDocument/2006/relationships" xmlns:m="http://schemas.openxmlformats.org/officeDocument/2006/math" xmlns:v="urn:schemas-microsoft-com:vml" xmlns:wp14="http://schemas.microsoft.com/office/word/2010/wordprocessingDrawing" xmlns:wp="http://schemas.openxmlformats.org/drawingml/2006/wordprocessingDrawing" xmlns:w10="urn:schemas-microsoft-com:office:word" xmlns:w="http://schemas.openxmlformats.org/wordprocessingml/2006/main" xmlns:w14="http://schemas.microsoft.com/office/word/2010/wordml" xmlns:w15="http://schemas.microsoft.com/office/word/2012/wordml" xmlns:w16cex="http://schemas.microsoft.com/office/word/2018/wordml/cex" xmlns:w16cid="http://schemas.microsoft.com/office/word/2016/wordml/cid" xmlns:w16="http://schemas.microsoft.com/office/word/2018/wordml" xmlns:w16sdtdh="http://schemas.microsoft.com/office/word/2020/wordml/sdtdatahash" xmlns:w16se="http://schemas.microsoft.com/office/word/2015/wordml/symex" xmlns:wpg="http://schemas.microsoft.com/office/word/2010/wordprocessingGroup" xmlns:wpi="http://schemas.microsoft.com/office/word/2010/wordprocessingInk" xmlns:wne="http://schemas.microsoft.com/office/word/2006/wordml" xmlns:wps="http://schemas.microsoft.com/office/word/2010/wordprocessingShape" mc:Ignorable="w14 w15 w16se w16cid w16 w16cex w16sdtdh wp14">
   <w:sdt>
     <w:sdtPr>
       <w:rPr>
@@ -1738,6 +2758,11 @@
         <w:docPartUnique/>
       </w:docPartObj>
     </w:sdtPr>
+    <w:sdtEndPr>
+      <w:rPr>
+        <w:rStyle w:val="af1"/>
+      </w:rPr>
+    </w:sdtEndPr>
     <w:sdtContent>
       <w:p>
         <w:pPr>
@@ -1777,7 +2802,7 @@
 </file>
 
 <file path=word/header2.xml><?xml version="1.0" encoding="utf-8"?>
-<w:hdr xmlns:wpc="http://schemas.microsoft.com/office/word/2010/wordprocessingCanvas" xmlns:cx="http://schemas.microsoft.com/office/drawing/2014/chartex" xmlns:cx1="http://schemas.microsoft.com/office/drawing/2015/9/8/chartex" xmlns:cx2="http://schemas.microsoft.com/office/drawing/2015/10/21/chartex" xmlns:cx3="http://schemas.microsoft.com/office/drawing/2016/5/9/chartex" xmlns:cx4="http://schemas.microsoft.com/office/drawing/2016/5/10/chartex" xmlns:cx5="http://schemas.microsoft.com/office/drawing/2016/5/11/chartex" xmlns:cx6="http://schemas.microsoft.com/office/drawing/2016/5/12/chartex" xmlns:cx7="http://schemas.microsoft.com/office/drawing/2016/5/13/chartex" xmlns:cx8="http://schemas.microsoft.com/office/drawing/2016/5/14/chartex" xmlns:mc="http://schemas.openxmlformats.org/markup-compatibility/2006" xmlns:aink="http://schemas.microsoft.com/office/drawing/2016/ink" xmlns:am3d="http://schemas.microsoft.com/office/drawing/2017/model3d" xmlns:o="urn:schemas-microsoft-com:office:office" xmlns:oel="http://schemas.microsoft.com/office/2019/extlst" xmlns:r="http://schemas.openxmlformats.org/officeDocument/2006/relationships" xmlns:m="http://schemas.openxmlformats.org/officeDocument/2006/math" xmlns:v="urn:schemas-microsoft-com:vml" xmlns:wp14="http://schemas.microsoft.com/office/word/2010/wordprocessingDrawing" xmlns:wp="http://schemas.openxmlformats.org/drawingml/2006/wordprocessingDrawing" xmlns:w10="urn:schemas-microsoft-com:office:word" xmlns:w="http://schemas.openxmlformats.org/wordprocessingml/2006/main" xmlns:w14="http://schemas.microsoft.com/office/word/2010/wordml" xmlns:w15="http://schemas.microsoft.com/office/word/2012/wordml" xmlns:w16cex="http://schemas.microsoft.com/office/word/2018/wordml/cex" xmlns:w16cid="http://schemas.microsoft.com/office/word/2016/wordml/cid" xmlns:w16="http://schemas.microsoft.com/office/word/2018/wordml" xmlns:w16du="http://schemas.microsoft.com/office/word/2023/wordml/word16du" xmlns:w16sdtdh="http://schemas.microsoft.com/office/word/2020/wordml/sdtdatahash" xmlns:w16sdtfl="http://schemas.microsoft.com/office/word/2024/wordml/sdtformatlock" xmlns:w16se="http://schemas.microsoft.com/office/word/2015/wordml/symex" xmlns:wpg="http://schemas.microsoft.com/office/word/2010/wordprocessingGroup" xmlns:wpi="http://schemas.microsoft.com/office/word/2010/wordprocessingInk" xmlns:wne="http://schemas.microsoft.com/office/word/2006/wordml" xmlns:wps="http://schemas.microsoft.com/office/word/2010/wordprocessingShape" mc:Ignorable="w14 w15 w16se w16cid w16 w16cex w16sdtdh w16sdtfl w16du wp14">
+<w:hdr xmlns:wpc="http://schemas.microsoft.com/office/word/2010/wordprocessingCanvas" xmlns:cx="http://schemas.microsoft.com/office/drawing/2014/chartex" xmlns:cx1="http://schemas.microsoft.com/office/drawing/2015/9/8/chartex" xmlns:cx2="http://schemas.microsoft.com/office/drawing/2015/10/21/chartex" xmlns:cx3="http://schemas.microsoft.com/office/drawing/2016/5/9/chartex" xmlns:cx4="http://schemas.microsoft.com/office/drawing/2016/5/10/chartex" xmlns:cx5="http://schemas.microsoft.com/office/drawing/2016/5/11/chartex" xmlns:cx6="http://schemas.microsoft.com/office/drawing/2016/5/12/chartex" xmlns:cx7="http://schemas.microsoft.com/office/drawing/2016/5/13/chartex" xmlns:cx8="http://schemas.microsoft.com/office/drawing/2016/5/14/chartex" xmlns:mc="http://schemas.openxmlformats.org/markup-compatibility/2006" xmlns:aink="http://schemas.microsoft.com/office/drawing/2016/ink" xmlns:am3d="http://schemas.microsoft.com/office/drawing/2017/model3d" xmlns:o="urn:schemas-microsoft-com:office:office" xmlns:oel="http://schemas.microsoft.com/office/2019/extlst" xmlns:r="http://schemas.openxmlformats.org/officeDocument/2006/relationships" xmlns:m="http://schemas.openxmlformats.org/officeDocument/2006/math" xmlns:v="urn:schemas-microsoft-com:vml" xmlns:wp14="http://schemas.microsoft.com/office/word/2010/wordprocessingDrawing" xmlns:wp="http://schemas.openxmlformats.org/drawingml/2006/wordprocessingDrawing" xmlns:w10="urn:schemas-microsoft-com:office:word" xmlns:w="http://schemas.openxmlformats.org/wordprocessingml/2006/main" xmlns:w14="http://schemas.microsoft.com/office/word/2010/wordml" xmlns:w15="http://schemas.microsoft.com/office/word/2012/wordml" xmlns:w16cex="http://schemas.microsoft.com/office/word/2018/wordml/cex" xmlns:w16cid="http://schemas.microsoft.com/office/word/2016/wordml/cid" xmlns:w16="http://schemas.microsoft.com/office/word/2018/wordml" xmlns:w16sdtdh="http://schemas.microsoft.com/office/word/2020/wordml/sdtdatahash" xmlns:w16se="http://schemas.microsoft.com/office/word/2015/wordml/symex" xmlns:wpg="http://schemas.microsoft.com/office/word/2010/wordprocessingGroup" xmlns:wpi="http://schemas.microsoft.com/office/word/2010/wordprocessingInk" xmlns:wne="http://schemas.microsoft.com/office/word/2006/wordml" xmlns:wps="http://schemas.microsoft.com/office/word/2010/wordprocessingShape" mc:Ignorable="w14 w15 w16se w16cid w16 w16cex w16sdtdh wp14">
   <w:sdt>
     <w:sdtPr>
       <w:rPr>
@@ -1789,6 +2814,11 @@
         <w:docPartUnique/>
       </w:docPartObj>
     </w:sdtPr>
+    <w:sdtEndPr>
+      <w:rPr>
+        <w:rStyle w:val="af1"/>
+      </w:rPr>
+    </w:sdtEndPr>
     <w:sdtContent>
       <w:p>
         <w:pPr>
@@ -1841,7 +2871,7 @@
 </file>
 
 <file path=word/header3.xml><?xml version="1.0" encoding="utf-8"?>
-<w:hdr xmlns:wpc="http://schemas.microsoft.com/office/word/2010/wordprocessingCanvas" xmlns:cx="http://schemas.microsoft.com/office/drawing/2014/chartex" xmlns:cx1="http://schemas.microsoft.com/office/drawing/2015/9/8/chartex" xmlns:cx2="http://schemas.microsoft.com/office/drawing/2015/10/21/chartex" xmlns:cx3="http://schemas.microsoft.com/office/drawing/2016/5/9/chartex" xmlns:cx4="http://schemas.microsoft.com/office/drawing/2016/5/10/chartex" xmlns:cx5="http://schemas.microsoft.com/office/drawing/2016/5/11/chartex" xmlns:cx6="http://schemas.microsoft.com/office/drawing/2016/5/12/chartex" xmlns:cx7="http://schemas.microsoft.com/office/drawing/2016/5/13/chartex" xmlns:cx8="http://schemas.microsoft.com/office/drawing/2016/5/14/chartex" xmlns:mc="http://schemas.openxmlformats.org/markup-compatibility/2006" xmlns:aink="http://schemas.microsoft.com/office/drawing/2016/ink" xmlns:am3d="http://schemas.microsoft.com/office/drawing/2017/model3d" xmlns:o="urn:schemas-microsoft-com:office:office" xmlns:oel="http://schemas.microsoft.com/office/2019/extlst" xmlns:r="http://schemas.openxmlformats.org/officeDocument/2006/relationships" xmlns:m="http://schemas.openxmlformats.org/officeDocument/2006/math" xmlns:v="urn:schemas-microsoft-com:vml" xmlns:wp14="http://schemas.microsoft.com/office/word/2010/wordprocessingDrawing" xmlns:wp="http://schemas.openxmlformats.org/drawingml/2006/wordprocessingDrawing" xmlns:w10="urn:schemas-microsoft-com:office:word" xmlns:w="http://schemas.openxmlformats.org/wordprocessingml/2006/main" xmlns:w14="http://schemas.microsoft.com/office/word/2010/wordml" xmlns:w15="http://schemas.microsoft.com/office/word/2012/wordml" xmlns:w16cex="http://schemas.microsoft.com/office/word/2018/wordml/cex" xmlns:w16cid="http://schemas.microsoft.com/office/word/2016/wordml/cid" xmlns:w16="http://schemas.microsoft.com/office/word/2018/wordml" xmlns:w16du="http://schemas.microsoft.com/office/word/2023/wordml/word16du" xmlns:w16sdtdh="http://schemas.microsoft.com/office/word/2020/wordml/sdtdatahash" xmlns:w16sdtfl="http://schemas.microsoft.com/office/word/2024/wordml/sdtformatlock" xmlns:w16se="http://schemas.microsoft.com/office/word/2015/wordml/symex" xmlns:wpg="http://schemas.microsoft.com/office/word/2010/wordprocessingGroup" xmlns:wpi="http://schemas.microsoft.com/office/word/2010/wordprocessingInk" xmlns:wne="http://schemas.microsoft.com/office/word/2006/wordml" xmlns:wps="http://schemas.microsoft.com/office/word/2010/wordprocessingShape" mc:Ignorable="w14 w15 w16se w16cid w16 w16cex w16sdtdh w16sdtfl w16du wp14">
+<w:hdr xmlns:wpc="http://schemas.microsoft.com/office/word/2010/wordprocessingCanvas" xmlns:cx="http://schemas.microsoft.com/office/drawing/2014/chartex" xmlns:cx1="http://schemas.microsoft.com/office/drawing/2015/9/8/chartex" xmlns:cx2="http://schemas.microsoft.com/office/drawing/2015/10/21/chartex" xmlns:cx3="http://schemas.microsoft.com/office/drawing/2016/5/9/chartex" xmlns:cx4="http://schemas.microsoft.com/office/drawing/2016/5/10/chartex" xmlns:cx5="http://schemas.microsoft.com/office/drawing/2016/5/11/chartex" xmlns:cx6="http://schemas.microsoft.com/office/drawing/2016/5/12/chartex" xmlns:cx7="http://schemas.microsoft.com/office/drawing/2016/5/13/chartex" xmlns:cx8="http://schemas.microsoft.com/office/drawing/2016/5/14/chartex" xmlns:mc="http://schemas.openxmlformats.org/markup-compatibility/2006" xmlns:aink="http://schemas.microsoft.com/office/drawing/2016/ink" xmlns:am3d="http://schemas.microsoft.com/office/drawing/2017/model3d" xmlns:o="urn:schemas-microsoft-com:office:office" xmlns:oel="http://schemas.microsoft.com/office/2019/extlst" xmlns:r="http://schemas.openxmlformats.org/officeDocument/2006/relationships" xmlns:m="http://schemas.openxmlformats.org/officeDocument/2006/math" xmlns:v="urn:schemas-microsoft-com:vml" xmlns:wp14="http://schemas.microsoft.com/office/word/2010/wordprocessingDrawing" xmlns:wp="http://schemas.openxmlformats.org/drawingml/2006/wordprocessingDrawing" xmlns:w10="urn:schemas-microsoft-com:office:word" xmlns:w="http://schemas.openxmlformats.org/wordprocessingml/2006/main" xmlns:w14="http://schemas.microsoft.com/office/word/2010/wordml" xmlns:w15="http://schemas.microsoft.com/office/word/2012/wordml" xmlns:w16cex="http://schemas.microsoft.com/office/word/2018/wordml/cex" xmlns:w16cid="http://schemas.microsoft.com/office/word/2016/wordml/cid" xmlns:w16="http://schemas.microsoft.com/office/word/2018/wordml" xmlns:w16sdtdh="http://schemas.microsoft.com/office/word/2020/wordml/sdtdatahash" xmlns:w16se="http://schemas.microsoft.com/office/word/2015/wordml/symex" xmlns:wpg="http://schemas.microsoft.com/office/word/2010/wordprocessingGroup" xmlns:wpi="http://schemas.microsoft.com/office/word/2010/wordprocessingInk" xmlns:wne="http://schemas.microsoft.com/office/word/2006/wordml" xmlns:wps="http://schemas.microsoft.com/office/word/2010/wordprocessingShape" mc:Ignorable="w14 w15 w16se w16cid w16 w16cex w16sdtdh wp14">
   <w:p>
     <w:pPr>
       <w:spacing w:line="240" w:lineRule="auto"/>
@@ -1849,11 +2879,13 @@
       <w:jc w:val="center"/>
       <w:rPr>
         <w:rFonts w:cs="Times New Roman"/>
+        <w:lang w:val="ru-RU"/>
       </w:rPr>
     </w:pPr>
     <w:r>
       <w:rPr>
         <w:rFonts w:cs="Times New Roman"/>
+        <w:lang w:val="ru-RU"/>
       </w:rPr>
       <w:t>МИНОБРНАУКИ</w:t>
     </w:r>
@@ -1861,12 +2893,14 @@
       <w:rPr>
         <w:rFonts w:cs="Times New Roman"/>
         <w:spacing w:val="-5"/>
+        <w:lang w:val="ru-RU"/>
       </w:rPr>
       <w:t xml:space="preserve"> </w:t>
     </w:r>
     <w:r>
       <w:rPr>
         <w:rFonts w:cs="Times New Roman"/>
+        <w:lang w:val="ru-RU"/>
       </w:rPr>
       <w:t>РОССИИ</w:t>
     </w:r>
@@ -1878,11 +2912,13 @@
       <w:jc w:val="center"/>
       <w:rPr>
         <w:rFonts w:cs="Times New Roman"/>
+        <w:lang w:val="ru-RU"/>
       </w:rPr>
     </w:pPr>
     <w:r>
       <w:rPr>
         <w:rFonts w:cs="Times New Roman"/>
+        <w:lang w:val="ru-RU"/>
       </w:rPr>
       <w:t>Федеральное государственное бюджетное образовательное учреждение</w:t>
     </w:r>
@@ -1890,12 +2926,14 @@
       <w:rPr>
         <w:rFonts w:cs="Times New Roman"/>
         <w:spacing w:val="-67"/>
+        <w:lang w:val="ru-RU"/>
       </w:rPr>
       <w:t xml:space="preserve"> </w:t>
     </w:r>
     <w:r>
       <w:rPr>
         <w:rFonts w:cs="Times New Roman"/>
+        <w:lang w:val="ru-RU"/>
       </w:rPr>
       <w:t>высшего</w:t>
     </w:r>
@@ -1903,12 +2941,14 @@
       <w:rPr>
         <w:rFonts w:cs="Times New Roman"/>
         <w:spacing w:val="-1"/>
+        <w:lang w:val="ru-RU"/>
       </w:rPr>
       <w:t xml:space="preserve"> </w:t>
     </w:r>
     <w:r>
       <w:rPr>
         <w:rFonts w:cs="Times New Roman"/>
+        <w:lang w:val="ru-RU"/>
       </w:rPr>
       <w:t>профессионального</w:t>
     </w:r>
@@ -1916,12 +2956,14 @@
       <w:rPr>
         <w:rFonts w:cs="Times New Roman"/>
         <w:spacing w:val="1"/>
+        <w:lang w:val="ru-RU"/>
       </w:rPr>
       <w:t xml:space="preserve"> </w:t>
     </w:r>
     <w:r>
       <w:rPr>
         <w:rFonts w:cs="Times New Roman"/>
+        <w:lang w:val="ru-RU"/>
       </w:rPr>
       <w:t>образования</w:t>
     </w:r>
@@ -1973,7 +3015,7 @@
 </file>
 
 <file path=word/numbering.xml><?xml version="1.0" encoding="utf-8"?>
-<w:numbering xmlns:wpc="http://schemas.microsoft.com/office/word/2010/wordprocessingCanvas" xmlns:cx="http://schemas.microsoft.com/office/drawing/2014/chartex" xmlns:cx1="http://schemas.microsoft.com/office/drawing/2015/9/8/chartex" xmlns:cx2="http://schemas.microsoft.com/office/drawing/2015/10/21/chartex" xmlns:cx3="http://schemas.microsoft.com/office/drawing/2016/5/9/chartex" xmlns:cx4="http://schemas.microsoft.com/office/drawing/2016/5/10/chartex" xmlns:cx5="http://schemas.microsoft.com/office/drawing/2016/5/11/chartex" xmlns:cx6="http://schemas.microsoft.com/office/drawing/2016/5/12/chartex" xmlns:cx7="http://schemas.microsoft.com/office/drawing/2016/5/13/chartex" xmlns:cx8="http://schemas.microsoft.com/office/drawing/2016/5/14/chartex" xmlns:mc="http://schemas.openxmlformats.org/markup-compatibility/2006" xmlns:aink="http://schemas.microsoft.com/office/drawing/2016/ink" xmlns:am3d="http://schemas.microsoft.com/office/drawing/2017/model3d" xmlns:o="urn:schemas-microsoft-com:office:office" xmlns:oel="http://schemas.microsoft.com/office/2019/extlst" xmlns:r="http://schemas.openxmlformats.org/officeDocument/2006/relationships" xmlns:m="http://schemas.openxmlformats.org/officeDocument/2006/math" xmlns:v="urn:schemas-microsoft-com:vml" xmlns:wp14="http://schemas.microsoft.com/office/word/2010/wordprocessingDrawing" xmlns:wp="http://schemas.openxmlformats.org/drawingml/2006/wordprocessingDrawing" xmlns:w10="urn:schemas-microsoft-com:office:word" xmlns:w="http://schemas.openxmlformats.org/wordprocessingml/2006/main" xmlns:w14="http://schemas.microsoft.com/office/word/2010/wordml" xmlns:w15="http://schemas.microsoft.com/office/word/2012/wordml" xmlns:w16cex="http://schemas.microsoft.com/office/word/2018/wordml/cex" xmlns:w16cid="http://schemas.microsoft.com/office/word/2016/wordml/cid" xmlns:w16="http://schemas.microsoft.com/office/word/2018/wordml" xmlns:w16du="http://schemas.microsoft.com/office/word/2023/wordml/word16du" xmlns:w16sdtdh="http://schemas.microsoft.com/office/word/2020/wordml/sdtdatahash" xmlns:w16sdtfl="http://schemas.microsoft.com/office/word/2024/wordml/sdtformatlock" xmlns:w16se="http://schemas.microsoft.com/office/word/2015/wordml/symex" xmlns:wpg="http://schemas.microsoft.com/office/word/2010/wordprocessingGroup" xmlns:wpi="http://schemas.microsoft.com/office/word/2010/wordprocessingInk" xmlns:wne="http://schemas.microsoft.com/office/word/2006/wordml" xmlns:wps="http://schemas.microsoft.com/office/word/2010/wordprocessingShape" mc:Ignorable="w14 w15 w16se w16cid w16 w16cex w16sdtdh w16sdtfl w16du wp14">
+<w:numbering xmlns:wpc="http://schemas.microsoft.com/office/word/2010/wordprocessingCanvas" xmlns:cx="http://schemas.microsoft.com/office/drawing/2014/chartex" xmlns:cx1="http://schemas.microsoft.com/office/drawing/2015/9/8/chartex" xmlns:cx2="http://schemas.microsoft.com/office/drawing/2015/10/21/chartex" xmlns:cx3="http://schemas.microsoft.com/office/drawing/2016/5/9/chartex" xmlns:cx4="http://schemas.microsoft.com/office/drawing/2016/5/10/chartex" xmlns:cx5="http://schemas.microsoft.com/office/drawing/2016/5/11/chartex" xmlns:cx6="http://schemas.microsoft.com/office/drawing/2016/5/12/chartex" xmlns:cx7="http://schemas.microsoft.com/office/drawing/2016/5/13/chartex" xmlns:cx8="http://schemas.microsoft.com/office/drawing/2016/5/14/chartex" xmlns:mc="http://schemas.openxmlformats.org/markup-compatibility/2006" xmlns:aink="http://schemas.microsoft.com/office/drawing/2016/ink" xmlns:am3d="http://schemas.microsoft.com/office/drawing/2017/model3d" xmlns:o="urn:schemas-microsoft-com:office:office" xmlns:oel="http://schemas.microsoft.com/office/2019/extlst" xmlns:r="http://schemas.openxmlformats.org/officeDocument/2006/relationships" xmlns:m="http://schemas.openxmlformats.org/officeDocument/2006/math" xmlns:v="urn:schemas-microsoft-com:vml" xmlns:wp14="http://schemas.microsoft.com/office/word/2010/wordprocessingDrawing" xmlns:wp="http://schemas.openxmlformats.org/drawingml/2006/wordprocessingDrawing" xmlns:w10="urn:schemas-microsoft-com:office:word" xmlns:w="http://schemas.openxmlformats.org/wordprocessingml/2006/main" xmlns:w14="http://schemas.microsoft.com/office/word/2010/wordml" xmlns:w15="http://schemas.microsoft.com/office/word/2012/wordml" xmlns:w16cex="http://schemas.microsoft.com/office/word/2018/wordml/cex" xmlns:w16cid="http://schemas.microsoft.com/office/word/2016/wordml/cid" xmlns:w16="http://schemas.microsoft.com/office/word/2018/wordml" xmlns:w16sdtdh="http://schemas.microsoft.com/office/word/2020/wordml/sdtdatahash" xmlns:w16se="http://schemas.microsoft.com/office/word/2015/wordml/symex" xmlns:wpg="http://schemas.microsoft.com/office/word/2010/wordprocessingGroup" xmlns:wpi="http://schemas.microsoft.com/office/word/2010/wordprocessingInk" xmlns:wne="http://schemas.microsoft.com/office/word/2006/wordml" xmlns:wps="http://schemas.microsoft.com/office/word/2010/wordprocessingShape" mc:Ignorable="w14 w15 w16se w16cid w16 w16cex w16sdtdh wp14">
   <w:abstractNum w:abstractNumId="0" w15:restartNumberingAfterBreak="0">
     <w:nsid w:val="007B1D9F"/>
     <w:multiLevelType w:val="hybridMultilevel"/>
@@ -2061,6 +3103,119 @@
     </w:lvl>
   </w:abstractNum>
   <w:abstractNum w:abstractNumId="1" w15:restartNumberingAfterBreak="0">
+    <w:nsid w:val="0C2D5026"/>
+    <w:multiLevelType w:val="hybridMultilevel"/>
+    <w:tmpl w:val="189A0AAA"/>
+    <w:lvl w:ilvl="0" w:tplc="04090001">
+      <w:start w:val="1"/>
+      <w:numFmt w:val="bullet"/>
+      <w:lvlText w:val=""/>
+      <w:lvlJc w:val="left"/>
+      <w:pPr>
+        <w:ind w:left="1145" w:hanging="360"/>
+      </w:pPr>
+      <w:rPr>
+        <w:rFonts w:ascii="Symbol" w:hAnsi="Symbol" w:hint="default"/>
+      </w:rPr>
+    </w:lvl>
+    <w:lvl w:ilvl="1" w:tplc="04090003" w:tentative="1">
+      <w:start w:val="1"/>
+      <w:numFmt w:val="bullet"/>
+      <w:lvlText w:val="o"/>
+      <w:lvlJc w:val="left"/>
+      <w:pPr>
+        <w:ind w:left="1865" w:hanging="360"/>
+      </w:pPr>
+      <w:rPr>
+        <w:rFonts w:ascii="Courier New" w:hAnsi="Courier New" w:cs="Courier New" w:hint="default"/>
+      </w:rPr>
+    </w:lvl>
+    <w:lvl w:ilvl="2" w:tplc="04090005" w:tentative="1">
+      <w:start w:val="1"/>
+      <w:numFmt w:val="bullet"/>
+      <w:lvlText w:val=""/>
+      <w:lvlJc w:val="left"/>
+      <w:pPr>
+        <w:ind w:left="2585" w:hanging="360"/>
+      </w:pPr>
+      <w:rPr>
+        <w:rFonts w:ascii="Wingdings" w:hAnsi="Wingdings" w:hint="default"/>
+      </w:rPr>
+    </w:lvl>
+    <w:lvl w:ilvl="3" w:tplc="04090001" w:tentative="1">
+      <w:start w:val="1"/>
+      <w:numFmt w:val="bullet"/>
+      <w:lvlText w:val=""/>
+      <w:lvlJc w:val="left"/>
+      <w:pPr>
+        <w:ind w:left="3305" w:hanging="360"/>
+      </w:pPr>
+      <w:rPr>
+        <w:rFonts w:ascii="Symbol" w:hAnsi="Symbol" w:hint="default"/>
+      </w:rPr>
+    </w:lvl>
+    <w:lvl w:ilvl="4" w:tplc="04090003" w:tentative="1">
+      <w:start w:val="1"/>
+      <w:numFmt w:val="bullet"/>
+      <w:lvlText w:val="o"/>
+      <w:lvlJc w:val="left"/>
+      <w:pPr>
+        <w:ind w:left="4025" w:hanging="360"/>
+      </w:pPr>
+      <w:rPr>
+        <w:rFonts w:ascii="Courier New" w:hAnsi="Courier New" w:cs="Courier New" w:hint="default"/>
+      </w:rPr>
+    </w:lvl>
+    <w:lvl w:ilvl="5" w:tplc="04090005" w:tentative="1">
+      <w:start w:val="1"/>
+      <w:numFmt w:val="bullet"/>
+      <w:lvlText w:val=""/>
+      <w:lvlJc w:val="left"/>
+      <w:pPr>
+        <w:ind w:left="4745" w:hanging="360"/>
+      </w:pPr>
+      <w:rPr>
+        <w:rFonts w:ascii="Wingdings" w:hAnsi="Wingdings" w:hint="default"/>
+      </w:rPr>
+    </w:lvl>
+    <w:lvl w:ilvl="6" w:tplc="04090001" w:tentative="1">
+      <w:start w:val="1"/>
+      <w:numFmt w:val="bullet"/>
+      <w:lvlText w:val=""/>
+      <w:lvlJc w:val="left"/>
+      <w:pPr>
+        <w:ind w:left="5465" w:hanging="360"/>
+      </w:pPr>
+      <w:rPr>
+        <w:rFonts w:ascii="Symbol" w:hAnsi="Symbol" w:hint="default"/>
+      </w:rPr>
+    </w:lvl>
+    <w:lvl w:ilvl="7" w:tplc="04090003" w:tentative="1">
+      <w:start w:val="1"/>
+      <w:numFmt w:val="bullet"/>
+      <w:lvlText w:val="o"/>
+      <w:lvlJc w:val="left"/>
+      <w:pPr>
+        <w:ind w:left="6185" w:hanging="360"/>
+      </w:pPr>
+      <w:rPr>
+        <w:rFonts w:ascii="Courier New" w:hAnsi="Courier New" w:cs="Courier New" w:hint="default"/>
+      </w:rPr>
+    </w:lvl>
+    <w:lvl w:ilvl="8" w:tplc="04090005" w:tentative="1">
+      <w:start w:val="1"/>
+      <w:numFmt w:val="bullet"/>
+      <w:lvlText w:val=""/>
+      <w:lvlJc w:val="left"/>
+      <w:pPr>
+        <w:ind w:left="6905" w:hanging="360"/>
+      </w:pPr>
+      <w:rPr>
+        <w:rFonts w:ascii="Wingdings" w:hAnsi="Wingdings" w:hint="default"/>
+      </w:rPr>
+    </w:lvl>
+  </w:abstractNum>
+  <w:abstractNum w:abstractNumId="2" w15:restartNumberingAfterBreak="0">
     <w:nsid w:val="0CB0645D"/>
     <w:multiLevelType w:val="hybridMultilevel"/>
     <w:tmpl w:val="AF421010"/>
@@ -2149,7 +3304,7 @@
       </w:pPr>
     </w:lvl>
   </w:abstractNum>
-  <w:abstractNum w:abstractNumId="2" w15:restartNumberingAfterBreak="0">
+  <w:abstractNum w:abstractNumId="3" w15:restartNumberingAfterBreak="0">
     <w:nsid w:val="0DBB6FE0"/>
     <w:multiLevelType w:val="hybridMultilevel"/>
     <w:tmpl w:val="674C5DBC"/>
@@ -2235,7 +3390,7 @@
       </w:pPr>
     </w:lvl>
   </w:abstractNum>
-  <w:abstractNum w:abstractNumId="3" w15:restartNumberingAfterBreak="0">
+  <w:abstractNum w:abstractNumId="4" w15:restartNumberingAfterBreak="0">
     <w:nsid w:val="0DCC7243"/>
     <w:multiLevelType w:val="hybridMultilevel"/>
     <w:tmpl w:val="6600A42A"/>
@@ -2321,7 +3476,7 @@
       </w:pPr>
     </w:lvl>
   </w:abstractNum>
-  <w:abstractNum w:abstractNumId="4" w15:restartNumberingAfterBreak="0">
+  <w:abstractNum w:abstractNumId="5" w15:restartNumberingAfterBreak="0">
     <w:nsid w:val="0E091386"/>
     <w:multiLevelType w:val="hybridMultilevel"/>
     <w:tmpl w:val="21A630BE"/>
@@ -2407,7 +3562,7 @@
       </w:pPr>
     </w:lvl>
   </w:abstractNum>
-  <w:abstractNum w:abstractNumId="5" w15:restartNumberingAfterBreak="0">
+  <w:abstractNum w:abstractNumId="6" w15:restartNumberingAfterBreak="0">
     <w:nsid w:val="0EEC2F43"/>
     <w:multiLevelType w:val="hybridMultilevel"/>
     <w:tmpl w:val="8EDAC4E0"/>
@@ -2493,7 +3648,7 @@
       </w:pPr>
     </w:lvl>
   </w:abstractNum>
-  <w:abstractNum w:abstractNumId="6" w15:restartNumberingAfterBreak="0">
+  <w:abstractNum w:abstractNumId="7" w15:restartNumberingAfterBreak="0">
     <w:nsid w:val="33BB5BC5"/>
     <w:multiLevelType w:val="hybridMultilevel"/>
     <w:tmpl w:val="AF142BDA"/>
@@ -2606,7 +3761,7 @@
       </w:rPr>
     </w:lvl>
   </w:abstractNum>
-  <w:abstractNum w:abstractNumId="7" w15:restartNumberingAfterBreak="0">
+  <w:abstractNum w:abstractNumId="8" w15:restartNumberingAfterBreak="0">
     <w:nsid w:val="365F0BD8"/>
     <w:multiLevelType w:val="hybridMultilevel"/>
     <w:tmpl w:val="3EFEDF4E"/>
@@ -2692,7 +3847,7 @@
       </w:pPr>
     </w:lvl>
   </w:abstractNum>
-  <w:abstractNum w:abstractNumId="8" w15:restartNumberingAfterBreak="0">
+  <w:abstractNum w:abstractNumId="9" w15:restartNumberingAfterBreak="0">
     <w:nsid w:val="495A4B55"/>
     <w:multiLevelType w:val="hybridMultilevel"/>
     <w:tmpl w:val="5D3C45EE"/>
@@ -2778,7 +3933,7 @@
       </w:pPr>
     </w:lvl>
   </w:abstractNum>
-  <w:abstractNum w:abstractNumId="9" w15:restartNumberingAfterBreak="0">
+  <w:abstractNum w:abstractNumId="10" w15:restartNumberingAfterBreak="0">
     <w:nsid w:val="4A5E3F41"/>
     <w:multiLevelType w:val="hybridMultilevel"/>
     <w:tmpl w:val="E6362F96"/>
@@ -2864,7 +4019,7 @@
       </w:pPr>
     </w:lvl>
   </w:abstractNum>
-  <w:abstractNum w:abstractNumId="10" w15:restartNumberingAfterBreak="0">
+  <w:abstractNum w:abstractNumId="11" w15:restartNumberingAfterBreak="0">
     <w:nsid w:val="602711F1"/>
     <w:multiLevelType w:val="hybridMultilevel"/>
     <w:tmpl w:val="419C824C"/>
@@ -2977,7 +4132,7 @@
       </w:rPr>
     </w:lvl>
   </w:abstractNum>
-  <w:abstractNum w:abstractNumId="11" w15:restartNumberingAfterBreak="0">
+  <w:abstractNum w:abstractNumId="12" w15:restartNumberingAfterBreak="0">
     <w:nsid w:val="6762654E"/>
     <w:multiLevelType w:val="hybridMultilevel"/>
     <w:tmpl w:val="793EC6A2"/>
@@ -3063,7 +4218,7 @@
       </w:pPr>
     </w:lvl>
   </w:abstractNum>
-  <w:abstractNum w:abstractNumId="12" w15:restartNumberingAfterBreak="0">
+  <w:abstractNum w:abstractNumId="13" w15:restartNumberingAfterBreak="0">
     <w:nsid w:val="676B44D3"/>
     <w:multiLevelType w:val="hybridMultilevel"/>
     <w:tmpl w:val="2B0A6368"/>
@@ -3149,7 +4304,7 @@
       </w:pPr>
     </w:lvl>
   </w:abstractNum>
-  <w:abstractNum w:abstractNumId="13" w15:restartNumberingAfterBreak="0">
+  <w:abstractNum w:abstractNumId="14" w15:restartNumberingAfterBreak="0">
     <w:nsid w:val="6ABF7B7A"/>
     <w:multiLevelType w:val="hybridMultilevel"/>
     <w:tmpl w:val="A6C43B9C"/>
@@ -3235,7 +4390,7 @@
       </w:pPr>
     </w:lvl>
   </w:abstractNum>
-  <w:abstractNum w:abstractNumId="14" w15:restartNumberingAfterBreak="0">
+  <w:abstractNum w:abstractNumId="15" w15:restartNumberingAfterBreak="0">
     <w:nsid w:val="6EB7273F"/>
     <w:multiLevelType w:val="hybridMultilevel"/>
     <w:tmpl w:val="9C6C6662"/>
@@ -3348,7 +4503,7 @@
       </w:rPr>
     </w:lvl>
   </w:abstractNum>
-  <w:abstractNum w:abstractNumId="15" w15:restartNumberingAfterBreak="0">
+  <w:abstractNum w:abstractNumId="16" w15:restartNumberingAfterBreak="0">
     <w:nsid w:val="72A147EC"/>
     <w:multiLevelType w:val="hybridMultilevel"/>
     <w:tmpl w:val="CF6E5AE2"/>
@@ -3461,7 +4616,7 @@
       </w:rPr>
     </w:lvl>
   </w:abstractNum>
-  <w:abstractNum w:abstractNumId="16" w15:restartNumberingAfterBreak="0">
+  <w:abstractNum w:abstractNumId="17" w15:restartNumberingAfterBreak="0">
     <w:nsid w:val="7A4D376A"/>
     <w:multiLevelType w:val="hybridMultilevel"/>
     <w:tmpl w:val="23B8BCC0"/>
@@ -3574,7 +4729,7 @@
       </w:rPr>
     </w:lvl>
   </w:abstractNum>
-  <w:abstractNum w:abstractNumId="17" w15:restartNumberingAfterBreak="0">
+  <w:abstractNum w:abstractNumId="18" w15:restartNumberingAfterBreak="0">
     <w:nsid w:val="7BAD6DD1"/>
     <w:multiLevelType w:val="hybridMultilevel"/>
     <w:tmpl w:val="52D411E0"/>
@@ -3688,64 +4843,67 @@
     </w:lvl>
   </w:abstractNum>
   <w:num w:numId="1" w16cid:durableId="720707839">
+    <w:abstractNumId w:val="5"/>
+  </w:num>
+  <w:num w:numId="2" w16cid:durableId="276641792">
     <w:abstractNumId w:val="4"/>
   </w:num>
-  <w:num w:numId="2" w16cid:durableId="276641792">
-    <w:abstractNumId w:val="3"/>
-  </w:num>
   <w:num w:numId="3" w16cid:durableId="423838510">
-    <w:abstractNumId w:val="5"/>
+    <w:abstractNumId w:val="6"/>
   </w:num>
   <w:num w:numId="4" w16cid:durableId="982395125">
-    <w:abstractNumId w:val="12"/>
+    <w:abstractNumId w:val="13"/>
   </w:num>
   <w:num w:numId="5" w16cid:durableId="569652063">
-    <w:abstractNumId w:val="17"/>
+    <w:abstractNumId w:val="18"/>
   </w:num>
   <w:num w:numId="6" w16cid:durableId="285238671">
-    <w:abstractNumId w:val="15"/>
+    <w:abstractNumId w:val="16"/>
   </w:num>
   <w:num w:numId="7" w16cid:durableId="707418584">
     <w:abstractNumId w:val="0"/>
   </w:num>
   <w:num w:numId="8" w16cid:durableId="1898778269">
+    <w:abstractNumId w:val="9"/>
+  </w:num>
+  <w:num w:numId="9" w16cid:durableId="1883907230">
+    <w:abstractNumId w:val="17"/>
+  </w:num>
+  <w:num w:numId="10" w16cid:durableId="505248592">
+    <w:abstractNumId w:val="15"/>
+  </w:num>
+  <w:num w:numId="11" w16cid:durableId="365298338">
     <w:abstractNumId w:val="8"/>
   </w:num>
-  <w:num w:numId="9" w16cid:durableId="1883907230">
-    <w:abstractNumId w:val="16"/>
+  <w:num w:numId="12" w16cid:durableId="2068915188">
+    <w:abstractNumId w:val="3"/>
   </w:num>
-  <w:num w:numId="10" w16cid:durableId="505248592">
+  <w:num w:numId="13" w16cid:durableId="1250038190">
     <w:abstractNumId w:val="14"/>
   </w:num>
-  <w:num w:numId="11" w16cid:durableId="365298338">
+  <w:num w:numId="14" w16cid:durableId="681972936">
+    <w:abstractNumId w:val="12"/>
+  </w:num>
+  <w:num w:numId="15" w16cid:durableId="271285448">
+    <w:abstractNumId w:val="2"/>
+  </w:num>
+  <w:num w:numId="16" w16cid:durableId="335958602">
     <w:abstractNumId w:val="7"/>
   </w:num>
-  <w:num w:numId="12" w16cid:durableId="2068915188">
-    <w:abstractNumId w:val="2"/>
-  </w:num>
-  <w:num w:numId="13" w16cid:durableId="1250038190">
-    <w:abstractNumId w:val="13"/>
-  </w:num>
-  <w:num w:numId="14" w16cid:durableId="681972936">
+  <w:num w:numId="17" w16cid:durableId="1304653646">
     <w:abstractNumId w:val="11"/>
   </w:num>
-  <w:num w:numId="15" w16cid:durableId="271285448">
-    <w:abstractNumId w:val="1"/>
-  </w:num>
-  <w:num w:numId="16" w16cid:durableId="335958602">
-    <w:abstractNumId w:val="6"/>
-  </w:num>
-  <w:num w:numId="17" w16cid:durableId="1304653646">
+  <w:num w:numId="18" w16cid:durableId="358818155">
     <w:abstractNumId w:val="10"/>
   </w:num>
-  <w:num w:numId="18" w16cid:durableId="358818155">
-    <w:abstractNumId w:val="9"/>
+  <w:num w:numId="19" w16cid:durableId="597563379">
+    <w:abstractNumId w:val="1"/>
   </w:num>
 </w:numbering>
 </file>
 
 <file path=word/styles.xml><?xml version="1.0" encoding="utf-8"?>
-<w:styles xmlns:mc="http://schemas.openxmlformats.org/markup-compatibility/2006" xmlns:r="http://schemas.openxmlformats.org/officeDocument/2006/relationships" xmlns:w="http://schemas.openxmlformats.org/wordprocessingml/2006/main" xmlns:w14="http://schemas.microsoft.com/office/word/2010/wordml" xmlns:w15="http://schemas.microsoft.com/office/word/2012/wordml" xmlns:w16cex="http://schemas.microsoft.com/office/word/2018/wordml/cex" xmlns:w16cid="http://schemas.microsoft.com/office/word/2016/wordml/cid" xmlns:w16="http://schemas.microsoft.com/office/word/2018/wordml" xmlns:w16du="http://schemas.microsoft.com/office/word/2023/wordml/word16du" xmlns:w16sdtdh="http://schemas.microsoft.com/office/word/2020/wordml/sdtdatahash" xmlns:w16sdtfl="http://schemas.microsoft.com/office/word/2024/wordml/sdtformatlock" xmlns:w16se="http://schemas.microsoft.com/office/word/2015/wordml/symex" mc:Ignorable="w14 w15 w16se w16cid w16 w16cex w16sdtdh w16sdtfl w16du">
+<w:styles xmlns:mc="http://schemas.openxmlformats.org/markup-compatibility/2006" xmlns:r="http://schemas.openxmlformats.org/officeDocument/2006/relationships" xmlns:w="http://schemas.openxmlformats.org/wordprocessingml/2006/main" xmlns:w14="http://schemas.microsoft.com/office/word/2010/wordml" xmlns:w15="http://schemas.microsoft.com/office/word/2012/wordml" xmlns:w16cex="http://schemas.microsoft.com/office/word/2018/wordml/cex" xmlns:w16cid="http://schemas.microsoft.com/office/word/2016/wordml/cid" xmlns:w16="http://schemas.microsoft.com/office/word/2018/wordml" xmlns:w16sdtdh="http://schemas.microsoft.com/office/word/2020/wordml/sdtdatahash" xmlns:w16se="http://schemas.microsoft.com/office/word/2015/wordml/symex" mc:Ignorable="w14 w15 w16se w16cid w16 w16cex w16sdtdh">
   <w:docDefaults>
     <w:rPrDefault>
       <w:rPr>
@@ -3753,7 +4911,7 @@
         <w:kern w:val="2"/>
         <w:sz w:val="24"/>
         <w:szCs w:val="24"/>
-        <w:lang w:val="ru-US" w:eastAsia="en-US" w:bidi="ar-SA"/>
+        <w:lang w:val="en-US" w:eastAsia="en-US" w:bidi="ar-SA"/>
         <w14:ligatures w14:val="standardContextual"/>
       </w:rPr>
     </w:rPrDefault>
@@ -4144,7 +5302,7 @@
   <w:style w:type="paragraph" w:default="1" w:styleId="a">
     <w:name w:val="Normal"/>
     <w:qFormat/>
-    <w:rsid w:val="0016637E"/>
+    <w:rsid w:val="00AD007E"/>
     <w:pPr>
       <w:spacing w:after="0" w:line="360" w:lineRule="auto"/>
       <w:ind w:firstLine="425"/>
@@ -4811,6 +5969,16 @@
       <w:szCs w:val="21"/>
     </w:rPr>
   </w:style>
+  <w:style w:type="character" w:styleId="af3">
+    <w:name w:val="Placeholder Text"/>
+    <w:basedOn w:val="a0"/>
+    <w:uiPriority w:val="99"/>
+    <w:semiHidden/>
+    <w:rsid w:val="0015476C"/>
+    <w:rPr>
+      <w:color w:val="666666"/>
+    </w:rPr>
+  </w:style>
 </w:styles>
 </file>
 

</xml_diff>

<commit_message>
recent lab changes: 2025-05-27 17:03:00
</commit_message>
<xml_diff>
--- a/Курс 2/Основы Data Science/Лабораторные/04. Описание данных. Статистический вывод/Отчёт4.docx
+++ b/Курс 2/Основы Data Science/Лабораторные/04. Описание данных. Статистический вывод/Отчёт4.docx
@@ -1,6 +1,6 @@
 
 <file path=word/document.xml><?xml version="1.0" encoding="utf-8"?>
-<w:document xmlns:wpc="http://schemas.microsoft.com/office/word/2010/wordprocessingCanvas" xmlns:cx="http://schemas.microsoft.com/office/drawing/2014/chartex" xmlns:cx1="http://schemas.microsoft.com/office/drawing/2015/9/8/chartex" xmlns:cx2="http://schemas.microsoft.com/office/drawing/2015/10/21/chartex" xmlns:cx3="http://schemas.microsoft.com/office/drawing/2016/5/9/chartex" xmlns:cx4="http://schemas.microsoft.com/office/drawing/2016/5/10/chartex" xmlns:cx5="http://schemas.microsoft.com/office/drawing/2016/5/11/chartex" xmlns:cx6="http://schemas.microsoft.com/office/drawing/2016/5/12/chartex" xmlns:cx7="http://schemas.microsoft.com/office/drawing/2016/5/13/chartex" xmlns:cx8="http://schemas.microsoft.com/office/drawing/2016/5/14/chartex" xmlns:mc="http://schemas.openxmlformats.org/markup-compatibility/2006" xmlns:aink="http://schemas.microsoft.com/office/drawing/2016/ink" xmlns:am3d="http://schemas.microsoft.com/office/drawing/2017/model3d" xmlns:o="urn:schemas-microsoft-com:office:office" xmlns:oel="http://schemas.microsoft.com/office/2019/extlst" xmlns:r="http://schemas.openxmlformats.org/officeDocument/2006/relationships" xmlns:m="http://schemas.openxmlformats.org/officeDocument/2006/math" xmlns:v="urn:schemas-microsoft-com:vml" xmlns:wp14="http://schemas.microsoft.com/office/word/2010/wordprocessingDrawing" xmlns:wp="http://schemas.openxmlformats.org/drawingml/2006/wordprocessingDrawing" xmlns:w10="urn:schemas-microsoft-com:office:word" xmlns:w="http://schemas.openxmlformats.org/wordprocessingml/2006/main" xmlns:w14="http://schemas.microsoft.com/office/word/2010/wordml" xmlns:w15="http://schemas.microsoft.com/office/word/2012/wordml" xmlns:w16cex="http://schemas.microsoft.com/office/word/2018/wordml/cex" xmlns:w16cid="http://schemas.microsoft.com/office/word/2016/wordml/cid" xmlns:w16="http://schemas.microsoft.com/office/word/2018/wordml" xmlns:w16sdtdh="http://schemas.microsoft.com/office/word/2020/wordml/sdtdatahash" xmlns:w16se="http://schemas.microsoft.com/office/word/2015/wordml/symex" xmlns:wpg="http://schemas.microsoft.com/office/word/2010/wordprocessingGroup" xmlns:wpi="http://schemas.microsoft.com/office/word/2010/wordprocessingInk" xmlns:wne="http://schemas.microsoft.com/office/word/2006/wordml" xmlns:wps="http://schemas.microsoft.com/office/word/2010/wordprocessingShape" mc:Ignorable="w14 w15 w16se w16cid w16 w16cex w16sdtdh wp14">
+<w:document xmlns:wpc="http://schemas.microsoft.com/office/word/2010/wordprocessingCanvas" xmlns:cx="http://schemas.microsoft.com/office/drawing/2014/chartex" xmlns:cx1="http://schemas.microsoft.com/office/drawing/2015/9/8/chartex" xmlns:cx2="http://schemas.microsoft.com/office/drawing/2015/10/21/chartex" xmlns:cx3="http://schemas.microsoft.com/office/drawing/2016/5/9/chartex" xmlns:cx4="http://schemas.microsoft.com/office/drawing/2016/5/10/chartex" xmlns:cx5="http://schemas.microsoft.com/office/drawing/2016/5/11/chartex" xmlns:cx6="http://schemas.microsoft.com/office/drawing/2016/5/12/chartex" xmlns:cx7="http://schemas.microsoft.com/office/drawing/2016/5/13/chartex" xmlns:cx8="http://schemas.microsoft.com/office/drawing/2016/5/14/chartex" xmlns:mc="http://schemas.openxmlformats.org/markup-compatibility/2006" xmlns:aink="http://schemas.microsoft.com/office/drawing/2016/ink" xmlns:am3d="http://schemas.microsoft.com/office/drawing/2017/model3d" xmlns:o="urn:schemas-microsoft-com:office:office" xmlns:oel="http://schemas.microsoft.com/office/2019/extlst" xmlns:r="http://schemas.openxmlformats.org/officeDocument/2006/relationships" xmlns:m="http://schemas.openxmlformats.org/officeDocument/2006/math" xmlns:v="urn:schemas-microsoft-com:vml" xmlns:wp14="http://schemas.microsoft.com/office/word/2010/wordprocessingDrawing" xmlns:wp="http://schemas.openxmlformats.org/drawingml/2006/wordprocessingDrawing" xmlns:w10="urn:schemas-microsoft-com:office:word" xmlns:w="http://schemas.openxmlformats.org/wordprocessingml/2006/main" xmlns:w14="http://schemas.microsoft.com/office/word/2010/wordml" xmlns:w15="http://schemas.microsoft.com/office/word/2012/wordml" xmlns:w16cex="http://schemas.microsoft.com/office/word/2018/wordml/cex" xmlns:w16cid="http://schemas.microsoft.com/office/word/2016/wordml/cid" xmlns:w16="http://schemas.microsoft.com/office/word/2018/wordml" xmlns:w16du="http://schemas.microsoft.com/office/word/2023/wordml/word16du" xmlns:w16sdtdh="http://schemas.microsoft.com/office/word/2020/wordml/sdtdatahash" xmlns:w16sdtfl="http://schemas.microsoft.com/office/word/2024/wordml/sdtformatlock" xmlns:w16se="http://schemas.microsoft.com/office/word/2015/wordml/symex" xmlns:wpg="http://schemas.microsoft.com/office/word/2010/wordprocessingGroup" xmlns:wpi="http://schemas.microsoft.com/office/word/2010/wordprocessingInk" xmlns:wne="http://schemas.microsoft.com/office/word/2006/wordml" xmlns:wps="http://schemas.microsoft.com/office/word/2010/wordprocessingShape" mc:Ignorable="w14 w15 w16se w16cid w16 w16cex w16sdtdh w16sdtfl w16du wp14">
   <w:body>
     <w:p>
       <w:pPr>
@@ -431,7 +431,23 @@
           <w:szCs w:val="28"/>
           <w:lang w:val="ru-RU"/>
         </w:rPr>
-        <w:t>Описание данных. Статистический вывод</w:t>
+        <w:t xml:space="preserve">Описание данных. </w:t>
+      </w:r>
+      <w:proofErr w:type="spellStart"/>
+      <w:r>
+        <w:rPr>
+          <w:szCs w:val="28"/>
+          <w:lang w:val="ru-RU"/>
+        </w:rPr>
+        <w:t>Статистическии</w:t>
+      </w:r>
+      <w:proofErr w:type="spellEnd"/>
+      <w:r>
+        <w:rPr>
+          <w:szCs w:val="28"/>
+          <w:lang w:val="ru-RU"/>
+        </w:rPr>
+        <w:t>̆ вывод</w:t>
       </w:r>
     </w:p>
     <w:p>
@@ -1108,7 +1124,7 @@
         <w:rPr>
           <w:lang w:val="ru-RU" w:eastAsia="ru-RU"/>
         </w:rPr>
-        <w:t>1 . Проведите испытание на</w:t>
+        <w:t>1. Проведите испытание на</w:t>
       </w:r>
       <w:r>
         <w:rPr>
@@ -1593,14 +1609,7 @@
             <w:rFonts w:ascii="Cambria Math" w:hAnsi="Cambria Math"/>
             <w:lang w:val="ru-RU"/>
           </w:rPr>
-          <m:t>=</m:t>
-        </m:r>
-        <m:r>
-          <w:rPr>
-            <w:rFonts w:ascii="Cambria Math" w:hAnsi="Cambria Math"/>
-            <w:lang w:val="ru-RU"/>
-          </w:rPr>
-          <m:t>ХИ2ТЕСТ()</m:t>
+          <m:t>=ХИ2ТЕСТ()</m:t>
         </m:r>
       </m:oMath>
     </w:p>
@@ -1731,12 +1740,37 @@
           <w:lang w:val="ru-RU"/>
         </w:rPr>
       </w:pPr>
+      <w:proofErr w:type="spellStart"/>
       <w:r>
         <w:rPr>
           <w:color w:val="000000"/>
           <w:szCs w:val="28"/>
         </w:rPr>
-        <w:t>Уровень значимости – 5%.</w:t>
+        <w:t>Уровень</w:t>
+      </w:r>
+      <w:proofErr w:type="spellEnd"/>
+      <w:r>
+        <w:rPr>
+          <w:color w:val="000000"/>
+          <w:szCs w:val="28"/>
+        </w:rPr>
+        <w:t xml:space="preserve"> </w:t>
+      </w:r>
+      <w:proofErr w:type="spellStart"/>
+      <w:r>
+        <w:rPr>
+          <w:color w:val="000000"/>
+          <w:szCs w:val="28"/>
+        </w:rPr>
+        <w:t>значимости</w:t>
+      </w:r>
+      <w:proofErr w:type="spellEnd"/>
+      <w:r>
+        <w:rPr>
+          <w:color w:val="000000"/>
+          <w:szCs w:val="28"/>
+        </w:rPr>
+        <w:t xml:space="preserve"> – 5%.</w:t>
       </w:r>
     </w:p>
     <w:p>
@@ -1839,27 +1873,7 @@
             <w:sz w:val="24"/>
             <w14:ligatures w14:val="none"/>
           </w:rPr>
-          <m:t>&lt; |0</m:t>
-        </m:r>
-        <m:r>
-          <w:rPr>
-            <w:rFonts w:ascii="Cambria Math" w:eastAsia="Times New Roman" w:hAnsi="Cambria Math" w:cs="Calibri"/>
-            <w:color w:val="000000"/>
-            <w:kern w:val="0"/>
-            <w:sz w:val="24"/>
-            <w14:ligatures w14:val="none"/>
-          </w:rPr>
-          <m:t>,</m:t>
-        </m:r>
-        <m:r>
-          <w:rPr>
-            <w:rFonts w:ascii="Cambria Math" w:eastAsia="Times New Roman" w:hAnsi="Cambria Math" w:cs="Calibri"/>
-            <w:color w:val="000000"/>
-            <w:kern w:val="0"/>
-            <w:sz w:val="24"/>
-            <w14:ligatures w14:val="none"/>
-          </w:rPr>
-          <m:t>05|</m:t>
+          <m:t>&lt; |0,05|</m:t>
         </m:r>
       </m:oMath>
       <w:r>
@@ -2057,6 +2071,7 @@
         <w:rPr>
           <w:color w:val="000000"/>
           <w:szCs w:val="28"/>
+          <w:lang w:val="ru-RU"/>
         </w:rPr>
         <w:t>Уровень значимости – 5%.</w:t>
       </w:r>
@@ -2071,6 +2086,7 @@
           <w:color w:val="000000"/>
           <w:kern w:val="0"/>
           <w:sz w:val="24"/>
+          <w:lang w:val="ru-RU"/>
           <w14:ligatures w14:val="none"/>
         </w:rPr>
       </w:pPr>
@@ -2090,6 +2106,7 @@
           <w:color w:val="000000"/>
           <w:kern w:val="0"/>
           <w:sz w:val="24"/>
+          <w:lang w:val="ru-RU"/>
           <w14:ligatures w14:val="none"/>
         </w:rPr>
         <w:t>0,013318875</w:t>
@@ -2104,6 +2121,7 @@
           <w:color w:val="000000"/>
           <w:kern w:val="0"/>
           <w:sz w:val="24"/>
+          <w:lang w:val="ru-RU"/>
           <w14:ligatures w14:val="none"/>
         </w:rPr>
       </w:pPr>
@@ -2114,6 +2132,7 @@
             <w:color w:val="000000"/>
             <w:kern w:val="0"/>
             <w:sz w:val="24"/>
+            <w:lang w:val="ru-RU"/>
             <w14:ligatures w14:val="none"/>
           </w:rPr>
           <m:t>|</m:t>
@@ -2127,7 +2146,7 @@
             <w:lang w:val="ru-RU"/>
             <w14:ligatures w14:val="none"/>
           </w:rPr>
-          <m:t>0,0</m:t>
+          <m:t>0,01</m:t>
         </m:r>
         <m:r>
           <w:rPr>
@@ -2138,336 +2157,7 @@
             <w:lang w:val="ru-RU"/>
             <w14:ligatures w14:val="none"/>
           </w:rPr>
-          <m:t>1</m:t>
-        </m:r>
-        <m:r>
-          <w:rPr>
-            <w:rFonts w:ascii="Cambria Math" w:eastAsia="Times New Roman" w:hAnsi="Cambria Math" w:cs="Calibri"/>
-            <w:color w:val="000000"/>
-            <w:kern w:val="0"/>
-            <w:sz w:val="24"/>
-            <w14:ligatures w14:val="none"/>
-          </w:rPr>
-          <m:t>3</m:t>
-        </m:r>
-        <m:r>
-          <w:rPr>
-            <w:rFonts w:ascii="Cambria Math" w:eastAsia="Times New Roman" w:hAnsi="Cambria Math" w:cs="Calibri"/>
-            <w:color w:val="000000"/>
-            <w:kern w:val="0"/>
-            <w:sz w:val="24"/>
-            <w14:ligatures w14:val="none"/>
-          </w:rPr>
-          <m:t>|</m:t>
-        </m:r>
-        <m:r>
-          <w:rPr>
-            <w:rFonts w:ascii="Cambria Math" w:eastAsia="Times New Roman" w:hAnsi="Cambria Math" w:cs="Calibri"/>
-            <w:color w:val="000000"/>
-            <w:kern w:val="0"/>
-            <w:sz w:val="24"/>
-            <w:lang w:val="ru-RU"/>
-            <w14:ligatures w14:val="none"/>
-          </w:rPr>
-          <m:t xml:space="preserve"> </m:t>
-        </m:r>
-        <m:r>
-          <w:rPr>
-            <w:rFonts w:ascii="Cambria Math" w:eastAsia="Times New Roman" w:hAnsi="Cambria Math" w:cs="Calibri"/>
-            <w:color w:val="000000"/>
-            <w:kern w:val="0"/>
-            <w:sz w:val="24"/>
-            <w14:ligatures w14:val="none"/>
-          </w:rPr>
-          <m:t>&lt; |0</m:t>
-        </m:r>
-        <m:r>
-          <w:rPr>
-            <w:rFonts w:ascii="Cambria Math" w:eastAsia="Times New Roman" w:hAnsi="Cambria Math" w:cs="Calibri"/>
-            <w:color w:val="000000"/>
-            <w:kern w:val="0"/>
-            <w:sz w:val="24"/>
-            <w14:ligatures w14:val="none"/>
-          </w:rPr>
-          <m:t>,</m:t>
-        </m:r>
-        <m:r>
-          <w:rPr>
-            <w:rFonts w:ascii="Cambria Math" w:eastAsia="Times New Roman" w:hAnsi="Cambria Math" w:cs="Calibri"/>
-            <w:color w:val="000000"/>
-            <w:kern w:val="0"/>
-            <w:sz w:val="24"/>
-            <w14:ligatures w14:val="none"/>
-          </w:rPr>
-          <m:t>05|</m:t>
-        </m:r>
-      </m:oMath>
-      <w:r>
-        <w:rPr>
-          <w:rFonts w:ascii="Calibri" w:eastAsia="Times New Roman" w:hAnsi="Calibri" w:cs="Calibri"/>
-          <w:color w:val="000000"/>
-          <w:kern w:val="0"/>
-          <w:sz w:val="24"/>
-          <w14:ligatures w14:val="none"/>
-        </w:rPr>
-        <w:t xml:space="preserve"> </w:t>
-      </w:r>
-      <w:r>
-        <w:rPr>
-          <w:rFonts w:eastAsia="Times New Roman" w:cs="Times New Roman"/>
-          <w:color w:val="000000"/>
-          <w:kern w:val="0"/>
-          <w:szCs w:val="28"/>
-          <w14:ligatures w14:val="none"/>
-        </w:rPr>
-        <w:t xml:space="preserve">- </w:t>
-      </w:r>
-      <w:r>
-        <w:rPr>
-          <w:rFonts w:eastAsia="Times New Roman" w:cs="Times New Roman"/>
-          <w:color w:val="000000"/>
-          <w:kern w:val="0"/>
-          <w:szCs w:val="28"/>
-          <w:lang w:val="ru-RU"/>
-          <w14:ligatures w14:val="none"/>
-        </w:rPr>
-        <w:t>гипотеза</w:t>
-      </w:r>
-      <w:r>
-        <w:rPr>
-          <w:rFonts w:ascii="Calibri" w:eastAsia="Times New Roman" w:hAnsi="Calibri" w:cs="Calibri"/>
-          <w:color w:val="000000"/>
-          <w:kern w:val="0"/>
-          <w:sz w:val="24"/>
-          <w:lang w:val="ru-RU"/>
-          <w14:ligatures w14:val="none"/>
-        </w:rPr>
-        <w:t xml:space="preserve"> </w:t>
-      </w:r>
-      <w:r>
-        <w:rPr>
-          <w:i/>
-          <w:iCs/>
-        </w:rPr>
-        <w:t>H</w:t>
-      </w:r>
-      <w:r>
-        <w:rPr>
-          <w:i/>
-          <w:iCs/>
-          <w:vertAlign w:val="subscript"/>
-          <w:lang w:val="ru-RU"/>
-        </w:rPr>
-        <w:t>0</w:t>
-      </w:r>
-      <w:r>
-        <w:rPr>
-          <w:i/>
-          <w:iCs/>
-          <w:vertAlign w:val="subscript"/>
-          <w:lang w:val="ru-RU"/>
-        </w:rPr>
-        <w:t xml:space="preserve"> </w:t>
-      </w:r>
-      <w:r>
-        <w:rPr>
-          <w:lang w:val="ru-RU"/>
-        </w:rPr>
-        <w:t>отклоняется</w:t>
-      </w:r>
-    </w:p>
-    <w:p>
-      <w:pPr>
-        <w:pStyle w:val="a7"/>
-        <w:numPr>
-          <w:ilvl w:val="0"/>
-          <w:numId w:val="18"/>
-        </w:numPr>
-        <w:rPr>
-          <w:lang w:val="ru-RU"/>
-        </w:rPr>
-      </w:pPr>
-      <w:r>
-        <w:rPr>
-          <w:lang w:val="ru-RU" w:eastAsia="ru-RU"/>
-        </w:rPr>
-        <w:t>Имеется взаимосвязь между полом и увлечённостью играми</w:t>
-      </w:r>
-    </w:p>
-    <w:p>
-      <w:pPr>
-        <w:pStyle w:val="a7"/>
-        <w:ind w:left="720" w:firstLine="0"/>
-        <w:rPr>
-          <w:szCs w:val="28"/>
-          <w:lang w:val="ru-RU"/>
-        </w:rPr>
-      </w:pPr>
-      <w:r>
-        <w:rPr>
-          <w:i/>
-          <w:iCs/>
-        </w:rPr>
-        <w:t>H</w:t>
-      </w:r>
-      <w:r>
-        <w:rPr>
-          <w:i/>
-          <w:iCs/>
-          <w:vertAlign w:val="subscript"/>
-          <w:lang w:val="ru-RU"/>
-        </w:rPr>
-        <w:t>0</w:t>
-      </w:r>
-      <w:r>
-        <w:rPr>
-          <w:lang w:val="ru-RU"/>
-        </w:rPr>
-        <w:t xml:space="preserve"> – </w:t>
-      </w:r>
-      <w:r>
-        <w:rPr>
-          <w:lang w:val="ru-RU"/>
-        </w:rPr>
-        <w:t>Не существует взаимосвязи между полом и увлечённостью играми</w:t>
-      </w:r>
-    </w:p>
-    <w:p>
-      <w:pPr>
-        <w:pStyle w:val="a7"/>
-        <w:ind w:left="720" w:firstLine="0"/>
-        <w:rPr>
-          <w:szCs w:val="28"/>
-          <w:lang w:val="ru-RU"/>
-        </w:rPr>
-      </w:pPr>
-      <w:r>
-        <w:rPr>
-          <w:i/>
-          <w:iCs/>
-        </w:rPr>
-        <w:t>H</w:t>
-      </w:r>
-      <w:r>
-        <w:rPr>
-          <w:i/>
-          <w:iCs/>
-          <w:vertAlign w:val="subscript"/>
-          <w:lang w:val="ru-RU"/>
-        </w:rPr>
-        <w:t>1</w:t>
-      </w:r>
-      <w:r>
-        <w:rPr>
-          <w:lang w:val="ru-RU"/>
-        </w:rPr>
-        <w:t xml:space="preserve"> – </w:t>
-      </w:r>
-      <w:r>
-        <w:rPr>
-          <w:lang w:val="ru-RU"/>
-        </w:rPr>
-        <w:t>Существует взаимосвязь между полом и увлечённостью играми</w:t>
-      </w:r>
-    </w:p>
-    <w:p>
-      <w:pPr>
-        <w:pStyle w:val="a7"/>
-        <w:ind w:left="720" w:firstLine="0"/>
-        <w:rPr>
-          <w:szCs w:val="28"/>
-          <w:lang w:val="ru-RU"/>
-        </w:rPr>
-      </w:pPr>
-      <w:r>
-        <w:rPr>
-          <w:color w:val="000000"/>
-          <w:szCs w:val="28"/>
-          <w:lang w:val="ru-RU"/>
-        </w:rPr>
-        <w:t>Уровень значимости – 5%.</w:t>
-      </w:r>
-    </w:p>
-    <w:p>
-      <w:pPr>
-        <w:spacing w:line="240" w:lineRule="auto"/>
-        <w:ind w:firstLine="0"/>
-        <w:jc w:val="center"/>
-        <w:rPr>
-          <w:rFonts w:ascii="Calibri" w:eastAsia="Times New Roman" w:hAnsi="Calibri" w:cs="Calibri"/>
-          <w:color w:val="000000"/>
-          <w:kern w:val="0"/>
-          <w:sz w:val="24"/>
-          <w14:ligatures w14:val="none"/>
-        </w:rPr>
-      </w:pPr>
-      <m:oMath>
-        <m:r>
-          <w:rPr>
-            <w:rFonts w:ascii="Cambria Math" w:hAnsi="Cambria Math"/>
-            <w:szCs w:val="28"/>
-            <w:lang w:val="ru-RU"/>
-          </w:rPr>
-          <m:t xml:space="preserve">=ХИ2ТЕСТ() = </m:t>
-        </m:r>
-      </m:oMath>
-      <w:r>
-        <w:rPr>
-          <w:rFonts w:ascii="Calibri" w:eastAsia="Times New Roman" w:hAnsi="Calibri" w:cs="Calibri"/>
-          <w:color w:val="000000"/>
-          <w:kern w:val="0"/>
-          <w:sz w:val="24"/>
-          <w14:ligatures w14:val="none"/>
-        </w:rPr>
-        <w:t>2,6372E-23</w:t>
-      </w:r>
-    </w:p>
-    <w:p>
-      <w:pPr>
-        <w:spacing w:line="240" w:lineRule="auto"/>
-        <w:ind w:firstLine="708"/>
-        <w:rPr>
-          <w:rFonts w:ascii="Calibri" w:eastAsia="Times New Roman" w:hAnsi="Calibri" w:cs="Calibri"/>
-          <w:color w:val="000000"/>
-          <w:kern w:val="0"/>
-          <w:sz w:val="24"/>
-          <w14:ligatures w14:val="none"/>
-        </w:rPr>
-      </w:pPr>
-      <m:oMath>
-        <m:r>
-          <w:rPr>
-            <w:rFonts w:ascii="Cambria Math" w:eastAsia="Times New Roman" w:hAnsi="Cambria Math" w:cs="Calibri"/>
-            <w:color w:val="000000"/>
-            <w:kern w:val="0"/>
-            <w:sz w:val="24"/>
-            <w:lang w:val="ru-RU"/>
-            <w14:ligatures w14:val="none"/>
-          </w:rPr>
-          <m:t>|</m:t>
-        </m:r>
-      </m:oMath>
-      <w:r>
-        <w:rPr>
-          <w:rFonts w:ascii="Calibri" w:eastAsia="Times New Roman" w:hAnsi="Calibri" w:cs="Calibri"/>
-          <w:color w:val="000000"/>
-          <w:kern w:val="0"/>
-          <w:sz w:val="24"/>
-          <w14:ligatures w14:val="none"/>
-        </w:rPr>
-        <w:t>2,6E-23</w:t>
-      </w:r>
-      <m:oMath>
-        <m:r>
-          <w:rPr>
-            <w:rFonts w:ascii="Cambria Math" w:eastAsia="Times New Roman" w:hAnsi="Cambria Math" w:cs="Calibri"/>
-            <w:color w:val="000000"/>
-            <w:kern w:val="0"/>
-            <w:sz w:val="24"/>
-            <w:lang w:val="ru-RU"/>
-            <w14:ligatures w14:val="none"/>
-          </w:rPr>
-          <m:t>|</m:t>
+          <m:t>3|</m:t>
         </m:r>
         <m:r>
           <w:rPr>
@@ -2568,7 +2258,329 @@
         <w:t>отклоняется</w:t>
       </w:r>
     </w:p>
-    <w:p/>
+    <w:p>
+      <w:pPr>
+        <w:pStyle w:val="a7"/>
+        <w:numPr>
+          <w:ilvl w:val="0"/>
+          <w:numId w:val="18"/>
+        </w:numPr>
+        <w:rPr>
+          <w:lang w:val="ru-RU"/>
+        </w:rPr>
+      </w:pPr>
+      <w:r>
+        <w:rPr>
+          <w:lang w:val="ru-RU" w:eastAsia="ru-RU"/>
+        </w:rPr>
+        <w:t>Имеется взаимосвязь между полом и увлечённостью играми</w:t>
+      </w:r>
+    </w:p>
+    <w:p>
+      <w:pPr>
+        <w:pStyle w:val="a7"/>
+        <w:ind w:left="720" w:firstLine="0"/>
+        <w:rPr>
+          <w:szCs w:val="28"/>
+          <w:lang w:val="ru-RU"/>
+        </w:rPr>
+      </w:pPr>
+      <w:r>
+        <w:rPr>
+          <w:i/>
+          <w:iCs/>
+        </w:rPr>
+        <w:t>H</w:t>
+      </w:r>
+      <w:r>
+        <w:rPr>
+          <w:i/>
+          <w:iCs/>
+          <w:vertAlign w:val="subscript"/>
+          <w:lang w:val="ru-RU"/>
+        </w:rPr>
+        <w:t>0</w:t>
+      </w:r>
+      <w:r>
+        <w:rPr>
+          <w:lang w:val="ru-RU"/>
+        </w:rPr>
+        <w:t xml:space="preserve"> – </w:t>
+      </w:r>
+      <w:r>
+        <w:rPr>
+          <w:lang w:val="ru-RU"/>
+        </w:rPr>
+        <w:t>Не существует взаимосвязи между полом и увлечённостью играми</w:t>
+      </w:r>
+    </w:p>
+    <w:p>
+      <w:pPr>
+        <w:pStyle w:val="a7"/>
+        <w:ind w:left="720" w:firstLine="0"/>
+        <w:rPr>
+          <w:szCs w:val="28"/>
+          <w:lang w:val="ru-RU"/>
+        </w:rPr>
+      </w:pPr>
+      <w:r>
+        <w:rPr>
+          <w:i/>
+          <w:iCs/>
+        </w:rPr>
+        <w:t>H</w:t>
+      </w:r>
+      <w:r>
+        <w:rPr>
+          <w:i/>
+          <w:iCs/>
+          <w:vertAlign w:val="subscript"/>
+          <w:lang w:val="ru-RU"/>
+        </w:rPr>
+        <w:t>1</w:t>
+      </w:r>
+      <w:r>
+        <w:rPr>
+          <w:lang w:val="ru-RU"/>
+        </w:rPr>
+        <w:t xml:space="preserve"> – </w:t>
+      </w:r>
+      <w:r>
+        <w:rPr>
+          <w:lang w:val="ru-RU"/>
+        </w:rPr>
+        <w:t>Существует взаимосвязь между полом и увлечённостью играми</w:t>
+      </w:r>
+    </w:p>
+    <w:p>
+      <w:pPr>
+        <w:pStyle w:val="a7"/>
+        <w:ind w:left="720" w:firstLine="0"/>
+        <w:rPr>
+          <w:szCs w:val="28"/>
+          <w:lang w:val="ru-RU"/>
+        </w:rPr>
+      </w:pPr>
+      <w:r>
+        <w:rPr>
+          <w:color w:val="000000"/>
+          <w:szCs w:val="28"/>
+          <w:lang w:val="ru-RU"/>
+        </w:rPr>
+        <w:t>Уровень значимости – 5%.</w:t>
+      </w:r>
+    </w:p>
+    <w:p>
+      <w:pPr>
+        <w:spacing w:line="240" w:lineRule="auto"/>
+        <w:ind w:firstLine="0"/>
+        <w:jc w:val="center"/>
+        <w:rPr>
+          <w:rFonts w:ascii="Calibri" w:eastAsia="Times New Roman" w:hAnsi="Calibri" w:cs="Calibri"/>
+          <w:color w:val="000000"/>
+          <w:kern w:val="0"/>
+          <w:sz w:val="24"/>
+          <w:lang w:val="ru-RU"/>
+          <w14:ligatures w14:val="none"/>
+        </w:rPr>
+      </w:pPr>
+      <m:oMath>
+        <m:r>
+          <w:rPr>
+            <w:rFonts w:ascii="Cambria Math" w:hAnsi="Cambria Math"/>
+            <w:szCs w:val="28"/>
+            <w:lang w:val="ru-RU"/>
+          </w:rPr>
+          <m:t xml:space="preserve">=ХИ2ТЕСТ() = </m:t>
+        </m:r>
+      </m:oMath>
+      <w:r>
+        <w:rPr>
+          <w:rFonts w:ascii="Calibri" w:eastAsia="Times New Roman" w:hAnsi="Calibri" w:cs="Calibri"/>
+          <w:color w:val="000000"/>
+          <w:kern w:val="0"/>
+          <w:sz w:val="24"/>
+          <w:lang w:val="ru-RU"/>
+          <w14:ligatures w14:val="none"/>
+        </w:rPr>
+        <w:t>2,6372</w:t>
+      </w:r>
+      <w:r>
+        <w:rPr>
+          <w:rFonts w:ascii="Calibri" w:eastAsia="Times New Roman" w:hAnsi="Calibri" w:cs="Calibri"/>
+          <w:color w:val="000000"/>
+          <w:kern w:val="0"/>
+          <w:sz w:val="24"/>
+          <w14:ligatures w14:val="none"/>
+        </w:rPr>
+        <w:t>E</w:t>
+      </w:r>
+      <w:r>
+        <w:rPr>
+          <w:rFonts w:ascii="Calibri" w:eastAsia="Times New Roman" w:hAnsi="Calibri" w:cs="Calibri"/>
+          <w:color w:val="000000"/>
+          <w:kern w:val="0"/>
+          <w:sz w:val="24"/>
+          <w:lang w:val="ru-RU"/>
+          <w14:ligatures w14:val="none"/>
+        </w:rPr>
+        <w:t>-23</w:t>
+      </w:r>
+    </w:p>
+    <w:p>
+      <w:pPr>
+        <w:spacing w:line="240" w:lineRule="auto"/>
+        <w:ind w:firstLine="708"/>
+        <w:rPr>
+          <w:rFonts w:ascii="Calibri" w:eastAsia="Times New Roman" w:hAnsi="Calibri" w:cs="Calibri"/>
+          <w:color w:val="000000"/>
+          <w:kern w:val="0"/>
+          <w:sz w:val="24"/>
+          <w:lang w:val="ru-RU"/>
+          <w14:ligatures w14:val="none"/>
+        </w:rPr>
+      </w:pPr>
+      <m:oMath>
+        <m:r>
+          <w:rPr>
+            <w:rFonts w:ascii="Cambria Math" w:eastAsia="Times New Roman" w:hAnsi="Cambria Math" w:cs="Calibri"/>
+            <w:color w:val="000000"/>
+            <w:kern w:val="0"/>
+            <w:sz w:val="24"/>
+            <w:lang w:val="ru-RU"/>
+            <w14:ligatures w14:val="none"/>
+          </w:rPr>
+          <m:t>|</m:t>
+        </m:r>
+      </m:oMath>
+      <w:r>
+        <w:rPr>
+          <w:rFonts w:ascii="Calibri" w:eastAsia="Times New Roman" w:hAnsi="Calibri" w:cs="Calibri"/>
+          <w:color w:val="000000"/>
+          <w:kern w:val="0"/>
+          <w:sz w:val="24"/>
+          <w:lang w:val="ru-RU"/>
+          <w14:ligatures w14:val="none"/>
+        </w:rPr>
+        <w:t>2,6</w:t>
+      </w:r>
+      <w:r>
+        <w:rPr>
+          <w:rFonts w:ascii="Calibri" w:eastAsia="Times New Roman" w:hAnsi="Calibri" w:cs="Calibri"/>
+          <w:color w:val="000000"/>
+          <w:kern w:val="0"/>
+          <w:sz w:val="24"/>
+          <w14:ligatures w14:val="none"/>
+        </w:rPr>
+        <w:t>E</w:t>
+      </w:r>
+      <w:r>
+        <w:rPr>
+          <w:rFonts w:ascii="Calibri" w:eastAsia="Times New Roman" w:hAnsi="Calibri" w:cs="Calibri"/>
+          <w:color w:val="000000"/>
+          <w:kern w:val="0"/>
+          <w:sz w:val="24"/>
+          <w:lang w:val="ru-RU"/>
+          <w14:ligatures w14:val="none"/>
+        </w:rPr>
+        <w:t>-23</w:t>
+      </w:r>
+      <m:oMath>
+        <m:r>
+          <w:rPr>
+            <w:rFonts w:ascii="Cambria Math" w:eastAsia="Times New Roman" w:hAnsi="Cambria Math" w:cs="Calibri"/>
+            <w:color w:val="000000"/>
+            <w:kern w:val="0"/>
+            <w:sz w:val="24"/>
+            <w:lang w:val="ru-RU"/>
+            <w14:ligatures w14:val="none"/>
+          </w:rPr>
+          <m:t>| &lt; |0,05|</m:t>
+        </m:r>
+      </m:oMath>
+      <w:r>
+        <w:rPr>
+          <w:rFonts w:ascii="Calibri" w:eastAsia="Times New Roman" w:hAnsi="Calibri" w:cs="Calibri"/>
+          <w:color w:val="000000"/>
+          <w:kern w:val="0"/>
+          <w:sz w:val="24"/>
+          <w:lang w:val="ru-RU"/>
+          <w14:ligatures w14:val="none"/>
+        </w:rPr>
+        <w:t xml:space="preserve"> </w:t>
+      </w:r>
+      <w:r>
+        <w:rPr>
+          <w:rFonts w:eastAsia="Times New Roman" w:cs="Times New Roman"/>
+          <w:color w:val="000000"/>
+          <w:kern w:val="0"/>
+          <w:szCs w:val="28"/>
+          <w:lang w:val="ru-RU"/>
+          <w14:ligatures w14:val="none"/>
+        </w:rPr>
+        <w:t xml:space="preserve">- </w:t>
+      </w:r>
+      <w:r>
+        <w:rPr>
+          <w:rFonts w:eastAsia="Times New Roman" w:cs="Times New Roman"/>
+          <w:color w:val="000000"/>
+          <w:kern w:val="0"/>
+          <w:szCs w:val="28"/>
+          <w:lang w:val="ru-RU"/>
+          <w14:ligatures w14:val="none"/>
+        </w:rPr>
+        <w:t>гипотеза</w:t>
+      </w:r>
+      <w:r>
+        <w:rPr>
+          <w:rFonts w:ascii="Calibri" w:eastAsia="Times New Roman" w:hAnsi="Calibri" w:cs="Calibri"/>
+          <w:color w:val="000000"/>
+          <w:kern w:val="0"/>
+          <w:sz w:val="24"/>
+          <w:lang w:val="ru-RU"/>
+          <w14:ligatures w14:val="none"/>
+        </w:rPr>
+        <w:t xml:space="preserve"> </w:t>
+      </w:r>
+      <w:r>
+        <w:rPr>
+          <w:i/>
+          <w:iCs/>
+        </w:rPr>
+        <w:t>H</w:t>
+      </w:r>
+      <w:r>
+        <w:rPr>
+          <w:i/>
+          <w:iCs/>
+          <w:vertAlign w:val="subscript"/>
+          <w:lang w:val="ru-RU"/>
+        </w:rPr>
+        <w:t>0</w:t>
+      </w:r>
+      <w:r>
+        <w:rPr>
+          <w:i/>
+          <w:iCs/>
+          <w:vertAlign w:val="subscript"/>
+          <w:lang w:val="ru-RU"/>
+        </w:rPr>
+        <w:t xml:space="preserve"> </w:t>
+      </w:r>
+      <w:r>
+        <w:rPr>
+          <w:lang w:val="ru-RU"/>
+        </w:rPr>
+        <w:t>отклоняется</w:t>
+      </w:r>
+    </w:p>
+    <w:p>
+      <w:pPr>
+        <w:rPr>
+          <w:lang w:val="ru-RU"/>
+        </w:rPr>
+      </w:pPr>
+    </w:p>
     <w:p>
       <w:pPr>
         <w:rPr>
@@ -2597,13 +2609,7 @@
         <w:rPr>
           <w:lang w:val="ru-RU"/>
         </w:rPr>
-        <w:t xml:space="preserve">Существует взаимосвязь между </w:t>
-      </w:r>
-      <w:r>
-        <w:rPr>
-          <w:lang w:val="ru-RU"/>
-        </w:rPr>
-        <w:t>кодом школы и частотой игры</w:t>
+        <w:t>Существует взаимосвязь между кодом школы и частотой игры</w:t>
       </w:r>
     </w:p>
     <w:p>
@@ -2658,7 +2664,7 @@
 </file>
 
 <file path=word/endnotes.xml><?xml version="1.0" encoding="utf-8"?>
-<w:endnotes xmlns:wpc="http://schemas.microsoft.com/office/word/2010/wordprocessingCanvas" xmlns:cx="http://schemas.microsoft.com/office/drawing/2014/chartex" xmlns:cx1="http://schemas.microsoft.com/office/drawing/2015/9/8/chartex" xmlns:cx2="http://schemas.microsoft.com/office/drawing/2015/10/21/chartex" xmlns:cx3="http://schemas.microsoft.com/office/drawing/2016/5/9/chartex" xmlns:cx4="http://schemas.microsoft.com/office/drawing/2016/5/10/chartex" xmlns:cx5="http://schemas.microsoft.com/office/drawing/2016/5/11/chartex" xmlns:cx6="http://schemas.microsoft.com/office/drawing/2016/5/12/chartex" xmlns:cx7="http://schemas.microsoft.com/office/drawing/2016/5/13/chartex" xmlns:cx8="http://schemas.microsoft.com/office/drawing/2016/5/14/chartex" xmlns:mc="http://schemas.openxmlformats.org/markup-compatibility/2006" xmlns:aink="http://schemas.microsoft.com/office/drawing/2016/ink" xmlns:am3d="http://schemas.microsoft.com/office/drawing/2017/model3d" xmlns:o="urn:schemas-microsoft-com:office:office" xmlns:oel="http://schemas.microsoft.com/office/2019/extlst" xmlns:r="http://schemas.openxmlformats.org/officeDocument/2006/relationships" xmlns:m="http://schemas.openxmlformats.org/officeDocument/2006/math" xmlns:v="urn:schemas-microsoft-com:vml" xmlns:wp14="http://schemas.microsoft.com/office/word/2010/wordprocessingDrawing" xmlns:wp="http://schemas.openxmlformats.org/drawingml/2006/wordprocessingDrawing" xmlns:w10="urn:schemas-microsoft-com:office:word" xmlns:w="http://schemas.openxmlformats.org/wordprocessingml/2006/main" xmlns:w14="http://schemas.microsoft.com/office/word/2010/wordml" xmlns:w15="http://schemas.microsoft.com/office/word/2012/wordml" xmlns:w16cex="http://schemas.microsoft.com/office/word/2018/wordml/cex" xmlns:w16cid="http://schemas.microsoft.com/office/word/2016/wordml/cid" xmlns:w16="http://schemas.microsoft.com/office/word/2018/wordml" xmlns:w16sdtdh="http://schemas.microsoft.com/office/word/2020/wordml/sdtdatahash" xmlns:w16se="http://schemas.microsoft.com/office/word/2015/wordml/symex" xmlns:wpg="http://schemas.microsoft.com/office/word/2010/wordprocessingGroup" xmlns:wpi="http://schemas.microsoft.com/office/word/2010/wordprocessingInk" xmlns:wne="http://schemas.microsoft.com/office/word/2006/wordml" xmlns:wps="http://schemas.microsoft.com/office/word/2010/wordprocessingShape" mc:Ignorable="w14 w15 w16se w16cid w16 w16cex w16sdtdh wp14">
+<w:endnotes xmlns:wpc="http://schemas.microsoft.com/office/word/2010/wordprocessingCanvas" xmlns:cx="http://schemas.microsoft.com/office/drawing/2014/chartex" xmlns:cx1="http://schemas.microsoft.com/office/drawing/2015/9/8/chartex" xmlns:cx2="http://schemas.microsoft.com/office/drawing/2015/10/21/chartex" xmlns:cx3="http://schemas.microsoft.com/office/drawing/2016/5/9/chartex" xmlns:cx4="http://schemas.microsoft.com/office/drawing/2016/5/10/chartex" xmlns:cx5="http://schemas.microsoft.com/office/drawing/2016/5/11/chartex" xmlns:cx6="http://schemas.microsoft.com/office/drawing/2016/5/12/chartex" xmlns:cx7="http://schemas.microsoft.com/office/drawing/2016/5/13/chartex" xmlns:cx8="http://schemas.microsoft.com/office/drawing/2016/5/14/chartex" xmlns:mc="http://schemas.openxmlformats.org/markup-compatibility/2006" xmlns:aink="http://schemas.microsoft.com/office/drawing/2016/ink" xmlns:am3d="http://schemas.microsoft.com/office/drawing/2017/model3d" xmlns:o="urn:schemas-microsoft-com:office:office" xmlns:oel="http://schemas.microsoft.com/office/2019/extlst" xmlns:r="http://schemas.openxmlformats.org/officeDocument/2006/relationships" xmlns:m="http://schemas.openxmlformats.org/officeDocument/2006/math" xmlns:v="urn:schemas-microsoft-com:vml" xmlns:wp14="http://schemas.microsoft.com/office/word/2010/wordprocessingDrawing" xmlns:wp="http://schemas.openxmlformats.org/drawingml/2006/wordprocessingDrawing" xmlns:w10="urn:schemas-microsoft-com:office:word" xmlns:w="http://schemas.openxmlformats.org/wordprocessingml/2006/main" xmlns:w14="http://schemas.microsoft.com/office/word/2010/wordml" xmlns:w15="http://schemas.microsoft.com/office/word/2012/wordml" xmlns:w16cex="http://schemas.microsoft.com/office/word/2018/wordml/cex" xmlns:w16cid="http://schemas.microsoft.com/office/word/2016/wordml/cid" xmlns:w16="http://schemas.microsoft.com/office/word/2018/wordml" xmlns:w16du="http://schemas.microsoft.com/office/word/2023/wordml/word16du" xmlns:w16sdtdh="http://schemas.microsoft.com/office/word/2020/wordml/sdtdatahash" xmlns:w16sdtfl="http://schemas.microsoft.com/office/word/2024/wordml/sdtformatlock" xmlns:w16se="http://schemas.microsoft.com/office/word/2015/wordml/symex" xmlns:wpg="http://schemas.microsoft.com/office/word/2010/wordprocessingGroup" xmlns:wpi="http://schemas.microsoft.com/office/word/2010/wordprocessingInk" xmlns:wne="http://schemas.microsoft.com/office/word/2006/wordml" xmlns:wps="http://schemas.microsoft.com/office/word/2010/wordprocessingShape" mc:Ignorable="w14 w15 w16se w16cid w16 w16cex w16sdtdh w16sdtfl w16du wp14">
   <w:endnote w:type="separator" w:id="-1">
     <w:p>
       <w:pPr>
@@ -2683,7 +2689,7 @@
 </file>
 
 <file path=word/footer1.xml><?xml version="1.0" encoding="utf-8"?>
-<w:ftr xmlns:wpc="http://schemas.microsoft.com/office/word/2010/wordprocessingCanvas" xmlns:cx="http://schemas.microsoft.com/office/drawing/2014/chartex" xmlns:cx1="http://schemas.microsoft.com/office/drawing/2015/9/8/chartex" xmlns:cx2="http://schemas.microsoft.com/office/drawing/2015/10/21/chartex" xmlns:cx3="http://schemas.microsoft.com/office/drawing/2016/5/9/chartex" xmlns:cx4="http://schemas.microsoft.com/office/drawing/2016/5/10/chartex" xmlns:cx5="http://schemas.microsoft.com/office/drawing/2016/5/11/chartex" xmlns:cx6="http://schemas.microsoft.com/office/drawing/2016/5/12/chartex" xmlns:cx7="http://schemas.microsoft.com/office/drawing/2016/5/13/chartex" xmlns:cx8="http://schemas.microsoft.com/office/drawing/2016/5/14/chartex" xmlns:mc="http://schemas.openxmlformats.org/markup-compatibility/2006" xmlns:aink="http://schemas.microsoft.com/office/drawing/2016/ink" xmlns:am3d="http://schemas.microsoft.com/office/drawing/2017/model3d" xmlns:o="urn:schemas-microsoft-com:office:office" xmlns:oel="http://schemas.microsoft.com/office/2019/extlst" xmlns:r="http://schemas.openxmlformats.org/officeDocument/2006/relationships" xmlns:m="http://schemas.openxmlformats.org/officeDocument/2006/math" xmlns:v="urn:schemas-microsoft-com:vml" xmlns:wp14="http://schemas.microsoft.com/office/word/2010/wordprocessingDrawing" xmlns:wp="http://schemas.openxmlformats.org/drawingml/2006/wordprocessingDrawing" xmlns:w10="urn:schemas-microsoft-com:office:word" xmlns:w="http://schemas.openxmlformats.org/wordprocessingml/2006/main" xmlns:w14="http://schemas.microsoft.com/office/word/2010/wordml" xmlns:w15="http://schemas.microsoft.com/office/word/2012/wordml" xmlns:w16cex="http://schemas.microsoft.com/office/word/2018/wordml/cex" xmlns:w16cid="http://schemas.microsoft.com/office/word/2016/wordml/cid" xmlns:w16="http://schemas.microsoft.com/office/word/2018/wordml" xmlns:w16sdtdh="http://schemas.microsoft.com/office/word/2020/wordml/sdtdatahash" xmlns:w16se="http://schemas.microsoft.com/office/word/2015/wordml/symex" xmlns:wpg="http://schemas.microsoft.com/office/word/2010/wordprocessingGroup" xmlns:wpi="http://schemas.microsoft.com/office/word/2010/wordprocessingInk" xmlns:wne="http://schemas.microsoft.com/office/word/2006/wordml" xmlns:wps="http://schemas.microsoft.com/office/word/2010/wordprocessingShape" mc:Ignorable="w14 w15 w16se w16cid w16 w16cex w16sdtdh wp14">
+<w:ftr xmlns:wpc="http://schemas.microsoft.com/office/word/2010/wordprocessingCanvas" xmlns:cx="http://schemas.microsoft.com/office/drawing/2014/chartex" xmlns:cx1="http://schemas.microsoft.com/office/drawing/2015/9/8/chartex" xmlns:cx2="http://schemas.microsoft.com/office/drawing/2015/10/21/chartex" xmlns:cx3="http://schemas.microsoft.com/office/drawing/2016/5/9/chartex" xmlns:cx4="http://schemas.microsoft.com/office/drawing/2016/5/10/chartex" xmlns:cx5="http://schemas.microsoft.com/office/drawing/2016/5/11/chartex" xmlns:cx6="http://schemas.microsoft.com/office/drawing/2016/5/12/chartex" xmlns:cx7="http://schemas.microsoft.com/office/drawing/2016/5/13/chartex" xmlns:cx8="http://schemas.microsoft.com/office/drawing/2016/5/14/chartex" xmlns:mc="http://schemas.openxmlformats.org/markup-compatibility/2006" xmlns:aink="http://schemas.microsoft.com/office/drawing/2016/ink" xmlns:am3d="http://schemas.microsoft.com/office/drawing/2017/model3d" xmlns:o="urn:schemas-microsoft-com:office:office" xmlns:oel="http://schemas.microsoft.com/office/2019/extlst" xmlns:r="http://schemas.openxmlformats.org/officeDocument/2006/relationships" xmlns:m="http://schemas.openxmlformats.org/officeDocument/2006/math" xmlns:v="urn:schemas-microsoft-com:vml" xmlns:wp14="http://schemas.microsoft.com/office/word/2010/wordprocessingDrawing" xmlns:wp="http://schemas.openxmlformats.org/drawingml/2006/wordprocessingDrawing" xmlns:w10="urn:schemas-microsoft-com:office:word" xmlns:w="http://schemas.openxmlformats.org/wordprocessingml/2006/main" xmlns:w14="http://schemas.microsoft.com/office/word/2010/wordml" xmlns:w15="http://schemas.microsoft.com/office/word/2012/wordml" xmlns:w16cex="http://schemas.microsoft.com/office/word/2018/wordml/cex" xmlns:w16cid="http://schemas.microsoft.com/office/word/2016/wordml/cid" xmlns:w16="http://schemas.microsoft.com/office/word/2018/wordml" xmlns:w16du="http://schemas.microsoft.com/office/word/2023/wordml/word16du" xmlns:w16sdtdh="http://schemas.microsoft.com/office/word/2020/wordml/sdtdatahash" xmlns:w16sdtfl="http://schemas.microsoft.com/office/word/2024/wordml/sdtformatlock" xmlns:w16se="http://schemas.microsoft.com/office/word/2015/wordml/symex" xmlns:wpg="http://schemas.microsoft.com/office/word/2010/wordprocessingGroup" xmlns:wpi="http://schemas.microsoft.com/office/word/2010/wordprocessingInk" xmlns:wne="http://schemas.microsoft.com/office/word/2006/wordml" xmlns:wps="http://schemas.microsoft.com/office/word/2010/wordprocessingShape" mc:Ignorable="w14 w15 w16se w16cid w16 w16cex w16sdtdh w16sdtfl w16du wp14">
   <w:p>
     <w:pPr>
       <w:pStyle w:val="ae"/>
@@ -2692,13 +2698,23 @@
         <w:lang w:val="ru-RU"/>
       </w:rPr>
     </w:pPr>
+    <w:proofErr w:type="spellStart"/>
     <w:r>
       <w:rPr>
         <w:rFonts w:eastAsia="Times New Roman" w:cs="Times New Roman"/>
         <w:szCs w:val="28"/>
         <w:lang w:eastAsia="ru-RU"/>
       </w:rPr>
-      <w:t>Череповец, 202</w:t>
+      <w:t>Череповец</w:t>
+    </w:r>
+    <w:proofErr w:type="spellEnd"/>
+    <w:r>
+      <w:rPr>
+        <w:rFonts w:eastAsia="Times New Roman" w:cs="Times New Roman"/>
+        <w:szCs w:val="28"/>
+        <w:lang w:eastAsia="ru-RU"/>
+      </w:rPr>
+      <w:t>, 202</w:t>
     </w:r>
     <w:r>
       <w:rPr>
@@ -2721,7 +2737,7 @@
 </file>
 
 <file path=word/footnotes.xml><?xml version="1.0" encoding="utf-8"?>
-<w:footnotes xmlns:wpc="http://schemas.microsoft.com/office/word/2010/wordprocessingCanvas" xmlns:cx="http://schemas.microsoft.com/office/drawing/2014/chartex" xmlns:cx1="http://schemas.microsoft.com/office/drawing/2015/9/8/chartex" xmlns:cx2="http://schemas.microsoft.com/office/drawing/2015/10/21/chartex" xmlns:cx3="http://schemas.microsoft.com/office/drawing/2016/5/9/chartex" xmlns:cx4="http://schemas.microsoft.com/office/drawing/2016/5/10/chartex" xmlns:cx5="http://schemas.microsoft.com/office/drawing/2016/5/11/chartex" xmlns:cx6="http://schemas.microsoft.com/office/drawing/2016/5/12/chartex" xmlns:cx7="http://schemas.microsoft.com/office/drawing/2016/5/13/chartex" xmlns:cx8="http://schemas.microsoft.com/office/drawing/2016/5/14/chartex" xmlns:mc="http://schemas.openxmlformats.org/markup-compatibility/2006" xmlns:aink="http://schemas.microsoft.com/office/drawing/2016/ink" xmlns:am3d="http://schemas.microsoft.com/office/drawing/2017/model3d" xmlns:o="urn:schemas-microsoft-com:office:office" xmlns:oel="http://schemas.microsoft.com/office/2019/extlst" xmlns:r="http://schemas.openxmlformats.org/officeDocument/2006/relationships" xmlns:m="http://schemas.openxmlformats.org/officeDocument/2006/math" xmlns:v="urn:schemas-microsoft-com:vml" xmlns:wp14="http://schemas.microsoft.com/office/word/2010/wordprocessingDrawing" xmlns:wp="http://schemas.openxmlformats.org/drawingml/2006/wordprocessingDrawing" xmlns:w10="urn:schemas-microsoft-com:office:word" xmlns:w="http://schemas.openxmlformats.org/wordprocessingml/2006/main" xmlns:w14="http://schemas.microsoft.com/office/word/2010/wordml" xmlns:w15="http://schemas.microsoft.com/office/word/2012/wordml" xmlns:w16cex="http://schemas.microsoft.com/office/word/2018/wordml/cex" xmlns:w16cid="http://schemas.microsoft.com/office/word/2016/wordml/cid" xmlns:w16="http://schemas.microsoft.com/office/word/2018/wordml" xmlns:w16sdtdh="http://schemas.microsoft.com/office/word/2020/wordml/sdtdatahash" xmlns:w16se="http://schemas.microsoft.com/office/word/2015/wordml/symex" xmlns:wpg="http://schemas.microsoft.com/office/word/2010/wordprocessingGroup" xmlns:wpi="http://schemas.microsoft.com/office/word/2010/wordprocessingInk" xmlns:wne="http://schemas.microsoft.com/office/word/2006/wordml" xmlns:wps="http://schemas.microsoft.com/office/word/2010/wordprocessingShape" mc:Ignorable="w14 w15 w16se w16cid w16 w16cex w16sdtdh wp14">
+<w:footnotes xmlns:wpc="http://schemas.microsoft.com/office/word/2010/wordprocessingCanvas" xmlns:cx="http://schemas.microsoft.com/office/drawing/2014/chartex" xmlns:cx1="http://schemas.microsoft.com/office/drawing/2015/9/8/chartex" xmlns:cx2="http://schemas.microsoft.com/office/drawing/2015/10/21/chartex" xmlns:cx3="http://schemas.microsoft.com/office/drawing/2016/5/9/chartex" xmlns:cx4="http://schemas.microsoft.com/office/drawing/2016/5/10/chartex" xmlns:cx5="http://schemas.microsoft.com/office/drawing/2016/5/11/chartex" xmlns:cx6="http://schemas.microsoft.com/office/drawing/2016/5/12/chartex" xmlns:cx7="http://schemas.microsoft.com/office/drawing/2016/5/13/chartex" xmlns:cx8="http://schemas.microsoft.com/office/drawing/2016/5/14/chartex" xmlns:mc="http://schemas.openxmlformats.org/markup-compatibility/2006" xmlns:aink="http://schemas.microsoft.com/office/drawing/2016/ink" xmlns:am3d="http://schemas.microsoft.com/office/drawing/2017/model3d" xmlns:o="urn:schemas-microsoft-com:office:office" xmlns:oel="http://schemas.microsoft.com/office/2019/extlst" xmlns:r="http://schemas.openxmlformats.org/officeDocument/2006/relationships" xmlns:m="http://schemas.openxmlformats.org/officeDocument/2006/math" xmlns:v="urn:schemas-microsoft-com:vml" xmlns:wp14="http://schemas.microsoft.com/office/word/2010/wordprocessingDrawing" xmlns:wp="http://schemas.openxmlformats.org/drawingml/2006/wordprocessingDrawing" xmlns:w10="urn:schemas-microsoft-com:office:word" xmlns:w="http://schemas.openxmlformats.org/wordprocessingml/2006/main" xmlns:w14="http://schemas.microsoft.com/office/word/2010/wordml" xmlns:w15="http://schemas.microsoft.com/office/word/2012/wordml" xmlns:w16cex="http://schemas.microsoft.com/office/word/2018/wordml/cex" xmlns:w16cid="http://schemas.microsoft.com/office/word/2016/wordml/cid" xmlns:w16="http://schemas.microsoft.com/office/word/2018/wordml" xmlns:w16du="http://schemas.microsoft.com/office/word/2023/wordml/word16du" xmlns:w16sdtdh="http://schemas.microsoft.com/office/word/2020/wordml/sdtdatahash" xmlns:w16sdtfl="http://schemas.microsoft.com/office/word/2024/wordml/sdtformatlock" xmlns:w16se="http://schemas.microsoft.com/office/word/2015/wordml/symex" xmlns:wpg="http://schemas.microsoft.com/office/word/2010/wordprocessingGroup" xmlns:wpi="http://schemas.microsoft.com/office/word/2010/wordprocessingInk" xmlns:wne="http://schemas.microsoft.com/office/word/2006/wordml" xmlns:wps="http://schemas.microsoft.com/office/word/2010/wordprocessingShape" mc:Ignorable="w14 w15 w16se w16cid w16 w16cex w16sdtdh w16sdtfl w16du wp14">
   <w:footnote w:type="separator" w:id="-1">
     <w:p>
       <w:pPr>
@@ -2746,7 +2762,7 @@
 </file>
 
 <file path=word/header1.xml><?xml version="1.0" encoding="utf-8"?>
-<w:hdr xmlns:wpc="http://schemas.microsoft.com/office/word/2010/wordprocessingCanvas" xmlns:cx="http://schemas.microsoft.com/office/drawing/2014/chartex" xmlns:cx1="http://schemas.microsoft.com/office/drawing/2015/9/8/chartex" xmlns:cx2="http://schemas.microsoft.com/office/drawing/2015/10/21/chartex" xmlns:cx3="http://schemas.microsoft.com/office/drawing/2016/5/9/chartex" xmlns:cx4="http://schemas.microsoft.com/office/drawing/2016/5/10/chartex" xmlns:cx5="http://schemas.microsoft.com/office/drawing/2016/5/11/chartex" xmlns:cx6="http://schemas.microsoft.com/office/drawing/2016/5/12/chartex" xmlns:cx7="http://schemas.microsoft.com/office/drawing/2016/5/13/chartex" xmlns:cx8="http://schemas.microsoft.com/office/drawing/2016/5/14/chartex" xmlns:mc="http://schemas.openxmlformats.org/markup-compatibility/2006" xmlns:aink="http://schemas.microsoft.com/office/drawing/2016/ink" xmlns:am3d="http://schemas.microsoft.com/office/drawing/2017/model3d" xmlns:o="urn:schemas-microsoft-com:office:office" xmlns:oel="http://schemas.microsoft.com/office/2019/extlst" xmlns:r="http://schemas.openxmlformats.org/officeDocument/2006/relationships" xmlns:m="http://schemas.openxmlformats.org/officeDocument/2006/math" xmlns:v="urn:schemas-microsoft-com:vml" xmlns:wp14="http://schemas.microsoft.com/office/word/2010/wordprocessingDrawing" xmlns:wp="http://schemas.openxmlformats.org/drawingml/2006/wordprocessingDrawing" xmlns:w10="urn:schemas-microsoft-com:office:word" xmlns:w="http://schemas.openxmlformats.org/wordprocessingml/2006/main" xmlns:w14="http://schemas.microsoft.com/office/word/2010/wordml" xmlns:w15="http://schemas.microsoft.com/office/word/2012/wordml" xmlns:w16cex="http://schemas.microsoft.com/office/word/2018/wordml/cex" xmlns:w16cid="http://schemas.microsoft.com/office/word/2016/wordml/cid" xmlns:w16="http://schemas.microsoft.com/office/word/2018/wordml" xmlns:w16sdtdh="http://schemas.microsoft.com/office/word/2020/wordml/sdtdatahash" xmlns:w16se="http://schemas.microsoft.com/office/word/2015/wordml/symex" xmlns:wpg="http://schemas.microsoft.com/office/word/2010/wordprocessingGroup" xmlns:wpi="http://schemas.microsoft.com/office/word/2010/wordprocessingInk" xmlns:wne="http://schemas.microsoft.com/office/word/2006/wordml" xmlns:wps="http://schemas.microsoft.com/office/word/2010/wordprocessingShape" mc:Ignorable="w14 w15 w16se w16cid w16 w16cex w16sdtdh wp14">
+<w:hdr xmlns:wpc="http://schemas.microsoft.com/office/word/2010/wordprocessingCanvas" xmlns:cx="http://schemas.microsoft.com/office/drawing/2014/chartex" xmlns:cx1="http://schemas.microsoft.com/office/drawing/2015/9/8/chartex" xmlns:cx2="http://schemas.microsoft.com/office/drawing/2015/10/21/chartex" xmlns:cx3="http://schemas.microsoft.com/office/drawing/2016/5/9/chartex" xmlns:cx4="http://schemas.microsoft.com/office/drawing/2016/5/10/chartex" xmlns:cx5="http://schemas.microsoft.com/office/drawing/2016/5/11/chartex" xmlns:cx6="http://schemas.microsoft.com/office/drawing/2016/5/12/chartex" xmlns:cx7="http://schemas.microsoft.com/office/drawing/2016/5/13/chartex" xmlns:cx8="http://schemas.microsoft.com/office/drawing/2016/5/14/chartex" xmlns:mc="http://schemas.openxmlformats.org/markup-compatibility/2006" xmlns:aink="http://schemas.microsoft.com/office/drawing/2016/ink" xmlns:am3d="http://schemas.microsoft.com/office/drawing/2017/model3d" xmlns:o="urn:schemas-microsoft-com:office:office" xmlns:oel="http://schemas.microsoft.com/office/2019/extlst" xmlns:r="http://schemas.openxmlformats.org/officeDocument/2006/relationships" xmlns:m="http://schemas.openxmlformats.org/officeDocument/2006/math" xmlns:v="urn:schemas-microsoft-com:vml" xmlns:wp14="http://schemas.microsoft.com/office/word/2010/wordprocessingDrawing" xmlns:wp="http://schemas.openxmlformats.org/drawingml/2006/wordprocessingDrawing" xmlns:w10="urn:schemas-microsoft-com:office:word" xmlns:w="http://schemas.openxmlformats.org/wordprocessingml/2006/main" xmlns:w14="http://schemas.microsoft.com/office/word/2010/wordml" xmlns:w15="http://schemas.microsoft.com/office/word/2012/wordml" xmlns:w16cex="http://schemas.microsoft.com/office/word/2018/wordml/cex" xmlns:w16cid="http://schemas.microsoft.com/office/word/2016/wordml/cid" xmlns:w16="http://schemas.microsoft.com/office/word/2018/wordml" xmlns:w16du="http://schemas.microsoft.com/office/word/2023/wordml/word16du" xmlns:w16sdtdh="http://schemas.microsoft.com/office/word/2020/wordml/sdtdatahash" xmlns:w16sdtfl="http://schemas.microsoft.com/office/word/2024/wordml/sdtformatlock" xmlns:w16se="http://schemas.microsoft.com/office/word/2015/wordml/symex" xmlns:wpg="http://schemas.microsoft.com/office/word/2010/wordprocessingGroup" xmlns:wpi="http://schemas.microsoft.com/office/word/2010/wordprocessingInk" xmlns:wne="http://schemas.microsoft.com/office/word/2006/wordml" xmlns:wps="http://schemas.microsoft.com/office/word/2010/wordprocessingShape" mc:Ignorable="w14 w15 w16se w16cid w16 w16cex w16sdtdh w16sdtfl w16du wp14">
   <w:sdt>
     <w:sdtPr>
       <w:rPr>
@@ -2758,11 +2774,6 @@
         <w:docPartUnique/>
       </w:docPartObj>
     </w:sdtPr>
-    <w:sdtEndPr>
-      <w:rPr>
-        <w:rStyle w:val="af1"/>
-      </w:rPr>
-    </w:sdtEndPr>
     <w:sdtContent>
       <w:p>
         <w:pPr>
@@ -2802,7 +2813,7 @@
 </file>
 
 <file path=word/header2.xml><?xml version="1.0" encoding="utf-8"?>
-<w:hdr xmlns:wpc="http://schemas.microsoft.com/office/word/2010/wordprocessingCanvas" xmlns:cx="http://schemas.microsoft.com/office/drawing/2014/chartex" xmlns:cx1="http://schemas.microsoft.com/office/drawing/2015/9/8/chartex" xmlns:cx2="http://schemas.microsoft.com/office/drawing/2015/10/21/chartex" xmlns:cx3="http://schemas.microsoft.com/office/drawing/2016/5/9/chartex" xmlns:cx4="http://schemas.microsoft.com/office/drawing/2016/5/10/chartex" xmlns:cx5="http://schemas.microsoft.com/office/drawing/2016/5/11/chartex" xmlns:cx6="http://schemas.microsoft.com/office/drawing/2016/5/12/chartex" xmlns:cx7="http://schemas.microsoft.com/office/drawing/2016/5/13/chartex" xmlns:cx8="http://schemas.microsoft.com/office/drawing/2016/5/14/chartex" xmlns:mc="http://schemas.openxmlformats.org/markup-compatibility/2006" xmlns:aink="http://schemas.microsoft.com/office/drawing/2016/ink" xmlns:am3d="http://schemas.microsoft.com/office/drawing/2017/model3d" xmlns:o="urn:schemas-microsoft-com:office:office" xmlns:oel="http://schemas.microsoft.com/office/2019/extlst" xmlns:r="http://schemas.openxmlformats.org/officeDocument/2006/relationships" xmlns:m="http://schemas.openxmlformats.org/officeDocument/2006/math" xmlns:v="urn:schemas-microsoft-com:vml" xmlns:wp14="http://schemas.microsoft.com/office/word/2010/wordprocessingDrawing" xmlns:wp="http://schemas.openxmlformats.org/drawingml/2006/wordprocessingDrawing" xmlns:w10="urn:schemas-microsoft-com:office:word" xmlns:w="http://schemas.openxmlformats.org/wordprocessingml/2006/main" xmlns:w14="http://schemas.microsoft.com/office/word/2010/wordml" xmlns:w15="http://schemas.microsoft.com/office/word/2012/wordml" xmlns:w16cex="http://schemas.microsoft.com/office/word/2018/wordml/cex" xmlns:w16cid="http://schemas.microsoft.com/office/word/2016/wordml/cid" xmlns:w16="http://schemas.microsoft.com/office/word/2018/wordml" xmlns:w16sdtdh="http://schemas.microsoft.com/office/word/2020/wordml/sdtdatahash" xmlns:w16se="http://schemas.microsoft.com/office/word/2015/wordml/symex" xmlns:wpg="http://schemas.microsoft.com/office/word/2010/wordprocessingGroup" xmlns:wpi="http://schemas.microsoft.com/office/word/2010/wordprocessingInk" xmlns:wne="http://schemas.microsoft.com/office/word/2006/wordml" xmlns:wps="http://schemas.microsoft.com/office/word/2010/wordprocessingShape" mc:Ignorable="w14 w15 w16se w16cid w16 w16cex w16sdtdh wp14">
+<w:hdr xmlns:wpc="http://schemas.microsoft.com/office/word/2010/wordprocessingCanvas" xmlns:cx="http://schemas.microsoft.com/office/drawing/2014/chartex" xmlns:cx1="http://schemas.microsoft.com/office/drawing/2015/9/8/chartex" xmlns:cx2="http://schemas.microsoft.com/office/drawing/2015/10/21/chartex" xmlns:cx3="http://schemas.microsoft.com/office/drawing/2016/5/9/chartex" xmlns:cx4="http://schemas.microsoft.com/office/drawing/2016/5/10/chartex" xmlns:cx5="http://schemas.microsoft.com/office/drawing/2016/5/11/chartex" xmlns:cx6="http://schemas.microsoft.com/office/drawing/2016/5/12/chartex" xmlns:cx7="http://schemas.microsoft.com/office/drawing/2016/5/13/chartex" xmlns:cx8="http://schemas.microsoft.com/office/drawing/2016/5/14/chartex" xmlns:mc="http://schemas.openxmlformats.org/markup-compatibility/2006" xmlns:aink="http://schemas.microsoft.com/office/drawing/2016/ink" xmlns:am3d="http://schemas.microsoft.com/office/drawing/2017/model3d" xmlns:o="urn:schemas-microsoft-com:office:office" xmlns:oel="http://schemas.microsoft.com/office/2019/extlst" xmlns:r="http://schemas.openxmlformats.org/officeDocument/2006/relationships" xmlns:m="http://schemas.openxmlformats.org/officeDocument/2006/math" xmlns:v="urn:schemas-microsoft-com:vml" xmlns:wp14="http://schemas.microsoft.com/office/word/2010/wordprocessingDrawing" xmlns:wp="http://schemas.openxmlformats.org/drawingml/2006/wordprocessingDrawing" xmlns:w10="urn:schemas-microsoft-com:office:word" xmlns:w="http://schemas.openxmlformats.org/wordprocessingml/2006/main" xmlns:w14="http://schemas.microsoft.com/office/word/2010/wordml" xmlns:w15="http://schemas.microsoft.com/office/word/2012/wordml" xmlns:w16cex="http://schemas.microsoft.com/office/word/2018/wordml/cex" xmlns:w16cid="http://schemas.microsoft.com/office/word/2016/wordml/cid" xmlns:w16="http://schemas.microsoft.com/office/word/2018/wordml" xmlns:w16du="http://schemas.microsoft.com/office/word/2023/wordml/word16du" xmlns:w16sdtdh="http://schemas.microsoft.com/office/word/2020/wordml/sdtdatahash" xmlns:w16sdtfl="http://schemas.microsoft.com/office/word/2024/wordml/sdtformatlock" xmlns:w16se="http://schemas.microsoft.com/office/word/2015/wordml/symex" xmlns:wpg="http://schemas.microsoft.com/office/word/2010/wordprocessingGroup" xmlns:wpi="http://schemas.microsoft.com/office/word/2010/wordprocessingInk" xmlns:wne="http://schemas.microsoft.com/office/word/2006/wordml" xmlns:wps="http://schemas.microsoft.com/office/word/2010/wordprocessingShape" mc:Ignorable="w14 w15 w16se w16cid w16 w16cex w16sdtdh w16sdtfl w16du wp14">
   <w:sdt>
     <w:sdtPr>
       <w:rPr>
@@ -2814,11 +2825,6 @@
         <w:docPartUnique/>
       </w:docPartObj>
     </w:sdtPr>
-    <w:sdtEndPr>
-      <w:rPr>
-        <w:rStyle w:val="af1"/>
-      </w:rPr>
-    </w:sdtEndPr>
     <w:sdtContent>
       <w:p>
         <w:pPr>
@@ -2871,7 +2877,7 @@
 </file>
 
 <file path=word/header3.xml><?xml version="1.0" encoding="utf-8"?>
-<w:hdr xmlns:wpc="http://schemas.microsoft.com/office/word/2010/wordprocessingCanvas" xmlns:cx="http://schemas.microsoft.com/office/drawing/2014/chartex" xmlns:cx1="http://schemas.microsoft.com/office/drawing/2015/9/8/chartex" xmlns:cx2="http://schemas.microsoft.com/office/drawing/2015/10/21/chartex" xmlns:cx3="http://schemas.microsoft.com/office/drawing/2016/5/9/chartex" xmlns:cx4="http://schemas.microsoft.com/office/drawing/2016/5/10/chartex" xmlns:cx5="http://schemas.microsoft.com/office/drawing/2016/5/11/chartex" xmlns:cx6="http://schemas.microsoft.com/office/drawing/2016/5/12/chartex" xmlns:cx7="http://schemas.microsoft.com/office/drawing/2016/5/13/chartex" xmlns:cx8="http://schemas.microsoft.com/office/drawing/2016/5/14/chartex" xmlns:mc="http://schemas.openxmlformats.org/markup-compatibility/2006" xmlns:aink="http://schemas.microsoft.com/office/drawing/2016/ink" xmlns:am3d="http://schemas.microsoft.com/office/drawing/2017/model3d" xmlns:o="urn:schemas-microsoft-com:office:office" xmlns:oel="http://schemas.microsoft.com/office/2019/extlst" xmlns:r="http://schemas.openxmlformats.org/officeDocument/2006/relationships" xmlns:m="http://schemas.openxmlformats.org/officeDocument/2006/math" xmlns:v="urn:schemas-microsoft-com:vml" xmlns:wp14="http://schemas.microsoft.com/office/word/2010/wordprocessingDrawing" xmlns:wp="http://schemas.openxmlformats.org/drawingml/2006/wordprocessingDrawing" xmlns:w10="urn:schemas-microsoft-com:office:word" xmlns:w="http://schemas.openxmlformats.org/wordprocessingml/2006/main" xmlns:w14="http://schemas.microsoft.com/office/word/2010/wordml" xmlns:w15="http://schemas.microsoft.com/office/word/2012/wordml" xmlns:w16cex="http://schemas.microsoft.com/office/word/2018/wordml/cex" xmlns:w16cid="http://schemas.microsoft.com/office/word/2016/wordml/cid" xmlns:w16="http://schemas.microsoft.com/office/word/2018/wordml" xmlns:w16sdtdh="http://schemas.microsoft.com/office/word/2020/wordml/sdtdatahash" xmlns:w16se="http://schemas.microsoft.com/office/word/2015/wordml/symex" xmlns:wpg="http://schemas.microsoft.com/office/word/2010/wordprocessingGroup" xmlns:wpi="http://schemas.microsoft.com/office/word/2010/wordprocessingInk" xmlns:wne="http://schemas.microsoft.com/office/word/2006/wordml" xmlns:wps="http://schemas.microsoft.com/office/word/2010/wordprocessingShape" mc:Ignorable="w14 w15 w16se w16cid w16 w16cex w16sdtdh wp14">
+<w:hdr xmlns:wpc="http://schemas.microsoft.com/office/word/2010/wordprocessingCanvas" xmlns:cx="http://schemas.microsoft.com/office/drawing/2014/chartex" xmlns:cx1="http://schemas.microsoft.com/office/drawing/2015/9/8/chartex" xmlns:cx2="http://schemas.microsoft.com/office/drawing/2015/10/21/chartex" xmlns:cx3="http://schemas.microsoft.com/office/drawing/2016/5/9/chartex" xmlns:cx4="http://schemas.microsoft.com/office/drawing/2016/5/10/chartex" xmlns:cx5="http://schemas.microsoft.com/office/drawing/2016/5/11/chartex" xmlns:cx6="http://schemas.microsoft.com/office/drawing/2016/5/12/chartex" xmlns:cx7="http://schemas.microsoft.com/office/drawing/2016/5/13/chartex" xmlns:cx8="http://schemas.microsoft.com/office/drawing/2016/5/14/chartex" xmlns:mc="http://schemas.openxmlformats.org/markup-compatibility/2006" xmlns:aink="http://schemas.microsoft.com/office/drawing/2016/ink" xmlns:am3d="http://schemas.microsoft.com/office/drawing/2017/model3d" xmlns:o="urn:schemas-microsoft-com:office:office" xmlns:oel="http://schemas.microsoft.com/office/2019/extlst" xmlns:r="http://schemas.openxmlformats.org/officeDocument/2006/relationships" xmlns:m="http://schemas.openxmlformats.org/officeDocument/2006/math" xmlns:v="urn:schemas-microsoft-com:vml" xmlns:wp14="http://schemas.microsoft.com/office/word/2010/wordprocessingDrawing" xmlns:wp="http://schemas.openxmlformats.org/drawingml/2006/wordprocessingDrawing" xmlns:w10="urn:schemas-microsoft-com:office:word" xmlns:w="http://schemas.openxmlformats.org/wordprocessingml/2006/main" xmlns:w14="http://schemas.microsoft.com/office/word/2010/wordml" xmlns:w15="http://schemas.microsoft.com/office/word/2012/wordml" xmlns:w16cex="http://schemas.microsoft.com/office/word/2018/wordml/cex" xmlns:w16cid="http://schemas.microsoft.com/office/word/2016/wordml/cid" xmlns:w16="http://schemas.microsoft.com/office/word/2018/wordml" xmlns:w16du="http://schemas.microsoft.com/office/word/2023/wordml/word16du" xmlns:w16sdtdh="http://schemas.microsoft.com/office/word/2020/wordml/sdtdatahash" xmlns:w16sdtfl="http://schemas.microsoft.com/office/word/2024/wordml/sdtformatlock" xmlns:w16se="http://schemas.microsoft.com/office/word/2015/wordml/symex" xmlns:wpg="http://schemas.microsoft.com/office/word/2010/wordprocessingGroup" xmlns:wpi="http://schemas.microsoft.com/office/word/2010/wordprocessingInk" xmlns:wne="http://schemas.microsoft.com/office/word/2006/wordml" xmlns:wps="http://schemas.microsoft.com/office/word/2010/wordprocessingShape" mc:Ignorable="w14 w15 w16se w16cid w16 w16cex w16sdtdh w16sdtfl w16du wp14">
   <w:p>
     <w:pPr>
       <w:spacing w:line="240" w:lineRule="auto"/>
@@ -3015,7 +3021,7 @@
 </file>
 
 <file path=word/numbering.xml><?xml version="1.0" encoding="utf-8"?>
-<w:numbering xmlns:wpc="http://schemas.microsoft.com/office/word/2010/wordprocessingCanvas" xmlns:cx="http://schemas.microsoft.com/office/drawing/2014/chartex" xmlns:cx1="http://schemas.microsoft.com/office/drawing/2015/9/8/chartex" xmlns:cx2="http://schemas.microsoft.com/office/drawing/2015/10/21/chartex" xmlns:cx3="http://schemas.microsoft.com/office/drawing/2016/5/9/chartex" xmlns:cx4="http://schemas.microsoft.com/office/drawing/2016/5/10/chartex" xmlns:cx5="http://schemas.microsoft.com/office/drawing/2016/5/11/chartex" xmlns:cx6="http://schemas.microsoft.com/office/drawing/2016/5/12/chartex" xmlns:cx7="http://schemas.microsoft.com/office/drawing/2016/5/13/chartex" xmlns:cx8="http://schemas.microsoft.com/office/drawing/2016/5/14/chartex" xmlns:mc="http://schemas.openxmlformats.org/markup-compatibility/2006" xmlns:aink="http://schemas.microsoft.com/office/drawing/2016/ink" xmlns:am3d="http://schemas.microsoft.com/office/drawing/2017/model3d" xmlns:o="urn:schemas-microsoft-com:office:office" xmlns:oel="http://schemas.microsoft.com/office/2019/extlst" xmlns:r="http://schemas.openxmlformats.org/officeDocument/2006/relationships" xmlns:m="http://schemas.openxmlformats.org/officeDocument/2006/math" xmlns:v="urn:schemas-microsoft-com:vml" xmlns:wp14="http://schemas.microsoft.com/office/word/2010/wordprocessingDrawing" xmlns:wp="http://schemas.openxmlformats.org/drawingml/2006/wordprocessingDrawing" xmlns:w10="urn:schemas-microsoft-com:office:word" xmlns:w="http://schemas.openxmlformats.org/wordprocessingml/2006/main" xmlns:w14="http://schemas.microsoft.com/office/word/2010/wordml" xmlns:w15="http://schemas.microsoft.com/office/word/2012/wordml" xmlns:w16cex="http://schemas.microsoft.com/office/word/2018/wordml/cex" xmlns:w16cid="http://schemas.microsoft.com/office/word/2016/wordml/cid" xmlns:w16="http://schemas.microsoft.com/office/word/2018/wordml" xmlns:w16sdtdh="http://schemas.microsoft.com/office/word/2020/wordml/sdtdatahash" xmlns:w16se="http://schemas.microsoft.com/office/word/2015/wordml/symex" xmlns:wpg="http://schemas.microsoft.com/office/word/2010/wordprocessingGroup" xmlns:wpi="http://schemas.microsoft.com/office/word/2010/wordprocessingInk" xmlns:wne="http://schemas.microsoft.com/office/word/2006/wordml" xmlns:wps="http://schemas.microsoft.com/office/word/2010/wordprocessingShape" mc:Ignorable="w14 w15 w16se w16cid w16 w16cex w16sdtdh wp14">
+<w:numbering xmlns:wpc="http://schemas.microsoft.com/office/word/2010/wordprocessingCanvas" xmlns:cx="http://schemas.microsoft.com/office/drawing/2014/chartex" xmlns:cx1="http://schemas.microsoft.com/office/drawing/2015/9/8/chartex" xmlns:cx2="http://schemas.microsoft.com/office/drawing/2015/10/21/chartex" xmlns:cx3="http://schemas.microsoft.com/office/drawing/2016/5/9/chartex" xmlns:cx4="http://schemas.microsoft.com/office/drawing/2016/5/10/chartex" xmlns:cx5="http://schemas.microsoft.com/office/drawing/2016/5/11/chartex" xmlns:cx6="http://schemas.microsoft.com/office/drawing/2016/5/12/chartex" xmlns:cx7="http://schemas.microsoft.com/office/drawing/2016/5/13/chartex" xmlns:cx8="http://schemas.microsoft.com/office/drawing/2016/5/14/chartex" xmlns:mc="http://schemas.openxmlformats.org/markup-compatibility/2006" xmlns:aink="http://schemas.microsoft.com/office/drawing/2016/ink" xmlns:am3d="http://schemas.microsoft.com/office/drawing/2017/model3d" xmlns:o="urn:schemas-microsoft-com:office:office" xmlns:oel="http://schemas.microsoft.com/office/2019/extlst" xmlns:r="http://schemas.openxmlformats.org/officeDocument/2006/relationships" xmlns:m="http://schemas.openxmlformats.org/officeDocument/2006/math" xmlns:v="urn:schemas-microsoft-com:vml" xmlns:wp14="http://schemas.microsoft.com/office/word/2010/wordprocessingDrawing" xmlns:wp="http://schemas.openxmlformats.org/drawingml/2006/wordprocessingDrawing" xmlns:w10="urn:schemas-microsoft-com:office:word" xmlns:w="http://schemas.openxmlformats.org/wordprocessingml/2006/main" xmlns:w14="http://schemas.microsoft.com/office/word/2010/wordml" xmlns:w15="http://schemas.microsoft.com/office/word/2012/wordml" xmlns:w16cex="http://schemas.microsoft.com/office/word/2018/wordml/cex" xmlns:w16cid="http://schemas.microsoft.com/office/word/2016/wordml/cid" xmlns:w16="http://schemas.microsoft.com/office/word/2018/wordml" xmlns:w16du="http://schemas.microsoft.com/office/word/2023/wordml/word16du" xmlns:w16sdtdh="http://schemas.microsoft.com/office/word/2020/wordml/sdtdatahash" xmlns:w16sdtfl="http://schemas.microsoft.com/office/word/2024/wordml/sdtformatlock" xmlns:w16se="http://schemas.microsoft.com/office/word/2015/wordml/symex" xmlns:wpg="http://schemas.microsoft.com/office/word/2010/wordprocessingGroup" xmlns:wpi="http://schemas.microsoft.com/office/word/2010/wordprocessingInk" xmlns:wne="http://schemas.microsoft.com/office/word/2006/wordml" xmlns:wps="http://schemas.microsoft.com/office/word/2010/wordprocessingShape" mc:Ignorable="w14 w15 w16se w16cid w16 w16cex w16sdtdh w16sdtfl w16du wp14">
   <w:abstractNum w:abstractNumId="0" w15:restartNumberingAfterBreak="0">
     <w:nsid w:val="007B1D9F"/>
     <w:multiLevelType w:val="hybridMultilevel"/>
@@ -4903,7 +4909,7 @@
 </file>
 
 <file path=word/styles.xml><?xml version="1.0" encoding="utf-8"?>
-<w:styles xmlns:mc="http://schemas.openxmlformats.org/markup-compatibility/2006" xmlns:r="http://schemas.openxmlformats.org/officeDocument/2006/relationships" xmlns:w="http://schemas.openxmlformats.org/wordprocessingml/2006/main" xmlns:w14="http://schemas.microsoft.com/office/word/2010/wordml" xmlns:w15="http://schemas.microsoft.com/office/word/2012/wordml" xmlns:w16cex="http://schemas.microsoft.com/office/word/2018/wordml/cex" xmlns:w16cid="http://schemas.microsoft.com/office/word/2016/wordml/cid" xmlns:w16="http://schemas.microsoft.com/office/word/2018/wordml" xmlns:w16sdtdh="http://schemas.microsoft.com/office/word/2020/wordml/sdtdatahash" xmlns:w16se="http://schemas.microsoft.com/office/word/2015/wordml/symex" mc:Ignorable="w14 w15 w16se w16cid w16 w16cex w16sdtdh">
+<w:styles xmlns:mc="http://schemas.openxmlformats.org/markup-compatibility/2006" xmlns:r="http://schemas.openxmlformats.org/officeDocument/2006/relationships" xmlns:w="http://schemas.openxmlformats.org/wordprocessingml/2006/main" xmlns:w14="http://schemas.microsoft.com/office/word/2010/wordml" xmlns:w15="http://schemas.microsoft.com/office/word/2012/wordml" xmlns:w16cex="http://schemas.microsoft.com/office/word/2018/wordml/cex" xmlns:w16cid="http://schemas.microsoft.com/office/word/2016/wordml/cid" xmlns:w16="http://schemas.microsoft.com/office/word/2018/wordml" xmlns:w16du="http://schemas.microsoft.com/office/word/2023/wordml/word16du" xmlns:w16sdtdh="http://schemas.microsoft.com/office/word/2020/wordml/sdtdatahash" xmlns:w16sdtfl="http://schemas.microsoft.com/office/word/2024/wordml/sdtformatlock" xmlns:w16se="http://schemas.microsoft.com/office/word/2015/wordml/symex" mc:Ignorable="w14 w15 w16se w16cid w16 w16cex w16sdtdh w16sdtfl w16du">
   <w:docDefaults>
     <w:rPrDefault>
       <w:rPr>

</xml_diff>